<commit_message>
1.I have downloaded the data of the periodic table from the internet(github) 2.I have copied the downloaded data file to project workspace directory 3.Learning readtable,table2struct; I made an example of reading the data of the periodic table and showcases of elements
</commit_message>
<xml_diff>
--- a/development.docx
+++ b/development.docx
@@ -16,7 +16,113 @@
         </w:rPr>
         <w:t>This is my project development document.</w:t>
       </w:r>
+    </w:p>
+    <w:p>
+      <w:pPr>
+        <w:rPr>
+          <w:rFonts w:hint="default"/>
+          <w:lang w:val="en-US"/>
+        </w:rPr>
+      </w:pPr>
+      <w:r>
+        <w:rPr>
+          <w:rFonts w:hint="default"/>
+          <w:lang w:val="en-US"/>
+        </w:rPr>
+        <w:t>Development log;</w:t>
+      </w:r>
+    </w:p>
+    <w:p>
+      <w:pPr>
+        <w:rPr>
+          <w:rFonts w:hint="default"/>
+          <w:lang w:val="en-US"/>
+        </w:rPr>
+      </w:pPr>
+      <w:r>
+        <w:rPr>
+          <w:rFonts w:hint="default"/>
+          <w:lang w:val="en-US"/>
+        </w:rPr>
+        <w:t>2025/4/15</w:t>
+      </w:r>
+    </w:p>
+    <w:p>
+      <w:pPr>
+        <w:numPr>
+          <w:ilvl w:val="0"/>
+          <w:numId w:val="1"/>
+        </w:numPr>
+        <w:rPr>
+          <w:rFonts w:hint="default"/>
+          <w:lang w:val="en-US"/>
+        </w:rPr>
+      </w:pPr>
       <w:bookmarkStart w:id="0" w:name="_GoBack"/>
+      <w:r>
+        <w:rPr>
+          <w:rFonts w:hint="default"/>
+          <w:lang w:val="en-US"/>
+        </w:rPr>
+        <w:t>I have downloaded the data of the periodic table from the internet(github)</w:t>
+      </w:r>
+    </w:p>
+    <w:p>
+      <w:pPr>
+        <w:numPr>
+          <w:ilvl w:val="0"/>
+          <w:numId w:val="1"/>
+        </w:numPr>
+        <w:rPr>
+          <w:rFonts w:hint="default"/>
+          <w:lang w:val="en-US"/>
+        </w:rPr>
+      </w:pPr>
+      <w:r>
+        <w:rPr>
+          <w:rFonts w:hint="default"/>
+          <w:lang w:val="en-US"/>
+        </w:rPr>
+        <w:t>I have copied the downloaded data file to project workspace directory</w:t>
+      </w:r>
+    </w:p>
+    <w:p>
+      <w:pPr>
+        <w:numPr>
+          <w:ilvl w:val="0"/>
+          <w:numId w:val="1"/>
+        </w:numPr>
+        <w:rPr>
+          <w:rFonts w:hint="default"/>
+          <w:lang w:val="en-US"/>
+        </w:rPr>
+      </w:pPr>
+      <w:r>
+        <w:rPr>
+          <w:rFonts w:hint="default"/>
+          <w:lang w:val="en-US"/>
+        </w:rPr>
+        <w:t>Learning readtable,table2struct;</w:t>
+      </w:r>
+    </w:p>
+    <w:p>
+      <w:pPr>
+        <w:numPr>
+          <w:ilvl w:val="0"/>
+          <w:numId w:val="1"/>
+        </w:numPr>
+        <w:rPr>
+          <w:rFonts w:hint="default"/>
+          <w:lang w:val="en-US"/>
+        </w:rPr>
+      </w:pPr>
+      <w:r>
+        <w:rPr>
+          <w:rFonts w:hint="default"/>
+          <w:lang w:val="en-US"/>
+        </w:rPr>
+        <w:t>I made an example of reading the data of the periodic table and showcases of elements</w:t>
+      </w:r>
       <w:bookmarkEnd w:id="0"/>
     </w:p>
     <w:sectPr>
@@ -27,6 +133,30 @@
     </w:sectPr>
   </w:body>
 </w:document>
+</file>
+
+<file path=word/numbering.xml><?xml version="1.0" encoding="utf-8"?>
+<w:numbering xmlns:wpc="http://schemas.microsoft.com/office/word/2010/wordprocessingCanvas" xmlns:mc="http://schemas.openxmlformats.org/markup-compatibility/2006" xmlns:o="urn:schemas-microsoft-com:office:office" xmlns:r="http://schemas.openxmlformats.org/officeDocument/2006/relationships" xmlns:m="http://schemas.openxmlformats.org/officeDocument/2006/math" xmlns:v="urn:schemas-microsoft-com:vml" xmlns:wp14="http://schemas.microsoft.com/office/word/2010/wordprocessingDrawing" xmlns:wp="http://schemas.openxmlformats.org/drawingml/2006/wordprocessingDrawing" xmlns:w10="urn:schemas-microsoft-com:office:word" xmlns:w="http://schemas.openxmlformats.org/wordprocessingml/2006/main" xmlns:w14="http://schemas.microsoft.com/office/word/2010/wordml" xmlns:wpg="http://schemas.microsoft.com/office/word/2010/wordprocessingGroup" xmlns:wpi="http://schemas.microsoft.com/office/word/2010/wordprocessingInk" xmlns:wne="http://schemas.microsoft.com/office/word/2006/wordml" xmlns:wps="http://schemas.microsoft.com/office/word/2010/wordprocessingShape" xmlns:wpsCustomData="http://www.wps.cn/officeDocument/2013/wpsCustomData" mc:Ignorable="w14 wp14">
+  <w:abstractNum w:abstractNumId="0">
+    <w:nsid w:val="2730A236"/>
+    <w:multiLevelType w:val="singleLevel"/>
+    <w:tmpl w:val="2730A236"/>
+    <w:lvl w:ilvl="0" w:tentative="0">
+      <w:start w:val="1"/>
+      <w:numFmt w:val="decimal"/>
+      <w:lvlText w:val="%1."/>
+      <w:lvlJc w:val="left"/>
+      <w:pPr>
+        <w:tabs>
+          <w:tab w:val="left" w:pos="312"/>
+        </w:tabs>
+      </w:pPr>
+    </w:lvl>
+  </w:abstractNum>
+  <w:num w:numId="1">
+    <w:abstractNumId w:val="0"/>
+  </w:num>
+</w:numbering>
 </file>
 
 <file path=word/styles.xml><?xml version="1.0" encoding="utf-8"?>

</xml_diff>

<commit_message>
I’ve done with some requirement analysis and module design.
</commit_message>
<xml_diff>
--- a/development.docx
+++ b/development.docx
@@ -19,36 +19,6 @@
     </w:p>
     <w:p>
       <w:pPr>
-        <w:rPr>
-          <w:rFonts w:hint="default"/>
-          <w:lang w:val="en-US"/>
-        </w:rPr>
-      </w:pPr>
-      <w:r>
-        <w:rPr>
-          <w:rFonts w:hint="default"/>
-          <w:lang w:val="en-US"/>
-        </w:rPr>
-        <w:t>Development log;</w:t>
-      </w:r>
-    </w:p>
-    <w:p>
-      <w:pPr>
-        <w:rPr>
-          <w:rFonts w:hint="default"/>
-          <w:lang w:val="en-US"/>
-        </w:rPr>
-      </w:pPr>
-      <w:r>
-        <w:rPr>
-          <w:rFonts w:hint="default"/>
-          <w:lang w:val="en-US"/>
-        </w:rPr>
-        <w:t>2025/4/15</w:t>
-      </w:r>
-    </w:p>
-    <w:p>
-      <w:pPr>
         <w:numPr>
           <w:ilvl w:val="0"/>
           <w:numId w:val="1"/>
@@ -58,13 +28,12 @@
           <w:lang w:val="en-US"/>
         </w:rPr>
       </w:pPr>
-      <w:bookmarkStart w:id="0" w:name="_GoBack"/>
-      <w:r>
-        <w:rPr>
-          <w:rFonts w:hint="default"/>
-          <w:lang w:val="en-US"/>
-        </w:rPr>
-        <w:t>I have downloaded the data of the periodic table from the internet(github)</w:t>
+      <w:r>
+        <w:rPr>
+          <w:rFonts w:hint="default"/>
+          <w:lang w:val="en-US"/>
+        </w:rPr>
+        <w:t>Goal:creat a project relevent to the periodic table,in order to provide a convenient place for the user to do element searching</w:t>
       </w:r>
     </w:p>
     <w:p>
@@ -83,8 +52,146 @@
           <w:rFonts w:hint="default"/>
           <w:lang w:val="en-US"/>
         </w:rPr>
-        <w:t>I have copied the downloaded data file to project workspace directory</w:t>
-      </w:r>
+        <w:t>Planing:</w:t>
+      </w:r>
+    </w:p>
+    <w:p>
+      <w:pPr>
+        <w:numPr>
+          <w:ilvl w:val="0"/>
+          <w:numId w:val="0"/>
+        </w:numPr>
+        <w:rPr>
+          <w:rFonts w:hint="default"/>
+          <w:lang w:val="en-US"/>
+        </w:rPr>
+      </w:pPr>
+      <w:r>
+        <w:rPr>
+          <w:rFonts w:hint="default"/>
+          <w:lang w:val="en-US"/>
+        </w:rPr>
+        <w:t xml:space="preserve">    (1) How much time have I got?</w:t>
+      </w:r>
+    </w:p>
+    <w:p>
+      <w:pPr>
+        <w:numPr>
+          <w:ilvl w:val="0"/>
+          <w:numId w:val="0"/>
+        </w:numPr>
+        <w:rPr>
+          <w:rFonts w:hint="default"/>
+          <w:lang w:val="en-US"/>
+        </w:rPr>
+      </w:pPr>
+      <w:r>
+        <w:rPr>
+          <w:rFonts w:hint="default"/>
+          <w:lang w:val="en-US"/>
+        </w:rPr>
+        <w:t xml:space="preserve">      2 weeks in total and I ‘ll be allocating 1-2 hours onto my project each day.</w:t>
+      </w:r>
+    </w:p>
+    <w:p>
+      <w:pPr>
+        <w:numPr>
+          <w:ilvl w:val="0"/>
+          <w:numId w:val="2"/>
+        </w:numPr>
+        <w:rPr>
+          <w:rFonts w:hint="default"/>
+          <w:lang w:val="en-US"/>
+        </w:rPr>
+      </w:pPr>
+      <w:r>
+        <w:rPr>
+          <w:rFonts w:hint="default"/>
+          <w:lang w:val="en-US"/>
+        </w:rPr>
+        <w:t>Human resources:1person.</w:t>
+      </w:r>
+    </w:p>
+    <w:p>
+      <w:pPr>
+        <w:numPr>
+          <w:ilvl w:val="0"/>
+          <w:numId w:val="2"/>
+        </w:numPr>
+        <w:tabs>
+          <w:tab w:val="left" w:pos="4964"/>
+        </w:tabs>
+        <w:ind w:left="0" w:leftChars="0" w:firstLine="0" w:firstLineChars="0"/>
+        <w:rPr>
+          <w:rFonts w:hint="default"/>
+          <w:lang w:val="en-US"/>
+        </w:rPr>
+      </w:pPr>
+      <w:r>
+        <w:rPr>
+          <w:rFonts w:hint="default"/>
+          <w:lang w:val="en-US"/>
+        </w:rPr>
+        <w:t>What techniques will I be using?</w:t>
+      </w:r>
+      <w:r>
+        <w:rPr>
+          <w:rFonts w:hint="default"/>
+        </w:rPr>
+        <w:tab/>
+      </w:r>
+    </w:p>
+    <w:p>
+      <w:pPr>
+        <w:numPr>
+          <w:ilvl w:val="0"/>
+          <w:numId w:val="0"/>
+        </w:numPr>
+        <w:ind w:leftChars="0" w:firstLine="420" w:firstLineChars="0"/>
+        <w:rPr>
+          <w:rFonts w:hint="default"/>
+          <w:lang w:val="en-US"/>
+        </w:rPr>
+      </w:pPr>
+      <w:r>
+        <w:rPr>
+          <w:rFonts w:hint="default"/>
+          <w:lang w:val="en-US"/>
+        </w:rPr>
+        <w:t>Techniques that I’ve learned in matlab,particularly techniques that are required in the project.</w:t>
+      </w:r>
+    </w:p>
+    <w:p>
+      <w:pPr>
+        <w:numPr>
+          <w:ilvl w:val="0"/>
+          <w:numId w:val="2"/>
+        </w:numPr>
+        <w:ind w:left="0" w:leftChars="0" w:firstLine="0" w:firstLineChars="0"/>
+        <w:rPr>
+          <w:rFonts w:hint="default"/>
+          <w:lang w:val="en-US"/>
+        </w:rPr>
+      </w:pPr>
+      <w:r>
+        <w:rPr>
+          <w:rFonts w:hint="default"/>
+          <w:lang w:val="en-US"/>
+        </w:rPr>
+        <w:t>Other correlated techniques are still learning.</w:t>
+      </w:r>
+    </w:p>
+    <w:p>
+      <w:pPr>
+        <w:numPr>
+          <w:numId w:val="0"/>
+        </w:numPr>
+        <w:ind w:leftChars="0"/>
+        <w:rPr>
+          <w:rFonts w:hint="default"/>
+          <w:lang w:val="en-US"/>
+        </w:rPr>
+      </w:pPr>
     </w:p>
     <w:p>
       <w:pPr>
@@ -92,38 +199,833 @@
           <w:ilvl w:val="0"/>
           <w:numId w:val="1"/>
         </w:numPr>
-        <w:rPr>
-          <w:rFonts w:hint="default"/>
-          <w:lang w:val="en-US"/>
-        </w:rPr>
-      </w:pPr>
-      <w:r>
-        <w:rPr>
-          <w:rFonts w:hint="default"/>
-          <w:lang w:val="en-US"/>
-        </w:rPr>
-        <w:t>Learning readtable,table2struct;</w:t>
+        <w:ind w:left="0" w:leftChars="0" w:firstLine="0" w:firstLineChars="0"/>
+        <w:rPr>
+          <w:rFonts w:hint="default"/>
+          <w:lang w:val="en-US"/>
+        </w:rPr>
+      </w:pPr>
+      <w:r>
+        <w:rPr>
+          <w:rFonts w:hint="default"/>
+          <w:lang w:val="en-US"/>
+        </w:rPr>
+        <w:t>Requirements Analysis:</w:t>
       </w:r>
     </w:p>
     <w:p>
       <w:pPr>
         <w:numPr>
           <w:ilvl w:val="0"/>
-          <w:numId w:val="1"/>
-        </w:numPr>
-        <w:rPr>
-          <w:rFonts w:hint="default"/>
-          <w:lang w:val="en-US"/>
-        </w:rPr>
-      </w:pPr>
-      <w:r>
-        <w:rPr>
-          <w:rFonts w:hint="default"/>
-          <w:lang w:val="en-US"/>
-        </w:rPr>
-        <w:t>I made an example of reading the data of the periodic table and showcases of elements</w:t>
-      </w:r>
+          <w:numId w:val="3"/>
+        </w:numPr>
+        <w:ind w:leftChars="0"/>
+        <w:rPr>
+          <w:rFonts w:hint="default"/>
+          <w:lang w:val="en-US"/>
+        </w:rPr>
+      </w:pPr>
+      <w:r>
+        <w:rPr>
+          <w:rFonts w:hint="default"/>
+          <w:lang w:val="en-US"/>
+        </w:rPr>
+        <w:t>provide a database for the periodic table.</w:t>
+      </w:r>
+    </w:p>
+    <w:p>
+      <w:pPr>
+        <w:numPr>
+          <w:ilvl w:val="1"/>
+          <w:numId w:val="3"/>
+        </w:numPr>
+        <w:ind w:left="840" w:leftChars="0" w:hanging="420" w:firstLineChars="0"/>
+        <w:rPr>
+          <w:rFonts w:hint="default"/>
+          <w:lang w:val="en-US"/>
+        </w:rPr>
+      </w:pPr>
+      <w:r>
+        <w:rPr>
+          <w:rFonts w:hint="default"/>
+          <w:lang w:val="en-US"/>
+        </w:rPr>
+        <w:t>Load data;</w:t>
+      </w:r>
+    </w:p>
+    <w:p>
+      <w:pPr>
+        <w:numPr>
+          <w:ilvl w:val="1"/>
+          <w:numId w:val="3"/>
+        </w:numPr>
+        <w:ind w:left="840" w:leftChars="0" w:hanging="420" w:firstLineChars="0"/>
+        <w:rPr>
+          <w:rFonts w:hint="default"/>
+          <w:lang w:val="en-US"/>
+        </w:rPr>
+      </w:pPr>
+      <w:r>
+        <w:rPr>
+          <w:rFonts w:hint="default"/>
+          <w:lang w:val="en-US"/>
+        </w:rPr>
+        <w:t>Prepare data;</w:t>
+      </w:r>
+    </w:p>
+    <w:p>
+      <w:pPr>
+        <w:numPr>
+          <w:numId w:val="0"/>
+        </w:numPr>
+        <w:rPr>
+          <w:rFonts w:hint="default"/>
+          <w:lang w:val="en-US"/>
+        </w:rPr>
+      </w:pPr>
+    </w:p>
+    <w:p>
+      <w:pPr>
+        <w:numPr>
+          <w:ilvl w:val="0"/>
+          <w:numId w:val="3"/>
+        </w:numPr>
+        <w:ind w:leftChars="0"/>
+        <w:rPr>
+          <w:rFonts w:hint="default"/>
+          <w:lang w:val="en-US" w:eastAsia="zh-CN"/>
+        </w:rPr>
+      </w:pPr>
+      <w:r>
+        <w:rPr>
+          <w:rFonts w:hint="default"/>
+          <w:lang w:val="en-US" w:eastAsia="zh-CN"/>
+        </w:rPr>
+        <w:t>Input module -  provide  friendly  input methods for users;</w:t>
+      </w:r>
+    </w:p>
+    <w:p>
+      <w:pPr>
+        <w:numPr>
+          <w:ilvl w:val="1"/>
+          <w:numId w:val="3"/>
+        </w:numPr>
+        <w:ind w:left="840" w:leftChars="0" w:hanging="420" w:firstLineChars="0"/>
+        <w:rPr>
+          <w:rFonts w:hint="default"/>
+          <w:lang w:val="en-US" w:eastAsia="zh-CN"/>
+        </w:rPr>
+      </w:pPr>
+    </w:p>
+    <w:p>
+      <w:pPr>
+        <w:numPr>
+          <w:ilvl w:val="0"/>
+          <w:numId w:val="3"/>
+        </w:numPr>
+        <w:ind w:leftChars="0"/>
+        <w:rPr>
+          <w:rFonts w:hint="default"/>
+          <w:lang w:val="en-US" w:eastAsia="zh-CN"/>
+        </w:rPr>
+      </w:pPr>
+      <w:r>
+        <w:rPr>
+          <w:rFonts w:hint="default"/>
+          <w:lang w:val="en-US" w:eastAsia="zh-CN"/>
+        </w:rPr>
+        <w:t>query module - provide multiple retrieval approaches :</w:t>
+      </w:r>
+    </w:p>
+    <w:p>
+      <w:pPr>
+        <w:tabs>
+          <w:tab w:val="left" w:pos="5714"/>
+        </w:tabs>
+        <w:bidi w:val="0"/>
+        <w:jc w:val="left"/>
+        <w:rPr>
+          <w:rFonts w:hint="default"/>
+          <w:lang w:val="en-US" w:eastAsia="zh-CN"/>
+        </w:rPr>
+      </w:pPr>
+      <w:r>
+        <w:rPr>
+          <w:rFonts w:hint="default"/>
+          <w:lang w:val="en-US" w:eastAsia="zh-CN"/>
+        </w:rPr>
+        <w:t xml:space="preserve">   ①By searching the name:both Chinese and English</w:t>
+      </w:r>
+    </w:p>
+    <w:p>
+      <w:pPr>
+        <w:tabs>
+          <w:tab w:val="left" w:pos="5714"/>
+        </w:tabs>
+        <w:bidi w:val="0"/>
+        <w:jc w:val="left"/>
+        <w:rPr>
+          <w:rFonts w:hint="default"/>
+          <w:lang w:val="en-US" w:eastAsia="zh-CN"/>
+        </w:rPr>
+      </w:pPr>
+      <w:r>
+        <w:rPr>
+          <w:rFonts w:hint="default"/>
+          <w:lang w:val="en-US" w:eastAsia="zh-CN"/>
+        </w:rPr>
+        <w:t xml:space="preserve">   ②By searching chemical symbols</w:t>
+      </w:r>
+    </w:p>
+    <w:p>
+      <w:pPr>
+        <w:tabs>
+          <w:tab w:val="left" w:pos="5714"/>
+        </w:tabs>
+        <w:bidi w:val="0"/>
+        <w:jc w:val="left"/>
+        <w:rPr>
+          <w:rFonts w:hint="default"/>
+          <w:lang w:val="en-US" w:eastAsia="zh-CN"/>
+        </w:rPr>
+      </w:pPr>
+      <w:r>
+        <w:rPr>
+          <w:rFonts w:hint="default"/>
+          <w:lang w:val="en-US" w:eastAsia="zh-CN"/>
+        </w:rPr>
+        <w:t xml:space="preserve">   ③By searching the names of the persons who discovered the elements</w:t>
+      </w:r>
+    </w:p>
+    <w:p>
+      <w:pPr>
+        <w:tabs>
+          <w:tab w:val="left" w:pos="5714"/>
+        </w:tabs>
+        <w:bidi w:val="0"/>
+        <w:jc w:val="both"/>
+        <w:rPr>
+          <w:rFonts w:hint="default"/>
+          <w:lang w:val="en-US" w:eastAsia="zh-CN"/>
+        </w:rPr>
+      </w:pPr>
+      <w:r>
+        <w:rPr>
+          <w:rFonts w:hint="default"/>
+          <w:lang w:val="en-US" w:eastAsia="zh-CN"/>
+        </w:rPr>
+        <w:t xml:space="preserve">   ④expand in accordance to real situations</w:t>
+      </w:r>
+    </w:p>
+    <w:p>
+      <w:pPr>
+        <w:numPr>
+          <w:numId w:val="0"/>
+        </w:numPr>
+        <w:rPr>
+          <w:rFonts w:hint="default"/>
+          <w:lang w:val="en-US" w:eastAsia="zh-CN"/>
+        </w:rPr>
+      </w:pPr>
+    </w:p>
+    <w:p>
+      <w:pPr>
+        <w:numPr>
+          <w:ilvl w:val="0"/>
+          <w:numId w:val="3"/>
+        </w:numPr>
+        <w:ind w:leftChars="0"/>
+        <w:rPr>
+          <w:rFonts w:hint="default"/>
+          <w:lang w:val="en-US" w:eastAsia="zh-CN"/>
+        </w:rPr>
+      </w:pPr>
+      <w:r>
+        <w:rPr>
+          <w:rFonts w:hint="default"/>
+          <w:lang w:val="en-US" w:eastAsia="zh-CN"/>
+        </w:rPr>
+        <w:t xml:space="preserve">Display module -  visualize the retrieved elements. </w:t>
+      </w:r>
+      <w:r>
+        <w:rPr>
+          <w:rFonts w:hint="default"/>
+          <w:lang w:val="en-US" w:eastAsia="zh-CN"/>
+        </w:rPr>
+        <w:tab/>
+      </w:r>
+    </w:p>
+    <w:p>
+      <w:pPr>
+        <w:numPr>
+          <w:ilvl w:val="1"/>
+          <w:numId w:val="3"/>
+        </w:numPr>
+        <w:ind w:left="840" w:leftChars="0" w:hanging="420" w:firstLineChars="0"/>
+        <w:rPr>
+          <w:rFonts w:hint="default"/>
+          <w:lang w:val="en-US" w:eastAsia="zh-CN"/>
+        </w:rPr>
+      </w:pPr>
+      <w:r>
+        <w:rPr>
+          <w:rFonts w:hint="default"/>
+          <w:lang w:val="en-US" w:eastAsia="zh-CN"/>
+        </w:rPr>
+        <w:t>basic demonstration</w:t>
+      </w:r>
+    </w:p>
+    <w:p>
+      <w:pPr>
+        <w:numPr>
+          <w:ilvl w:val="1"/>
+          <w:numId w:val="3"/>
+        </w:numPr>
+        <w:ind w:left="840" w:leftChars="0" w:hanging="420" w:firstLineChars="0"/>
+        <w:rPr>
+          <w:rFonts w:hint="default"/>
+          <w:lang w:val="en-US" w:eastAsia="zh-CN"/>
+        </w:rPr>
+      </w:pPr>
+      <w:r>
+        <w:rPr>
+          <w:rFonts w:hint="default"/>
+          <w:lang w:val="en-US" w:eastAsia="zh-CN"/>
+        </w:rPr>
+        <w:t>demonstration by graphs</w:t>
+      </w:r>
+    </w:p>
+    <w:p>
+      <w:pPr>
+        <w:numPr>
+          <w:ilvl w:val="0"/>
+          <w:numId w:val="3"/>
+        </w:numPr>
+        <w:ind w:leftChars="0"/>
+        <w:rPr>
+          <w:rFonts w:hint="default"/>
+          <w:lang w:val="en-US" w:eastAsia="zh-CN"/>
+        </w:rPr>
+      </w:pPr>
+      <w:r>
+        <w:rPr>
+          <w:rFonts w:hint="default"/>
+          <w:lang w:val="en-US" w:eastAsia="zh-CN"/>
+        </w:rPr>
+        <w:t>guessing module - provide a guessing game</w:t>
+      </w:r>
+    </w:p>
+    <w:p>
+      <w:pPr>
+        <w:numPr>
+          <w:ilvl w:val="0"/>
+          <w:numId w:val="3"/>
+        </w:numPr>
+        <w:ind w:leftChars="0"/>
+        <w:rPr>
+          <w:rFonts w:hint="default"/>
+          <w:lang w:val="en-US" w:eastAsia="zh-CN"/>
+        </w:rPr>
+      </w:pPr>
+      <w:r>
+        <w:rPr>
+          <w:rFonts w:hint="default"/>
+          <w:lang w:val="en-US" w:eastAsia="zh-CN"/>
+        </w:rPr>
+        <w:t>Main module - as the main controller and coordinator for this application of periodic table</w:t>
+      </w:r>
+    </w:p>
+    <w:p>
+      <w:pPr>
+        <w:rPr>
+          <w:rFonts w:hint="default"/>
+          <w:lang w:val="en-US" w:eastAsia="zh-CN"/>
+        </w:rPr>
+      </w:pPr>
+      <w:r>
+        <w:rPr>
+          <w:rFonts w:hint="default"/>
+          <w:lang w:val="en-US" w:eastAsia="zh-CN"/>
+        </w:rPr>
+        <w:br w:type="page"/>
+      </w:r>
+      <w:bookmarkStart w:id="0" w:name="_GoBack"/>
       <w:bookmarkEnd w:id="0"/>
+    </w:p>
+    <w:p>
+      <w:pPr>
+        <w:tabs>
+          <w:tab w:val="left" w:pos="5714"/>
+        </w:tabs>
+        <w:bidi w:val="0"/>
+        <w:jc w:val="left"/>
+        <w:rPr>
+          <w:rFonts w:hint="default"/>
+          <w:lang w:val="en-US" w:eastAsia="zh-CN"/>
+        </w:rPr>
+      </w:pPr>
+      <w:r>
+        <w:rPr>
+          <w:rFonts w:hint="default"/>
+          <w:lang w:val="en-US" w:eastAsia="zh-CN"/>
+        </w:rPr>
+        <w:t>4.Design</w:t>
+      </w:r>
+    </w:p>
+    <w:p>
+      <w:pPr>
+        <w:tabs>
+          <w:tab w:val="left" w:pos="5714"/>
+        </w:tabs>
+        <w:bidi w:val="0"/>
+        <w:jc w:val="left"/>
+        <w:rPr>
+          <w:rFonts w:hint="default"/>
+          <w:lang w:val="en-US" w:eastAsia="zh-CN"/>
+        </w:rPr>
+      </w:pPr>
+      <w:r>
+        <w:rPr>
+          <w:rFonts w:hint="default"/>
+          <w:lang w:val="en-US" w:eastAsia="zh-CN"/>
+        </w:rPr>
+        <w:t xml:space="preserve">  (1)overview Design:</w:t>
+      </w:r>
+    </w:p>
+    <w:p>
+      <w:pPr>
+        <w:tabs>
+          <w:tab w:val="left" w:pos="5714"/>
+        </w:tabs>
+        <w:bidi w:val="0"/>
+        <w:jc w:val="left"/>
+        <w:rPr>
+          <w:rFonts w:hint="default"/>
+          <w:lang w:val="en-US" w:eastAsia="zh-CN"/>
+        </w:rPr>
+      </w:pPr>
+      <w:r>
+        <w:rPr>
+          <w:rFonts w:hint="default"/>
+          <w:lang w:val="en-US" w:eastAsia="zh-CN"/>
+        </w:rPr>
+        <w:t>①various functions</w:t>
+      </w:r>
+    </w:p>
+    <w:p>
+      <w:pPr>
+        <w:tabs>
+          <w:tab w:val="left" w:pos="5714"/>
+        </w:tabs>
+        <w:bidi w:val="0"/>
+        <w:jc w:val="left"/>
+        <w:rPr>
+          <w:rFonts w:hint="default"/>
+          <w:lang w:val="en-US" w:eastAsia="zh-CN"/>
+        </w:rPr>
+      </w:pPr>
+      <w:r>
+        <w:rPr>
+          <w:rFonts w:hint="default"/>
+          <w:lang w:val="en-US" w:eastAsia="zh-CN"/>
+        </w:rPr>
+        <w:t>②classify functions in accordance to functionality</w:t>
+      </w:r>
+    </w:p>
+    <w:p>
+      <w:pPr>
+        <w:tabs>
+          <w:tab w:val="left" w:pos="5714"/>
+        </w:tabs>
+        <w:bidi w:val="0"/>
+        <w:jc w:val="left"/>
+        <w:rPr>
+          <w:rFonts w:hint="default"/>
+          <w:lang w:val="en-US" w:eastAsia="zh-CN"/>
+        </w:rPr>
+      </w:pPr>
+    </w:p>
+    <w:p>
+      <w:pPr>
+        <w:tabs>
+          <w:tab w:val="left" w:pos="5714"/>
+        </w:tabs>
+        <w:bidi w:val="0"/>
+        <w:jc w:val="left"/>
+        <w:rPr>
+          <w:rFonts w:hint="default"/>
+          <w:lang w:val="en-US" w:eastAsia="zh-CN"/>
+        </w:rPr>
+      </w:pPr>
+      <w:r>
+        <w:rPr>
+          <w:rFonts w:hint="default"/>
+          <w:lang w:val="en-US" w:eastAsia="zh-CN"/>
+        </w:rPr>
+        <w:t>(2)Detailed design:</w:t>
+      </w:r>
+    </w:p>
+    <w:p>
+      <w:pPr>
+        <w:tabs>
+          <w:tab w:val="left" w:pos="5714"/>
+        </w:tabs>
+        <w:bidi w:val="0"/>
+        <w:jc w:val="left"/>
+        <w:rPr>
+          <w:rFonts w:hint="default"/>
+          <w:lang w:val="en-US" w:eastAsia="zh-CN"/>
+        </w:rPr>
+      </w:pPr>
+      <w:r>
+        <w:rPr>
+          <w:rFonts w:hint="default"/>
+          <w:lang w:val="en-US" w:eastAsia="zh-CN"/>
+        </w:rPr>
+        <w:t xml:space="preserve"> ①setting up names of functions</w:t>
+      </w:r>
+    </w:p>
+    <w:p>
+      <w:pPr>
+        <w:tabs>
+          <w:tab w:val="left" w:pos="5714"/>
+        </w:tabs>
+        <w:bidi w:val="0"/>
+        <w:jc w:val="left"/>
+        <w:rPr>
+          <w:rFonts w:hint="default"/>
+          <w:lang w:val="en-US" w:eastAsia="zh-CN"/>
+        </w:rPr>
+      </w:pPr>
+      <w:r>
+        <w:rPr>
+          <w:rFonts w:hint="default"/>
+          <w:lang w:val="en-US" w:eastAsia="zh-CN"/>
+        </w:rPr>
+        <w:t>Function rawDatasets = loadDatasets(dataset_path);</w:t>
+      </w:r>
+    </w:p>
+    <w:p>
+      <w:pPr>
+        <w:tabs>
+          <w:tab w:val="left" w:pos="5714"/>
+        </w:tabs>
+        <w:bidi w:val="0"/>
+        <w:jc w:val="left"/>
+        <w:rPr>
+          <w:rFonts w:hint="default"/>
+          <w:lang w:val="en-US" w:eastAsia="zh-CN"/>
+        </w:rPr>
+      </w:pPr>
+      <w:r>
+        <w:rPr>
+          <w:rFonts w:hint="default"/>
+          <w:lang w:val="en-US" w:eastAsia="zh-CN"/>
+        </w:rPr>
+        <w:t>Function preparedDatasets = preprocessData(rawDatasets );</w:t>
+      </w:r>
+    </w:p>
+    <w:p>
+      <w:pPr>
+        <w:tabs>
+          <w:tab w:val="left" w:pos="5714"/>
+        </w:tabs>
+        <w:bidi w:val="0"/>
+        <w:jc w:val="left"/>
+        <w:rPr>
+          <w:rFonts w:hint="default"/>
+          <w:lang w:val="en-US" w:eastAsia="zh-CN"/>
+        </w:rPr>
+      </w:pPr>
+      <w:r>
+        <w:rPr>
+          <w:rFonts w:hint="default"/>
+          <w:lang w:val="en-US" w:eastAsia="zh-CN"/>
+        </w:rPr>
+        <w:t>Function [inputs ]= getUserInput();</w:t>
+      </w:r>
+    </w:p>
+    <w:p>
+      <w:pPr>
+        <w:tabs>
+          <w:tab w:val="left" w:pos="5714"/>
+        </w:tabs>
+        <w:bidi w:val="0"/>
+        <w:jc w:val="left"/>
+        <w:rPr>
+          <w:rFonts w:hint="default"/>
+          <w:lang w:val="en-US" w:eastAsia="zh-CN"/>
+        </w:rPr>
+      </w:pPr>
+      <w:r>
+        <w:rPr>
+          <w:rFonts w:hint="default"/>
+          <w:lang w:val="en-US" w:eastAsia="zh-CN"/>
+        </w:rPr>
+        <w:t>Function results = query(preparedDatasets, userInputs);</w:t>
+      </w:r>
+    </w:p>
+    <w:p>
+      <w:pPr>
+        <w:tabs>
+          <w:tab w:val="left" w:pos="5714"/>
+        </w:tabs>
+        <w:bidi w:val="0"/>
+        <w:jc w:val="left"/>
+        <w:rPr>
+          <w:rFonts w:hint="default"/>
+          <w:lang w:val="en-US" w:eastAsia="zh-CN"/>
+        </w:rPr>
+      </w:pPr>
+      <w:r>
+        <w:rPr>
+          <w:rFonts w:hint="default"/>
+          <w:lang w:val="en-US" w:eastAsia="zh-CN"/>
+        </w:rPr>
+        <w:t>Function displayElements(results, displayFormat);</w:t>
+      </w:r>
+    </w:p>
+    <w:p>
+      <w:pPr>
+        <w:tabs>
+          <w:tab w:val="left" w:pos="5714"/>
+        </w:tabs>
+        <w:bidi w:val="0"/>
+        <w:jc w:val="left"/>
+        <w:rPr>
+          <w:rFonts w:hint="eastAsia" w:eastAsiaTheme="minorEastAsia"/>
+          <w:lang w:val="en-US" w:eastAsia="zh-CN"/>
+        </w:rPr>
+      </w:pPr>
+      <w:r>
+        <w:rPr>
+          <w:rFonts w:hint="default"/>
+          <w:lang w:val="en-US" w:eastAsia="zh-CN"/>
+        </w:rPr>
+        <w:t>Function main();</w:t>
+      </w:r>
+    </w:p>
+    <w:p>
+      <w:pPr>
+        <w:tabs>
+          <w:tab w:val="left" w:pos="5714"/>
+        </w:tabs>
+        <w:bidi w:val="0"/>
+        <w:jc w:val="left"/>
+        <w:rPr>
+          <w:rFonts w:hint="default"/>
+          <w:lang w:val="en-US" w:eastAsia="zh-CN"/>
+        </w:rPr>
+      </w:pPr>
+    </w:p>
+    <w:p>
+      <w:pPr>
+        <w:tabs>
+          <w:tab w:val="left" w:pos="5714"/>
+        </w:tabs>
+        <w:bidi w:val="0"/>
+        <w:jc w:val="left"/>
+        <w:rPr>
+          <w:rFonts w:hint="default"/>
+          <w:lang w:val="en-US" w:eastAsia="zh-CN"/>
+        </w:rPr>
+      </w:pPr>
+    </w:p>
+    <w:p>
+      <w:pPr>
+        <w:tabs>
+          <w:tab w:val="left" w:pos="5714"/>
+        </w:tabs>
+        <w:bidi w:val="0"/>
+        <w:jc w:val="left"/>
+        <w:rPr>
+          <w:rFonts w:hint="default"/>
+          <w:lang w:val="en-US" w:eastAsia="zh-CN"/>
+        </w:rPr>
+      </w:pPr>
+    </w:p>
+    <w:p>
+      <w:pPr>
+        <w:tabs>
+          <w:tab w:val="left" w:pos="5714"/>
+        </w:tabs>
+        <w:bidi w:val="0"/>
+        <w:ind w:firstLine="105" w:firstLineChars="50"/>
+        <w:jc w:val="left"/>
+        <w:rPr>
+          <w:rFonts w:hint="default"/>
+          <w:lang w:val="en-US" w:eastAsia="zh-CN"/>
+        </w:rPr>
+      </w:pPr>
+      <w:r>
+        <w:rPr>
+          <w:rFonts w:hint="default"/>
+          <w:lang w:val="en-US" w:eastAsia="zh-CN"/>
+        </w:rPr>
+        <w:t>②setting up input parameters</w:t>
+      </w:r>
+    </w:p>
+    <w:p>
+      <w:pPr>
+        <w:tabs>
+          <w:tab w:val="left" w:pos="5714"/>
+        </w:tabs>
+        <w:bidi w:val="0"/>
+        <w:ind w:firstLine="105" w:firstLineChars="50"/>
+        <w:jc w:val="left"/>
+        <w:rPr>
+          <w:rFonts w:hint="default"/>
+          <w:lang w:val="en-US" w:eastAsia="zh-CN"/>
+        </w:rPr>
+      </w:pPr>
+      <w:r>
+        <w:rPr>
+          <w:rFonts w:hint="default"/>
+          <w:lang w:val="en-US" w:eastAsia="zh-CN"/>
+        </w:rPr>
+        <w:t>③setting up output parameters</w:t>
+      </w:r>
+    </w:p>
+    <w:p>
+      <w:pPr>
+        <w:tabs>
+          <w:tab w:val="left" w:pos="5714"/>
+        </w:tabs>
+        <w:bidi w:val="0"/>
+        <w:ind w:firstLine="105" w:firstLineChars="50"/>
+        <w:jc w:val="left"/>
+        <w:rPr>
+          <w:rFonts w:hint="default"/>
+          <w:lang w:val="en-US" w:eastAsia="zh-CN"/>
+        </w:rPr>
+      </w:pPr>
+    </w:p>
+    <w:p>
+      <w:pPr>
+        <w:tabs>
+          <w:tab w:val="left" w:pos="5714"/>
+        </w:tabs>
+        <w:bidi w:val="0"/>
+        <w:jc w:val="left"/>
+        <w:rPr>
+          <w:rFonts w:hint="default"/>
+          <w:lang w:val="en-US" w:eastAsia="zh-CN"/>
+        </w:rPr>
+      </w:pPr>
+      <w:r>
+        <w:rPr>
+          <w:rFonts w:hint="default"/>
+          <w:lang w:val="en-US" w:eastAsia="zh-CN"/>
+        </w:rPr>
+        <w:t>5.Implement</w:t>
+      </w:r>
+    </w:p>
+    <w:p>
+      <w:pPr>
+        <w:tabs>
+          <w:tab w:val="left" w:pos="5714"/>
+        </w:tabs>
+        <w:bidi w:val="0"/>
+        <w:jc w:val="left"/>
+        <w:rPr>
+          <w:rFonts w:hint="default"/>
+          <w:lang w:val="en-US" w:eastAsia="zh-CN"/>
+        </w:rPr>
+      </w:pPr>
+      <w:r>
+        <w:rPr>
+          <w:rFonts w:hint="default"/>
+          <w:lang w:val="en-US" w:eastAsia="zh-CN"/>
+        </w:rPr>
+        <w:t>(1)coding functions</w:t>
+      </w:r>
+    </w:p>
+    <w:p>
+      <w:pPr>
+        <w:tabs>
+          <w:tab w:val="left" w:pos="5714"/>
+        </w:tabs>
+        <w:bidi w:val="0"/>
+        <w:jc w:val="left"/>
+        <w:rPr>
+          <w:rFonts w:hint="default"/>
+          <w:lang w:val="en-US" w:eastAsia="zh-CN"/>
+        </w:rPr>
+      </w:pPr>
+      <w:r>
+        <w:rPr>
+          <w:rFonts w:hint="default"/>
+          <w:lang w:val="en-US" w:eastAsia="zh-CN"/>
+        </w:rPr>
+        <w:t>(2)coding to test functions</w:t>
+      </w:r>
+    </w:p>
+    <w:p>
+      <w:pPr>
+        <w:tabs>
+          <w:tab w:val="left" w:pos="5714"/>
+        </w:tabs>
+        <w:bidi w:val="0"/>
+        <w:jc w:val="left"/>
+        <w:rPr>
+          <w:rFonts w:hint="default"/>
+          <w:lang w:val="en-US" w:eastAsia="zh-CN"/>
+        </w:rPr>
+      </w:pPr>
+      <w:r>
+        <w:rPr>
+          <w:rFonts w:hint="default"/>
+          <w:lang w:val="en-US" w:eastAsia="zh-CN"/>
+        </w:rPr>
+        <w:t>6.Testing:</w:t>
+      </w:r>
+    </w:p>
+    <w:p>
+      <w:pPr>
+        <w:tabs>
+          <w:tab w:val="left" w:pos="5714"/>
+        </w:tabs>
+        <w:bidi w:val="0"/>
+        <w:jc w:val="left"/>
+        <w:rPr>
+          <w:rFonts w:hint="default"/>
+          <w:lang w:val="en-US" w:eastAsia="zh-CN"/>
+        </w:rPr>
+      </w:pPr>
+      <w:r>
+        <w:rPr>
+          <w:rFonts w:hint="default"/>
+          <w:lang w:val="en-US" w:eastAsia="zh-CN"/>
+        </w:rPr>
+        <w:t>Arrange functions and testing,check to see if all the parts are normal.</w:t>
+      </w:r>
+    </w:p>
+    <w:p>
+      <w:pPr>
+        <w:tabs>
+          <w:tab w:val="left" w:pos="5714"/>
+        </w:tabs>
+        <w:bidi w:val="0"/>
+        <w:jc w:val="left"/>
+        <w:rPr>
+          <w:rFonts w:hint="default"/>
+          <w:lang w:val="en-US" w:eastAsia="zh-CN"/>
+        </w:rPr>
+      </w:pPr>
+      <w:r>
+        <w:rPr>
+          <w:rFonts w:hint="default"/>
+          <w:lang w:val="en-US" w:eastAsia="zh-CN"/>
+        </w:rPr>
+        <w:t>Conclusion:summaries the project and learn lessons from it.</w:t>
+      </w:r>
+      <w:r>
+        <w:rPr>
+          <w:rFonts w:hint="default"/>
+          <w:lang w:val="en-US" w:eastAsia="zh-CN"/>
+        </w:rPr>
+        <w:tab/>
+      </w:r>
     </w:p>
     <w:sectPr>
       <w:pgSz w:w="11906" w:h="16838"/>
@@ -138,9 +1040,145 @@
 <file path=word/numbering.xml><?xml version="1.0" encoding="utf-8"?>
 <w:numbering xmlns:wpc="http://schemas.microsoft.com/office/word/2010/wordprocessingCanvas" xmlns:mc="http://schemas.openxmlformats.org/markup-compatibility/2006" xmlns:o="urn:schemas-microsoft-com:office:office" xmlns:r="http://schemas.openxmlformats.org/officeDocument/2006/relationships" xmlns:m="http://schemas.openxmlformats.org/officeDocument/2006/math" xmlns:v="urn:schemas-microsoft-com:vml" xmlns:wp14="http://schemas.microsoft.com/office/word/2010/wordprocessingDrawing" xmlns:wp="http://schemas.openxmlformats.org/drawingml/2006/wordprocessingDrawing" xmlns:w10="urn:schemas-microsoft-com:office:word" xmlns:w="http://schemas.openxmlformats.org/wordprocessingml/2006/main" xmlns:w14="http://schemas.microsoft.com/office/word/2010/wordml" xmlns:wpg="http://schemas.microsoft.com/office/word/2010/wordprocessingGroup" xmlns:wpi="http://schemas.microsoft.com/office/word/2010/wordprocessingInk" xmlns:wne="http://schemas.microsoft.com/office/word/2006/wordml" xmlns:wps="http://schemas.microsoft.com/office/word/2010/wordprocessingShape" xmlns:wpsCustomData="http://www.wps.cn/officeDocument/2013/wpsCustomData" mc:Ignorable="w14 wp14">
   <w:abstractNum w:abstractNumId="0">
-    <w:nsid w:val="2730A236"/>
+    <w:nsid w:val="904B4D00"/>
+    <w:multiLevelType w:val="multilevel"/>
+    <w:tmpl w:val="904B4D00"/>
+    <w:lvl w:ilvl="0" w:tentative="0">
+      <w:start w:val="1"/>
+      <w:numFmt w:val="decimal"/>
+      <w:lvlText w:val="(%1)"/>
+      <w:lvlJc w:val="left"/>
+      <w:pPr>
+        <w:tabs>
+          <w:tab w:val="left" w:pos="312"/>
+        </w:tabs>
+      </w:pPr>
+    </w:lvl>
+    <w:lvl w:ilvl="1" w:tentative="0">
+      <w:start w:val="1"/>
+      <w:numFmt w:val="decimalEnclosedCircleChinese"/>
+      <w:lvlText w:val="%2"/>
+      <w:lvlJc w:val="left"/>
+      <w:pPr>
+        <w:tabs>
+          <w:tab w:val="left" w:pos="840"/>
+        </w:tabs>
+        <w:ind w:left="840" w:leftChars="0" w:hanging="420" w:firstLineChars="0"/>
+      </w:pPr>
+      <w:rPr>
+        <w:rFonts w:hint="default"/>
+      </w:rPr>
+    </w:lvl>
+    <w:lvl w:ilvl="2" w:tentative="0">
+      <w:start w:val="1"/>
+      <w:numFmt w:val="decimal"/>
+      <w:lvlText w:val="%3)"/>
+      <w:lvlJc w:val="left"/>
+      <w:pPr>
+        <w:tabs>
+          <w:tab w:val="left" w:pos="1260"/>
+        </w:tabs>
+        <w:ind w:left="1260" w:leftChars="0" w:hanging="420" w:firstLineChars="0"/>
+      </w:pPr>
+      <w:rPr>
+        <w:rFonts w:hint="default"/>
+      </w:rPr>
+    </w:lvl>
+    <w:lvl w:ilvl="3" w:tentative="0">
+      <w:start w:val="1"/>
+      <w:numFmt w:val="lowerLetter"/>
+      <w:lvlText w:val="%4."/>
+      <w:lvlJc w:val="left"/>
+      <w:pPr>
+        <w:tabs>
+          <w:tab w:val="left" w:pos="1680"/>
+        </w:tabs>
+        <w:ind w:left="1680" w:leftChars="0" w:hanging="420" w:firstLineChars="0"/>
+      </w:pPr>
+      <w:rPr>
+        <w:rFonts w:hint="default"/>
+      </w:rPr>
+    </w:lvl>
+    <w:lvl w:ilvl="4" w:tentative="0">
+      <w:start w:val="1"/>
+      <w:numFmt w:val="lowerLetter"/>
+      <w:lvlText w:val="%5)"/>
+      <w:lvlJc w:val="left"/>
+      <w:pPr>
+        <w:tabs>
+          <w:tab w:val="left" w:pos="2100"/>
+        </w:tabs>
+        <w:ind w:left="2100" w:leftChars="0" w:hanging="420" w:firstLineChars="0"/>
+      </w:pPr>
+      <w:rPr>
+        <w:rFonts w:hint="default"/>
+      </w:rPr>
+    </w:lvl>
+    <w:lvl w:ilvl="5" w:tentative="0">
+      <w:start w:val="1"/>
+      <w:numFmt w:val="lowerRoman"/>
+      <w:lvlText w:val="%6."/>
+      <w:lvlJc w:val="left"/>
+      <w:pPr>
+        <w:tabs>
+          <w:tab w:val="left" w:pos="2520"/>
+        </w:tabs>
+        <w:ind w:left="2520" w:leftChars="0" w:hanging="420" w:firstLineChars="0"/>
+      </w:pPr>
+      <w:rPr>
+        <w:rFonts w:hint="default"/>
+      </w:rPr>
+    </w:lvl>
+    <w:lvl w:ilvl="6" w:tentative="0">
+      <w:start w:val="1"/>
+      <w:numFmt w:val="lowerRoman"/>
+      <w:lvlText w:val="%7)"/>
+      <w:lvlJc w:val="left"/>
+      <w:pPr>
+        <w:tabs>
+          <w:tab w:val="left" w:pos="2940"/>
+        </w:tabs>
+        <w:ind w:left="2940" w:leftChars="0" w:hanging="420" w:firstLineChars="0"/>
+      </w:pPr>
+      <w:rPr>
+        <w:rFonts w:hint="default"/>
+      </w:rPr>
+    </w:lvl>
+    <w:lvl w:ilvl="7" w:tentative="0">
+      <w:start w:val="1"/>
+      <w:numFmt w:val="lowerLetter"/>
+      <w:lvlText w:val="%8."/>
+      <w:lvlJc w:val="left"/>
+      <w:pPr>
+        <w:tabs>
+          <w:tab w:val="left" w:pos="3360"/>
+        </w:tabs>
+        <w:ind w:left="3360" w:leftChars="0" w:hanging="420" w:firstLineChars="0"/>
+      </w:pPr>
+      <w:rPr>
+        <w:rFonts w:hint="default"/>
+      </w:rPr>
+    </w:lvl>
+    <w:lvl w:ilvl="8" w:tentative="0">
+      <w:start w:val="1"/>
+      <w:numFmt w:val="lowerLetter"/>
+      <w:lvlText w:val="%9)"/>
+      <w:lvlJc w:val="left"/>
+      <w:pPr>
+        <w:tabs>
+          <w:tab w:val="left" w:pos="3780"/>
+        </w:tabs>
+        <w:ind w:left="3780" w:leftChars="0" w:hanging="420" w:firstLineChars="0"/>
+      </w:pPr>
+      <w:rPr>
+        <w:rFonts w:hint="default"/>
+      </w:rPr>
+    </w:lvl>
+  </w:abstractNum>
+  <w:abstractNum w:abstractNumId="1">
+    <w:nsid w:val="E952FC89"/>
     <w:multiLevelType w:val="singleLevel"/>
-    <w:tmpl w:val="2730A236"/>
+    <w:tmpl w:val="E952FC89"/>
     <w:lvl w:ilvl="0" w:tentative="0">
       <w:start w:val="1"/>
       <w:numFmt w:val="decimal"/>
@@ -153,7 +1191,25 @@
       </w:pPr>
     </w:lvl>
   </w:abstractNum>
+  <w:abstractNum w:abstractNumId="2">
+    <w:nsid w:val="F3CC7582"/>
+    <w:multiLevelType w:val="singleLevel"/>
+    <w:tmpl w:val="F3CC7582"/>
+    <w:lvl w:ilvl="0" w:tentative="0">
+      <w:start w:val="2"/>
+      <w:numFmt w:val="decimal"/>
+      <w:suff w:val="space"/>
+      <w:lvlText w:val="(%1)"/>
+      <w:lvlJc w:val="left"/>
+    </w:lvl>
+  </w:abstractNum>
   <w:num w:numId="1">
+    <w:abstractNumId w:val="1"/>
+  </w:num>
+  <w:num w:numId="2">
+    <w:abstractNumId w:val="2"/>
+  </w:num>
+  <w:num w:numId="3">
     <w:abstractNumId w:val="0"/>
   </w:num>
 </w:numbering>
@@ -164,7 +1220,7 @@
   <w:docDefaults>
     <w:rPrDefault>
       <w:rPr>
-        <w:rFonts w:asciiTheme="minorHAnsi" w:hAnsiTheme="minorHAnsi" w:eastAsiaTheme="minorEastAsia" w:cstheme="minorBidi"/>
+        <w:rFonts w:ascii="Times New Roman" w:hAnsi="Times New Roman" w:eastAsia="SimSun" w:cs="Times New Roman"/>
       </w:rPr>
     </w:rPrDefault>
     <w:pPrDefault/>

</xml_diff>

<commit_message>
update development.docx with logs
</commit_message>
<xml_diff>
--- a/development.docx
+++ b/development.docx
@@ -184,6 +184,7 @@
     <w:p>
       <w:pPr>
         <w:numPr>
+          <w:ilvl w:val="0"/>
           <w:numId w:val="0"/>
         </w:numPr>
         <w:ind w:leftChars="0"/>
@@ -276,6 +277,7 @@
     <w:p>
       <w:pPr>
         <w:numPr>
+          <w:ilvl w:val="0"/>
           <w:numId w:val="0"/>
         </w:numPr>
         <w:rPr>
@@ -420,6 +422,7 @@
     <w:p>
       <w:pPr>
         <w:numPr>
+          <w:ilvl w:val="0"/>
           <w:numId w:val="0"/>
         </w:numPr>
         <w:rPr>
@@ -549,8 +552,6 @@
         </w:rPr>
         <w:br w:type="page"/>
       </w:r>
-      <w:bookmarkStart w:id="0" w:name="_GoBack"/>
-      <w:bookmarkEnd w:id="0"/>
     </w:p>
     <w:p>
       <w:pPr>
@@ -1019,6 +1020,654 @@
         </w:rPr>
         <w:t>Conclusion:summaries the project and learn lessons from it.</w:t>
       </w:r>
+    </w:p>
+    <w:p>
+      <w:pPr>
+        <w:rPr>
+          <w:rFonts w:hint="default"/>
+          <w:lang w:val="en-US" w:eastAsia="zh-CN"/>
+        </w:rPr>
+      </w:pPr>
+      <w:r>
+        <w:rPr>
+          <w:rFonts w:hint="default"/>
+          <w:lang w:val="en-US" w:eastAsia="zh-CN"/>
+        </w:rPr>
+        <w:br w:type="page"/>
+      </w:r>
+    </w:p>
+    <w:tbl>
+      <w:tblPr>
+        <w:tblStyle w:val="3"/>
+        <w:tblW w:w="0" w:type="auto"/>
+        <w:tblInd w:w="0" w:type="dxa"/>
+        <w:tblBorders>
+          <w:top w:val="single" w:color="auto" w:sz="4" w:space="0"/>
+          <w:left w:val="single" w:color="auto" w:sz="4" w:space="0"/>
+          <w:bottom w:val="single" w:color="auto" w:sz="4" w:space="0"/>
+          <w:right w:val="single" w:color="auto" w:sz="4" w:space="0"/>
+          <w:insideH w:val="single" w:color="auto" w:sz="4" w:space="0"/>
+          <w:insideV w:val="single" w:color="auto" w:sz="4" w:space="0"/>
+        </w:tblBorders>
+        <w:tblLayout w:type="autofit"/>
+        <w:tblCellMar>
+          <w:left w:w="108" w:type="dxa"/>
+          <w:right w:w="108" w:type="dxa"/>
+        </w:tblCellMar>
+      </w:tblPr>
+      <w:tblGrid>
+        <w:gridCol w:w="1704"/>
+        <w:gridCol w:w="1704"/>
+        <w:gridCol w:w="1704"/>
+        <w:gridCol w:w="1705"/>
+        <w:gridCol w:w="1705"/>
+      </w:tblGrid>
+      <w:tr>
+        <w:tblPrEx>
+          <w:tblBorders>
+            <w:top w:val="single" w:color="auto" w:sz="4" w:space="0"/>
+            <w:left w:val="single" w:color="auto" w:sz="4" w:space="0"/>
+            <w:bottom w:val="single" w:color="auto" w:sz="4" w:space="0"/>
+            <w:right w:val="single" w:color="auto" w:sz="4" w:space="0"/>
+            <w:insideH w:val="single" w:color="auto" w:sz="4" w:space="0"/>
+            <w:insideV w:val="single" w:color="auto" w:sz="4" w:space="0"/>
+          </w:tblBorders>
+        </w:tblPrEx>
+        <w:tc>
+          <w:tcPr>
+            <w:tcW w:w="1704" w:type="dxa"/>
+          </w:tcPr>
+          <w:p>
+            <w:pPr>
+              <w:tabs>
+                <w:tab w:val="left" w:pos="5714"/>
+              </w:tabs>
+              <w:bidi w:val="0"/>
+              <w:jc w:val="left"/>
+              <w:rPr>
+                <w:rFonts w:hint="default"/>
+                <w:vertAlign w:val="baseline"/>
+                <w:lang w:val="en-US" w:eastAsia="zh-CN"/>
+              </w:rPr>
+            </w:pPr>
+          </w:p>
+        </w:tc>
+        <w:tc>
+          <w:tcPr>
+            <w:tcW w:w="1704" w:type="dxa"/>
+          </w:tcPr>
+          <w:p>
+            <w:pPr>
+              <w:tabs>
+                <w:tab w:val="left" w:pos="5714"/>
+              </w:tabs>
+              <w:bidi w:val="0"/>
+              <w:jc w:val="left"/>
+              <w:rPr>
+                <w:rFonts w:hint="default"/>
+                <w:vertAlign w:val="baseline"/>
+                <w:lang w:val="en-US" w:eastAsia="zh-CN"/>
+              </w:rPr>
+            </w:pPr>
+            <w:r>
+              <w:rPr>
+                <w:rFonts w:hint="eastAsia"/>
+                <w:vertAlign w:val="baseline"/>
+                <w:lang w:val="en-US" w:eastAsia="zh-CN"/>
+              </w:rPr>
+              <w:t>Date</w:t>
+            </w:r>
+          </w:p>
+        </w:tc>
+        <w:tc>
+          <w:tcPr>
+            <w:tcW w:w="1704" w:type="dxa"/>
+          </w:tcPr>
+          <w:p>
+            <w:pPr>
+              <w:tabs>
+                <w:tab w:val="left" w:pos="5714"/>
+              </w:tabs>
+              <w:bidi w:val="0"/>
+              <w:jc w:val="left"/>
+              <w:rPr>
+                <w:rFonts w:hint="default"/>
+                <w:vertAlign w:val="baseline"/>
+                <w:lang w:val="en-US" w:eastAsia="zh-CN"/>
+              </w:rPr>
+            </w:pPr>
+            <w:r>
+              <w:rPr>
+                <w:rFonts w:hint="eastAsia"/>
+                <w:vertAlign w:val="baseline"/>
+                <w:lang w:val="en-US" w:eastAsia="zh-CN"/>
+              </w:rPr>
+              <w:t>content</w:t>
+            </w:r>
+          </w:p>
+        </w:tc>
+        <w:tc>
+          <w:tcPr>
+            <w:tcW w:w="1705" w:type="dxa"/>
+          </w:tcPr>
+          <w:p>
+            <w:pPr>
+              <w:tabs>
+                <w:tab w:val="left" w:pos="5714"/>
+              </w:tabs>
+              <w:bidi w:val="0"/>
+              <w:jc w:val="left"/>
+              <w:rPr>
+                <w:rFonts w:hint="default"/>
+                <w:vertAlign w:val="baseline"/>
+                <w:lang w:val="en-US" w:eastAsia="zh-CN"/>
+              </w:rPr>
+            </w:pPr>
+          </w:p>
+        </w:tc>
+        <w:tc>
+          <w:tcPr>
+            <w:tcW w:w="1705" w:type="dxa"/>
+          </w:tcPr>
+          <w:p>
+            <w:pPr>
+              <w:tabs>
+                <w:tab w:val="left" w:pos="5714"/>
+              </w:tabs>
+              <w:bidi w:val="0"/>
+              <w:jc w:val="left"/>
+              <w:rPr>
+                <w:rFonts w:hint="default"/>
+                <w:vertAlign w:val="baseline"/>
+                <w:lang w:val="en-US" w:eastAsia="zh-CN"/>
+              </w:rPr>
+            </w:pPr>
+          </w:p>
+        </w:tc>
+      </w:tr>
+      <w:tr>
+        <w:tblPrEx>
+          <w:tblBorders>
+            <w:top w:val="single" w:color="auto" w:sz="4" w:space="0"/>
+            <w:left w:val="single" w:color="auto" w:sz="4" w:space="0"/>
+            <w:bottom w:val="single" w:color="auto" w:sz="4" w:space="0"/>
+            <w:right w:val="single" w:color="auto" w:sz="4" w:space="0"/>
+            <w:insideH w:val="single" w:color="auto" w:sz="4" w:space="0"/>
+            <w:insideV w:val="single" w:color="auto" w:sz="4" w:space="0"/>
+          </w:tblBorders>
+          <w:tblCellMar>
+            <w:left w:w="108" w:type="dxa"/>
+            <w:right w:w="108" w:type="dxa"/>
+          </w:tblCellMar>
+        </w:tblPrEx>
+        <w:tc>
+          <w:tcPr>
+            <w:tcW w:w="1704" w:type="dxa"/>
+          </w:tcPr>
+          <w:p>
+            <w:pPr>
+              <w:tabs>
+                <w:tab w:val="left" w:pos="5714"/>
+              </w:tabs>
+              <w:bidi w:val="0"/>
+              <w:jc w:val="left"/>
+              <w:rPr>
+                <w:rFonts w:hint="default"/>
+                <w:vertAlign w:val="baseline"/>
+                <w:lang w:val="en-US" w:eastAsia="zh-CN"/>
+              </w:rPr>
+            </w:pPr>
+          </w:p>
+        </w:tc>
+        <w:tc>
+          <w:tcPr>
+            <w:tcW w:w="1704" w:type="dxa"/>
+          </w:tcPr>
+          <w:p>
+            <w:pPr>
+              <w:tabs>
+                <w:tab w:val="left" w:pos="5714"/>
+              </w:tabs>
+              <w:bidi w:val="0"/>
+              <w:jc w:val="left"/>
+              <w:rPr>
+                <w:rFonts w:hint="default"/>
+                <w:vertAlign w:val="baseline"/>
+                <w:lang w:val="en-US" w:eastAsia="zh-CN"/>
+              </w:rPr>
+            </w:pPr>
+          </w:p>
+        </w:tc>
+        <w:tc>
+          <w:tcPr>
+            <w:tcW w:w="1704" w:type="dxa"/>
+          </w:tcPr>
+          <w:p>
+            <w:pPr>
+              <w:tabs>
+                <w:tab w:val="left" w:pos="5714"/>
+              </w:tabs>
+              <w:bidi w:val="0"/>
+              <w:jc w:val="left"/>
+              <w:rPr>
+                <w:rFonts w:hint="default"/>
+                <w:vertAlign w:val="baseline"/>
+                <w:lang w:val="en-US" w:eastAsia="zh-CN"/>
+              </w:rPr>
+            </w:pPr>
+          </w:p>
+        </w:tc>
+        <w:tc>
+          <w:tcPr>
+            <w:tcW w:w="1705" w:type="dxa"/>
+          </w:tcPr>
+          <w:p>
+            <w:pPr>
+              <w:tabs>
+                <w:tab w:val="left" w:pos="5714"/>
+              </w:tabs>
+              <w:bidi w:val="0"/>
+              <w:jc w:val="left"/>
+              <w:rPr>
+                <w:rFonts w:hint="default"/>
+                <w:vertAlign w:val="baseline"/>
+                <w:lang w:val="en-US" w:eastAsia="zh-CN"/>
+              </w:rPr>
+            </w:pPr>
+          </w:p>
+        </w:tc>
+        <w:tc>
+          <w:tcPr>
+            <w:tcW w:w="1705" w:type="dxa"/>
+          </w:tcPr>
+          <w:p>
+            <w:pPr>
+              <w:tabs>
+                <w:tab w:val="left" w:pos="5714"/>
+              </w:tabs>
+              <w:bidi w:val="0"/>
+              <w:jc w:val="left"/>
+              <w:rPr>
+                <w:rFonts w:hint="default"/>
+                <w:vertAlign w:val="baseline"/>
+                <w:lang w:val="en-US" w:eastAsia="zh-CN"/>
+              </w:rPr>
+            </w:pPr>
+          </w:p>
+        </w:tc>
+      </w:tr>
+      <w:tr>
+        <w:tblPrEx>
+          <w:tblBorders>
+            <w:top w:val="single" w:color="auto" w:sz="4" w:space="0"/>
+            <w:left w:val="single" w:color="auto" w:sz="4" w:space="0"/>
+            <w:bottom w:val="single" w:color="auto" w:sz="4" w:space="0"/>
+            <w:right w:val="single" w:color="auto" w:sz="4" w:space="0"/>
+            <w:insideH w:val="single" w:color="auto" w:sz="4" w:space="0"/>
+            <w:insideV w:val="single" w:color="auto" w:sz="4" w:space="0"/>
+          </w:tblBorders>
+          <w:tblCellMar>
+            <w:left w:w="108" w:type="dxa"/>
+            <w:right w:w="108" w:type="dxa"/>
+          </w:tblCellMar>
+        </w:tblPrEx>
+        <w:tc>
+          <w:tcPr>
+            <w:tcW w:w="1704" w:type="dxa"/>
+          </w:tcPr>
+          <w:p>
+            <w:pPr>
+              <w:tabs>
+                <w:tab w:val="left" w:pos="5714"/>
+              </w:tabs>
+              <w:bidi w:val="0"/>
+              <w:jc w:val="left"/>
+              <w:rPr>
+                <w:rFonts w:hint="default"/>
+                <w:vertAlign w:val="baseline"/>
+                <w:lang w:val="en-US" w:eastAsia="zh-CN"/>
+              </w:rPr>
+            </w:pPr>
+          </w:p>
+        </w:tc>
+        <w:tc>
+          <w:tcPr>
+            <w:tcW w:w="1704" w:type="dxa"/>
+          </w:tcPr>
+          <w:p>
+            <w:pPr>
+              <w:tabs>
+                <w:tab w:val="left" w:pos="5714"/>
+              </w:tabs>
+              <w:bidi w:val="0"/>
+              <w:jc w:val="left"/>
+              <w:rPr>
+                <w:rFonts w:hint="default"/>
+                <w:vertAlign w:val="baseline"/>
+                <w:lang w:val="en-US" w:eastAsia="zh-CN"/>
+              </w:rPr>
+            </w:pPr>
+          </w:p>
+        </w:tc>
+        <w:tc>
+          <w:tcPr>
+            <w:tcW w:w="1704" w:type="dxa"/>
+          </w:tcPr>
+          <w:p>
+            <w:pPr>
+              <w:tabs>
+                <w:tab w:val="left" w:pos="5714"/>
+              </w:tabs>
+              <w:bidi w:val="0"/>
+              <w:jc w:val="left"/>
+              <w:rPr>
+                <w:rFonts w:hint="default"/>
+                <w:vertAlign w:val="baseline"/>
+                <w:lang w:val="en-US" w:eastAsia="zh-CN"/>
+              </w:rPr>
+            </w:pPr>
+          </w:p>
+        </w:tc>
+        <w:tc>
+          <w:tcPr>
+            <w:tcW w:w="1705" w:type="dxa"/>
+          </w:tcPr>
+          <w:p>
+            <w:pPr>
+              <w:tabs>
+                <w:tab w:val="left" w:pos="5714"/>
+              </w:tabs>
+              <w:bidi w:val="0"/>
+              <w:jc w:val="left"/>
+              <w:rPr>
+                <w:rFonts w:hint="default"/>
+                <w:vertAlign w:val="baseline"/>
+                <w:lang w:val="en-US" w:eastAsia="zh-CN"/>
+              </w:rPr>
+            </w:pPr>
+          </w:p>
+        </w:tc>
+        <w:tc>
+          <w:tcPr>
+            <w:tcW w:w="1705" w:type="dxa"/>
+          </w:tcPr>
+          <w:p>
+            <w:pPr>
+              <w:tabs>
+                <w:tab w:val="left" w:pos="5714"/>
+              </w:tabs>
+              <w:bidi w:val="0"/>
+              <w:jc w:val="left"/>
+              <w:rPr>
+                <w:rFonts w:hint="default"/>
+                <w:vertAlign w:val="baseline"/>
+                <w:lang w:val="en-US" w:eastAsia="zh-CN"/>
+              </w:rPr>
+            </w:pPr>
+          </w:p>
+        </w:tc>
+      </w:tr>
+      <w:tr>
+        <w:tblPrEx>
+          <w:tblBorders>
+            <w:top w:val="single" w:color="auto" w:sz="4" w:space="0"/>
+            <w:left w:val="single" w:color="auto" w:sz="4" w:space="0"/>
+            <w:bottom w:val="single" w:color="auto" w:sz="4" w:space="0"/>
+            <w:right w:val="single" w:color="auto" w:sz="4" w:space="0"/>
+            <w:insideH w:val="single" w:color="auto" w:sz="4" w:space="0"/>
+            <w:insideV w:val="single" w:color="auto" w:sz="4" w:space="0"/>
+          </w:tblBorders>
+          <w:tblCellMar>
+            <w:left w:w="108" w:type="dxa"/>
+            <w:right w:w="108" w:type="dxa"/>
+          </w:tblCellMar>
+        </w:tblPrEx>
+        <w:tc>
+          <w:tcPr>
+            <w:tcW w:w="1704" w:type="dxa"/>
+          </w:tcPr>
+          <w:p>
+            <w:pPr>
+              <w:tabs>
+                <w:tab w:val="left" w:pos="5714"/>
+              </w:tabs>
+              <w:bidi w:val="0"/>
+              <w:jc w:val="left"/>
+              <w:rPr>
+                <w:rFonts w:hint="default"/>
+                <w:vertAlign w:val="baseline"/>
+                <w:lang w:val="en-US" w:eastAsia="zh-CN"/>
+              </w:rPr>
+            </w:pPr>
+          </w:p>
+        </w:tc>
+        <w:tc>
+          <w:tcPr>
+            <w:tcW w:w="1704" w:type="dxa"/>
+          </w:tcPr>
+          <w:p>
+            <w:pPr>
+              <w:tabs>
+                <w:tab w:val="left" w:pos="5714"/>
+              </w:tabs>
+              <w:bidi w:val="0"/>
+              <w:jc w:val="left"/>
+              <w:rPr>
+                <w:rFonts w:hint="default"/>
+                <w:vertAlign w:val="baseline"/>
+                <w:lang w:val="en-US" w:eastAsia="zh-CN"/>
+              </w:rPr>
+            </w:pPr>
+            <w:r>
+              <w:rPr>
+                <w:rFonts w:hint="eastAsia"/>
+                <w:vertAlign w:val="baseline"/>
+                <w:lang w:val="en-US" w:eastAsia="zh-CN"/>
+              </w:rPr>
+              <w:t>2025/04/19</w:t>
+            </w:r>
+          </w:p>
+        </w:tc>
+        <w:tc>
+          <w:tcPr>
+            <w:tcW w:w="1704" w:type="dxa"/>
+          </w:tcPr>
+          <w:p>
+            <w:pPr>
+              <w:tabs>
+                <w:tab w:val="left" w:pos="5714"/>
+              </w:tabs>
+              <w:bidi w:val="0"/>
+              <w:jc w:val="left"/>
+              <w:rPr>
+                <w:rFonts w:hint="default"/>
+                <w:vertAlign w:val="baseline"/>
+                <w:lang w:val="en-US" w:eastAsia="zh-CN"/>
+              </w:rPr>
+            </w:pPr>
+            <w:r>
+              <w:rPr>
+                <w:rFonts w:hint="eastAsia"/>
+                <w:vertAlign w:val="baseline"/>
+                <w:lang w:val="en-US" w:eastAsia="zh-CN"/>
+              </w:rPr>
+              <w:t>I have done with the construction of the main and queryElements function.</w:t>
+            </w:r>
+            <w:bookmarkStart w:id="0" w:name="_GoBack"/>
+            <w:bookmarkEnd w:id="0"/>
+            <w:r>
+              <w:rPr>
+                <w:rFonts w:hint="eastAsia"/>
+                <w:vertAlign w:val="baseline"/>
+                <w:lang w:val="en-US" w:eastAsia="zh-CN"/>
+              </w:rPr>
+              <w:t xml:space="preserve">   </w:t>
+            </w:r>
+          </w:p>
+        </w:tc>
+        <w:tc>
+          <w:tcPr>
+            <w:tcW w:w="1705" w:type="dxa"/>
+          </w:tcPr>
+          <w:p>
+            <w:pPr>
+              <w:tabs>
+                <w:tab w:val="left" w:pos="5714"/>
+              </w:tabs>
+              <w:bidi w:val="0"/>
+              <w:jc w:val="left"/>
+              <w:rPr>
+                <w:rFonts w:hint="default"/>
+                <w:vertAlign w:val="baseline"/>
+                <w:lang w:val="en-US" w:eastAsia="zh-CN"/>
+              </w:rPr>
+            </w:pPr>
+          </w:p>
+        </w:tc>
+        <w:tc>
+          <w:tcPr>
+            <w:tcW w:w="1705" w:type="dxa"/>
+          </w:tcPr>
+          <w:p>
+            <w:pPr>
+              <w:tabs>
+                <w:tab w:val="left" w:pos="5714"/>
+              </w:tabs>
+              <w:bidi w:val="0"/>
+              <w:jc w:val="left"/>
+              <w:rPr>
+                <w:rFonts w:hint="default"/>
+                <w:vertAlign w:val="baseline"/>
+                <w:lang w:val="en-US" w:eastAsia="zh-CN"/>
+              </w:rPr>
+            </w:pPr>
+          </w:p>
+        </w:tc>
+      </w:tr>
+      <w:tr>
+        <w:tblPrEx>
+          <w:tblBorders>
+            <w:top w:val="single" w:color="auto" w:sz="4" w:space="0"/>
+            <w:left w:val="single" w:color="auto" w:sz="4" w:space="0"/>
+            <w:bottom w:val="single" w:color="auto" w:sz="4" w:space="0"/>
+            <w:right w:val="single" w:color="auto" w:sz="4" w:space="0"/>
+            <w:insideH w:val="single" w:color="auto" w:sz="4" w:space="0"/>
+            <w:insideV w:val="single" w:color="auto" w:sz="4" w:space="0"/>
+          </w:tblBorders>
+          <w:tblCellMar>
+            <w:left w:w="108" w:type="dxa"/>
+            <w:right w:w="108" w:type="dxa"/>
+          </w:tblCellMar>
+        </w:tblPrEx>
+        <w:tc>
+          <w:tcPr>
+            <w:tcW w:w="1704" w:type="dxa"/>
+          </w:tcPr>
+          <w:p>
+            <w:pPr>
+              <w:tabs>
+                <w:tab w:val="left" w:pos="5714"/>
+              </w:tabs>
+              <w:bidi w:val="0"/>
+              <w:jc w:val="left"/>
+              <w:rPr>
+                <w:rFonts w:hint="default"/>
+                <w:vertAlign w:val="baseline"/>
+                <w:lang w:val="en-US" w:eastAsia="zh-CN"/>
+              </w:rPr>
+            </w:pPr>
+          </w:p>
+        </w:tc>
+        <w:tc>
+          <w:tcPr>
+            <w:tcW w:w="1704" w:type="dxa"/>
+          </w:tcPr>
+          <w:p>
+            <w:pPr>
+              <w:tabs>
+                <w:tab w:val="left" w:pos="5714"/>
+              </w:tabs>
+              <w:bidi w:val="0"/>
+              <w:jc w:val="left"/>
+              <w:rPr>
+                <w:rFonts w:hint="default"/>
+                <w:vertAlign w:val="baseline"/>
+                <w:lang w:val="en-US" w:eastAsia="zh-CN"/>
+              </w:rPr>
+            </w:pPr>
+          </w:p>
+        </w:tc>
+        <w:tc>
+          <w:tcPr>
+            <w:tcW w:w="1704" w:type="dxa"/>
+          </w:tcPr>
+          <w:p>
+            <w:pPr>
+              <w:tabs>
+                <w:tab w:val="left" w:pos="5714"/>
+              </w:tabs>
+              <w:bidi w:val="0"/>
+              <w:jc w:val="left"/>
+              <w:rPr>
+                <w:rFonts w:hint="default"/>
+                <w:vertAlign w:val="baseline"/>
+                <w:lang w:val="en-US" w:eastAsia="zh-CN"/>
+              </w:rPr>
+            </w:pPr>
+          </w:p>
+        </w:tc>
+        <w:tc>
+          <w:tcPr>
+            <w:tcW w:w="1705" w:type="dxa"/>
+          </w:tcPr>
+          <w:p>
+            <w:pPr>
+              <w:tabs>
+                <w:tab w:val="left" w:pos="5714"/>
+              </w:tabs>
+              <w:bidi w:val="0"/>
+              <w:jc w:val="left"/>
+              <w:rPr>
+                <w:rFonts w:hint="default"/>
+                <w:vertAlign w:val="baseline"/>
+                <w:lang w:val="en-US" w:eastAsia="zh-CN"/>
+              </w:rPr>
+            </w:pPr>
+          </w:p>
+        </w:tc>
+        <w:tc>
+          <w:tcPr>
+            <w:tcW w:w="1705" w:type="dxa"/>
+          </w:tcPr>
+          <w:p>
+            <w:pPr>
+              <w:tabs>
+                <w:tab w:val="left" w:pos="5714"/>
+              </w:tabs>
+              <w:bidi w:val="0"/>
+              <w:jc w:val="left"/>
+              <w:rPr>
+                <w:rFonts w:hint="default"/>
+                <w:vertAlign w:val="baseline"/>
+                <w:lang w:val="en-US" w:eastAsia="zh-CN"/>
+              </w:rPr>
+            </w:pPr>
+          </w:p>
+        </w:tc>
+      </w:tr>
+    </w:tbl>
+    <w:p>
+      <w:pPr>
+        <w:tabs>
+          <w:tab w:val="left" w:pos="5714"/>
+        </w:tabs>
+        <w:bidi w:val="0"/>
+        <w:jc w:val="left"/>
+        <w:rPr>
+          <w:rFonts w:hint="default"/>
+          <w:lang w:val="en-US" w:eastAsia="zh-CN"/>
+        </w:rPr>
+      </w:pPr>
       <w:r>
         <w:rPr>
           <w:rFonts w:hint="default"/>
@@ -1491,7 +2140,7 @@
       <w:lang w:val="en-US" w:eastAsia="zh-CN" w:bidi="ar-SA"/>
     </w:rPr>
   </w:style>
-  <w:style w:type="character" w:default="1" w:styleId="3">
+  <w:style w:type="character" w:default="1" w:styleId="4">
     <w:name w:val="Default Paragraph Font"/>
     <w:semiHidden/>
     <w:uiPriority w:val="0"/>
@@ -1507,6 +2156,25 @@
         <w:bottom w:w="0" w:type="dxa"/>
         <w:right w:w="108" w:type="dxa"/>
       </w:tblCellMar>
+    </w:tblPr>
+  </w:style>
+  <w:style w:type="table" w:styleId="3">
+    <w:name w:val="Table Grid"/>
+    <w:basedOn w:val="2"/>
+    <w:uiPriority w:val="0"/>
+    <w:pPr>
+      <w:widowControl w:val="0"/>
+      <w:jc w:val="both"/>
+    </w:pPr>
+    <w:tblPr>
+      <w:tblBorders>
+        <w:top w:val="single" w:color="auto" w:sz="4" w:space="0"/>
+        <w:left w:val="single" w:color="auto" w:sz="4" w:space="0"/>
+        <w:bottom w:val="single" w:color="auto" w:sz="4" w:space="0"/>
+        <w:right w:val="single" w:color="auto" w:sz="4" w:space="0"/>
+        <w:insideH w:val="single" w:color="auto" w:sz="4" w:space="0"/>
+        <w:insideV w:val="single" w:color="auto" w:sz="4" w:space="0"/>
+      </w:tblBorders>
     </w:tblPr>
   </w:style>
 </w:styles>

</xml_diff>

<commit_message>
I have updated the commit development log for today.
</commit_message>
<xml_diff>
--- a/development.docx
+++ b/development.docx
@@ -1051,16 +1051,18 @@
         </w:tblBorders>
         <w:tblLayout w:type="autofit"/>
         <w:tblCellMar>
+          <w:top w:w="0" w:type="dxa"/>
           <w:left w:w="108" w:type="dxa"/>
+          <w:bottom w:w="0" w:type="dxa"/>
           <w:right w:w="108" w:type="dxa"/>
         </w:tblCellMar>
       </w:tblPr>
       <w:tblGrid>
-        <w:gridCol w:w="1704"/>
-        <w:gridCol w:w="1704"/>
-        <w:gridCol w:w="1704"/>
-        <w:gridCol w:w="1705"/>
-        <w:gridCol w:w="1705"/>
+        <w:gridCol w:w="1669"/>
+        <w:gridCol w:w="1693"/>
+        <w:gridCol w:w="1819"/>
+        <w:gridCol w:w="1670"/>
+        <w:gridCol w:w="1671"/>
       </w:tblGrid>
       <w:tr>
         <w:tblPrEx>
@@ -1072,6 +1074,12 @@
             <w:insideH w:val="single" w:color="auto" w:sz="4" w:space="0"/>
             <w:insideV w:val="single" w:color="auto" w:sz="4" w:space="0"/>
           </w:tblBorders>
+          <w:tblCellMar>
+            <w:top w:w="0" w:type="dxa"/>
+            <w:left w:w="108" w:type="dxa"/>
+            <w:bottom w:w="0" w:type="dxa"/>
+            <w:right w:w="108" w:type="dxa"/>
+          </w:tblCellMar>
         </w:tblPrEx>
         <w:tc>
           <w:tcPr>
@@ -1196,7 +1204,9 @@
             <w:insideV w:val="single" w:color="auto" w:sz="4" w:space="0"/>
           </w:tblBorders>
           <w:tblCellMar>
+            <w:top w:w="0" w:type="dxa"/>
             <w:left w:w="108" w:type="dxa"/>
+            <w:bottom w:w="0" w:type="dxa"/>
             <w:right w:w="108" w:type="dxa"/>
           </w:tblCellMar>
         </w:tblPrEx>
@@ -1307,7 +1317,9 @@
             <w:insideV w:val="single" w:color="auto" w:sz="4" w:space="0"/>
           </w:tblBorders>
           <w:tblCellMar>
+            <w:top w:w="0" w:type="dxa"/>
             <w:left w:w="108" w:type="dxa"/>
+            <w:bottom w:w="0" w:type="dxa"/>
             <w:right w:w="108" w:type="dxa"/>
           </w:tblCellMar>
         </w:tblPrEx>
@@ -1418,7 +1430,9 @@
             <w:insideV w:val="single" w:color="auto" w:sz="4" w:space="0"/>
           </w:tblBorders>
           <w:tblCellMar>
+            <w:top w:w="0" w:type="dxa"/>
             <w:left w:w="108" w:type="dxa"/>
+            <w:bottom w:w="0" w:type="dxa"/>
             <w:right w:w="108" w:type="dxa"/>
           </w:tblCellMar>
         </w:tblPrEx>
@@ -1491,17 +1505,7 @@
                 <w:vertAlign w:val="baseline"/>
                 <w:lang w:val="en-US" w:eastAsia="zh-CN"/>
               </w:rPr>
-              <w:t>I have done with the construction of the main and queryElements function.</w:t>
-            </w:r>
-            <w:bookmarkStart w:id="0" w:name="_GoBack"/>
-            <w:bookmarkEnd w:id="0"/>
-            <w:r>
-              <w:rPr>
-                <w:rFonts w:hint="eastAsia"/>
-                <w:vertAlign w:val="baseline"/>
-                <w:lang w:val="en-US" w:eastAsia="zh-CN"/>
-              </w:rPr>
-              <w:t xml:space="preserve">   </w:t>
+              <w:t xml:space="preserve">I have done with the construction of the main and queryElements function.   </w:t>
             </w:r>
           </w:p>
         </w:tc>
@@ -1555,7 +1559,9 @@
             <w:insideV w:val="single" w:color="auto" w:sz="4" w:space="0"/>
           </w:tblBorders>
           <w:tblCellMar>
+            <w:top w:w="0" w:type="dxa"/>
             <w:left w:w="108" w:type="dxa"/>
+            <w:bottom w:w="0" w:type="dxa"/>
             <w:right w:w="108" w:type="dxa"/>
           </w:tblCellMar>
         </w:tblPrEx>
@@ -1595,6 +1601,16 @@
                 <w:lang w:val="en-US" w:eastAsia="zh-CN"/>
               </w:rPr>
             </w:pPr>
+            <w:r>
+              <w:rPr>
+                <w:rFonts w:hint="eastAsia"/>
+                <w:vertAlign w:val="baseline"/>
+                <w:lang w:val="en-US" w:eastAsia="zh-CN"/>
+              </w:rPr>
+              <w:t>2025/4/20</w:t>
+            </w:r>
+            <w:bookmarkStart w:id="0" w:name="_GoBack"/>
+            <w:bookmarkEnd w:id="0"/>
           </w:p>
         </w:tc>
         <w:tc>
@@ -1614,6 +1630,14 @@
                 <w:lang w:val="en-US" w:eastAsia="zh-CN"/>
               </w:rPr>
             </w:pPr>
+            <w:r>
+              <w:rPr>
+                <w:rFonts w:hint="default"/>
+                <w:vertAlign w:val="baseline"/>
+                <w:lang w:val="en-US" w:eastAsia="zh-CN"/>
+              </w:rPr>
+              <w:t>I have accomplished the simplest query function named queryByNumber.m and correlated the whole project from main.m to this function</w:t>
+            </w:r>
           </w:p>
         </w:tc>
         <w:tc>

</xml_diff>

<commit_message>
I have done displayMultipleElements.m,queryByPeriod.m, queryByatomic_mass.m and updated the queryElements.m in order to link them together.
</commit_message>
<xml_diff>
--- a/development.docx
+++ b/development.docx
@@ -1058,11 +1058,11 @@
         </w:tblCellMar>
       </w:tblPr>
       <w:tblGrid>
-        <w:gridCol w:w="1239"/>
-        <w:gridCol w:w="1555"/>
-        <w:gridCol w:w="3248"/>
+        <w:gridCol w:w="253"/>
         <w:gridCol w:w="1240"/>
-        <w:gridCol w:w="1240"/>
+        <w:gridCol w:w="6521"/>
+        <w:gridCol w:w="254"/>
+        <w:gridCol w:w="254"/>
       </w:tblGrid>
       <w:tr>
         <w:tblPrEx>
@@ -1793,8 +1793,6 @@
                 <w:lang w:val="en-US" w:eastAsia="zh-CN"/>
               </w:rPr>
             </w:pPr>
-            <w:bookmarkStart w:id="0" w:name="_GoBack"/>
-            <w:bookmarkEnd w:id="0"/>
           </w:p>
         </w:tc>
         <w:tc>
@@ -1828,7 +1826,373 @@
               <w:bidi w:val="0"/>
               <w:jc w:val="left"/>
               <w:rPr>
-                <w:rFonts w:hint="default"/>
+                <w:rFonts w:hint="eastAsia"/>
+                <w:vertAlign w:val="baseline"/>
+                <w:lang w:val="en-US" w:eastAsia="zh-CN"/>
+              </w:rPr>
+            </w:pPr>
+            <w:r>
+              <w:rPr>
+                <w:rFonts w:hint="eastAsia"/>
+                <w:vertAlign w:val="baseline"/>
+                <w:lang w:val="en-US" w:eastAsia="zh-CN"/>
+              </w:rPr>
+              <w:t xml:space="preserve">         </w:t>
+            </w:r>
+          </w:p>
+          <w:p>
+            <w:pPr>
+              <w:tabs>
+                <w:tab w:val="left" w:pos="5714"/>
+              </w:tabs>
+              <w:bidi w:val="0"/>
+              <w:jc w:val="left"/>
+              <w:rPr>
+                <w:rFonts w:hint="eastAsia"/>
+                <w:vertAlign w:val="baseline"/>
+                <w:lang w:val="en-US" w:eastAsia="zh-CN"/>
+              </w:rPr>
+            </w:pPr>
+          </w:p>
+          <w:p>
+            <w:pPr>
+              <w:tabs>
+                <w:tab w:val="left" w:pos="5714"/>
+              </w:tabs>
+              <w:bidi w:val="0"/>
+              <w:jc w:val="left"/>
+              <w:rPr>
+                <w:rFonts w:hint="eastAsia"/>
+                <w:vertAlign w:val="baseline"/>
+                <w:lang w:val="en-US" w:eastAsia="zh-CN"/>
+              </w:rPr>
+            </w:pPr>
+          </w:p>
+          <w:p>
+            <w:pPr>
+              <w:tabs>
+                <w:tab w:val="left" w:pos="5714"/>
+              </w:tabs>
+              <w:bidi w:val="0"/>
+              <w:jc w:val="left"/>
+              <w:rPr>
+                <w:rFonts w:hint="eastAsia"/>
+                <w:vertAlign w:val="baseline"/>
+                <w:lang w:val="en-US" w:eastAsia="zh-CN"/>
+              </w:rPr>
+            </w:pPr>
+            <w:r>
+              <w:rPr>
+                <w:rFonts w:hint="eastAsia"/>
+                <w:vertAlign w:val="baseline"/>
+                <w:lang w:val="en-US" w:eastAsia="zh-CN"/>
+              </w:rPr>
+              <w:t xml:space="preserve">         </w:t>
+            </w:r>
+          </w:p>
+          <w:p>
+            <w:pPr>
+              <w:tabs>
+                <w:tab w:val="left" w:pos="5714"/>
+              </w:tabs>
+              <w:bidi w:val="0"/>
+              <w:jc w:val="left"/>
+              <w:rPr>
+                <w:rFonts w:hint="default"/>
+                <w:vertAlign w:val="baseline"/>
+                <w:lang w:val="en-US" w:eastAsia="zh-CN"/>
+              </w:rPr>
+            </w:pPr>
+            <w:r>
+              <w:rPr>
+                <w:rFonts w:hint="eastAsia"/>
+                <w:vertAlign w:val="baseline"/>
+                <w:lang w:val="en-US" w:eastAsia="zh-CN"/>
+              </w:rPr>
+              <w:t xml:space="preserve">         </w:t>
+            </w:r>
+          </w:p>
+        </w:tc>
+      </w:tr>
+      <w:tr>
+        <w:tblPrEx>
+          <w:tblBorders>
+            <w:top w:val="single" w:color="auto" w:sz="4" w:space="0"/>
+            <w:left w:val="single" w:color="auto" w:sz="4" w:space="0"/>
+            <w:bottom w:val="single" w:color="auto" w:sz="4" w:space="0"/>
+            <w:right w:val="single" w:color="auto" w:sz="4" w:space="0"/>
+            <w:insideH w:val="single" w:color="auto" w:sz="4" w:space="0"/>
+            <w:insideV w:val="single" w:color="auto" w:sz="4" w:space="0"/>
+          </w:tblBorders>
+          <w:tblCellMar>
+            <w:top w:w="0" w:type="dxa"/>
+            <w:left w:w="108" w:type="dxa"/>
+            <w:bottom w:w="0" w:type="dxa"/>
+            <w:right w:w="108" w:type="dxa"/>
+          </w:tblCellMar>
+        </w:tblPrEx>
+        <w:tc>
+          <w:tcPr>
+            <w:tcW w:w="1704" w:type="dxa"/>
+          </w:tcPr>
+          <w:p>
+            <w:pPr>
+              <w:tabs>
+                <w:tab w:val="left" w:pos="5714"/>
+              </w:tabs>
+              <w:bidi w:val="0"/>
+              <w:jc w:val="left"/>
+              <w:rPr>
+                <w:rFonts w:hint="default"/>
+                <w:vertAlign w:val="baseline"/>
+                <w:lang w:val="en-US" w:eastAsia="zh-CN"/>
+              </w:rPr>
+            </w:pPr>
+          </w:p>
+        </w:tc>
+        <w:tc>
+          <w:tcPr>
+            <w:tcW w:w="1704" w:type="dxa"/>
+          </w:tcPr>
+          <w:p>
+            <w:pPr>
+              <w:tabs>
+                <w:tab w:val="left" w:pos="5714"/>
+              </w:tabs>
+              <w:bidi w:val="0"/>
+              <w:jc w:val="left"/>
+              <w:rPr>
+                <w:rFonts w:hint="default"/>
+                <w:vertAlign w:val="baseline"/>
+                <w:lang w:val="en-US" w:eastAsia="zh-CN"/>
+              </w:rPr>
+            </w:pPr>
+            <w:r>
+              <w:rPr>
+                <w:rFonts w:hint="eastAsia"/>
+                <w:vertAlign w:val="baseline"/>
+                <w:lang w:val="en-US" w:eastAsia="zh-CN"/>
+              </w:rPr>
+              <w:t>2025/4/23</w:t>
+            </w:r>
+          </w:p>
+        </w:tc>
+        <w:tc>
+          <w:tcPr>
+            <w:tcW w:w="1704" w:type="dxa"/>
+          </w:tcPr>
+          <w:p>
+            <w:pPr>
+              <w:numPr>
+                <w:ilvl w:val="0"/>
+                <w:numId w:val="4"/>
+              </w:numPr>
+              <w:tabs>
+                <w:tab w:val="left" w:pos="5714"/>
+              </w:tabs>
+              <w:bidi w:val="0"/>
+              <w:ind w:left="0" w:leftChars="0" w:firstLine="0" w:firstLineChars="0"/>
+              <w:jc w:val="right"/>
+              <w:rPr>
+                <w:rFonts w:hint="default"/>
+                <w:vertAlign w:val="baseline"/>
+                <w:lang w:val="en-US" w:eastAsia="zh-CN"/>
+              </w:rPr>
+            </w:pPr>
+            <w:r>
+              <w:rPr>
+                <w:rFonts w:hint="default"/>
+                <w:vertAlign w:val="baseline"/>
+                <w:lang w:val="en-US" w:eastAsia="zh-CN"/>
+              </w:rPr>
+              <w:t>display single element</w:t>
+            </w:r>
+          </w:p>
+        </w:tc>
+        <w:tc>
+          <w:tcPr>
+            <w:tcW w:w="1705" w:type="dxa"/>
+          </w:tcPr>
+          <w:p>
+            <w:pPr>
+              <w:tabs>
+                <w:tab w:val="left" w:pos="5714"/>
+              </w:tabs>
+              <w:bidi w:val="0"/>
+              <w:jc w:val="left"/>
+              <w:rPr>
+                <w:rFonts w:hint="default"/>
+                <w:vertAlign w:val="baseline"/>
+                <w:lang w:val="en-US" w:eastAsia="zh-CN"/>
+              </w:rPr>
+            </w:pPr>
+          </w:p>
+        </w:tc>
+        <w:tc>
+          <w:tcPr>
+            <w:tcW w:w="1705" w:type="dxa"/>
+          </w:tcPr>
+          <w:p>
+            <w:pPr>
+              <w:tabs>
+                <w:tab w:val="left" w:pos="5714"/>
+              </w:tabs>
+              <w:bidi w:val="0"/>
+              <w:jc w:val="left"/>
+              <w:rPr>
+                <w:rFonts w:hint="eastAsia"/>
+                <w:vertAlign w:val="baseline"/>
+                <w:lang w:val="en-US" w:eastAsia="zh-CN"/>
+              </w:rPr>
+            </w:pPr>
+          </w:p>
+        </w:tc>
+      </w:tr>
+      <w:tr>
+        <w:tblPrEx>
+          <w:tblBorders>
+            <w:top w:val="single" w:color="auto" w:sz="4" w:space="0"/>
+            <w:left w:val="single" w:color="auto" w:sz="4" w:space="0"/>
+            <w:bottom w:val="single" w:color="auto" w:sz="4" w:space="0"/>
+            <w:right w:val="single" w:color="auto" w:sz="4" w:space="0"/>
+            <w:insideH w:val="single" w:color="auto" w:sz="4" w:space="0"/>
+            <w:insideV w:val="single" w:color="auto" w:sz="4" w:space="0"/>
+          </w:tblBorders>
+          <w:tblCellMar>
+            <w:top w:w="0" w:type="dxa"/>
+            <w:left w:w="108" w:type="dxa"/>
+            <w:bottom w:w="0" w:type="dxa"/>
+            <w:right w:w="108" w:type="dxa"/>
+          </w:tblCellMar>
+        </w:tblPrEx>
+        <w:tc>
+          <w:tcPr>
+            <w:tcW w:w="1704" w:type="dxa"/>
+          </w:tcPr>
+          <w:p>
+            <w:pPr>
+              <w:tabs>
+                <w:tab w:val="left" w:pos="5714"/>
+              </w:tabs>
+              <w:bidi w:val="0"/>
+              <w:jc w:val="left"/>
+              <w:rPr>
+                <w:rFonts w:hint="default"/>
+                <w:vertAlign w:val="baseline"/>
+                <w:lang w:val="en-US" w:eastAsia="zh-CN"/>
+              </w:rPr>
+            </w:pPr>
+          </w:p>
+        </w:tc>
+        <w:tc>
+          <w:tcPr>
+            <w:tcW w:w="1704" w:type="dxa"/>
+          </w:tcPr>
+          <w:p>
+            <w:pPr>
+              <w:tabs>
+                <w:tab w:val="left" w:pos="5714"/>
+              </w:tabs>
+              <w:bidi w:val="0"/>
+              <w:jc w:val="left"/>
+              <w:rPr>
+                <w:rFonts w:hint="default"/>
+                <w:vertAlign w:val="baseline"/>
+                <w:lang w:val="en-US" w:eastAsia="zh-CN"/>
+              </w:rPr>
+            </w:pPr>
+            <w:r>
+              <w:rPr>
+                <w:rFonts w:hint="default"/>
+                <w:vertAlign w:val="baseline"/>
+                <w:lang w:val="en-US" w:eastAsia="zh-CN"/>
+              </w:rPr>
+              <w:t>2025/4/24</w:t>
+            </w:r>
+          </w:p>
+        </w:tc>
+        <w:tc>
+          <w:tcPr>
+            <w:tcW w:w="1704" w:type="dxa"/>
+          </w:tcPr>
+          <w:p>
+            <w:pPr>
+              <w:numPr>
+                <w:numId w:val="0"/>
+              </w:numPr>
+              <w:tabs>
+                <w:tab w:val="left" w:pos="1274"/>
+                <w:tab w:val="left" w:pos="5714"/>
+                <w:tab w:val="right" w:pos="6425"/>
+              </w:tabs>
+              <w:bidi w:val="0"/>
+              <w:ind w:leftChars="0"/>
+              <w:jc w:val="left"/>
+              <w:rPr>
+                <w:rFonts w:hint="default"/>
+                <w:vertAlign w:val="baseline"/>
+                <w:lang w:val="en-US" w:eastAsia="zh-CN"/>
+              </w:rPr>
+            </w:pPr>
+            <w:r>
+              <w:rPr>
+                <w:rFonts w:hint="default"/>
+                <w:vertAlign w:val="baseline"/>
+                <w:lang w:val="en-US" w:eastAsia="zh-CN"/>
+              </w:rPr>
+              <w:t>I have done displayMultipleElements.m,queryByPeriod.m, queryByatomic_mass.m and updated the queryElements.m in order to link them together.</w:t>
+            </w:r>
+            <w:r>
+              <w:rPr>
+                <w:rFonts w:hint="default"/>
+                <w:vertAlign w:val="baseline"/>
+                <w:lang w:val="en-US" w:eastAsia="zh-CN"/>
+              </w:rPr>
+              <w:tab/>
+              <w:t/>
+            </w:r>
+            <w:r>
+              <w:rPr>
+                <w:rFonts w:hint="default"/>
+                <w:vertAlign w:val="baseline"/>
+                <w:lang w:val="en-US" w:eastAsia="zh-CN"/>
+              </w:rPr>
+              <w:tab/>
+            </w:r>
+          </w:p>
+        </w:tc>
+        <w:tc>
+          <w:tcPr>
+            <w:tcW w:w="1705" w:type="dxa"/>
+          </w:tcPr>
+          <w:p>
+            <w:pPr>
+              <w:tabs>
+                <w:tab w:val="left" w:pos="5714"/>
+              </w:tabs>
+              <w:bidi w:val="0"/>
+              <w:jc w:val="left"/>
+              <w:rPr>
+                <w:rFonts w:hint="default"/>
+                <w:vertAlign w:val="baseline"/>
+                <w:lang w:val="en-US" w:eastAsia="zh-CN"/>
+              </w:rPr>
+            </w:pPr>
+          </w:p>
+        </w:tc>
+        <w:tc>
+          <w:tcPr>
+            <w:tcW w:w="1705" w:type="dxa"/>
+          </w:tcPr>
+          <w:p>
+            <w:pPr>
+              <w:tabs>
+                <w:tab w:val="left" w:pos="5714"/>
+              </w:tabs>
+              <w:bidi w:val="0"/>
+              <w:jc w:val="left"/>
+              <w:rPr>
+                <w:rFonts w:hint="eastAsia"/>
                 <w:vertAlign w:val="baseline"/>
                 <w:lang w:val="en-US" w:eastAsia="zh-CN"/>
               </w:rPr>
@@ -1849,6 +2213,8 @@
           <w:lang w:val="en-US" w:eastAsia="zh-CN"/>
         </w:rPr>
       </w:pPr>
+      <w:bookmarkStart w:id="0" w:name="_GoBack"/>
+      <w:bookmarkEnd w:id="0"/>
       <w:r>
         <w:rPr>
           <w:rFonts w:hint="default"/>
@@ -2006,6 +2372,23 @@
     </w:lvl>
   </w:abstractNum>
   <w:abstractNum w:abstractNumId="1">
+    <w:nsid w:val="B991A304"/>
+    <w:multiLevelType w:val="singleLevel"/>
+    <w:tmpl w:val="B991A304"/>
+    <w:lvl w:ilvl="0" w:tentative="0">
+      <w:start w:val="1"/>
+      <w:numFmt w:val="decimal"/>
+      <w:lvlText w:val="%1."/>
+      <w:lvlJc w:val="left"/>
+      <w:pPr>
+        <w:ind w:left="425" w:hanging="425"/>
+      </w:pPr>
+      <w:rPr>
+        <w:rFonts w:hint="default"/>
+      </w:rPr>
+    </w:lvl>
+  </w:abstractNum>
+  <w:abstractNum w:abstractNumId="2">
     <w:nsid w:val="E952FC89"/>
     <w:multiLevelType w:val="singleLevel"/>
     <w:tmpl w:val="E952FC89"/>
@@ -2021,7 +2404,7 @@
       </w:pPr>
     </w:lvl>
   </w:abstractNum>
-  <w:abstractNum w:abstractNumId="2">
+  <w:abstractNum w:abstractNumId="3">
     <w:nsid w:val="F3CC7582"/>
     <w:multiLevelType w:val="singleLevel"/>
     <w:tmpl w:val="F3CC7582"/>
@@ -2034,13 +2417,16 @@
     </w:lvl>
   </w:abstractNum>
   <w:num w:numId="1">
-    <w:abstractNumId w:val="1"/>
+    <w:abstractNumId w:val="2"/>
   </w:num>
   <w:num w:numId="2">
-    <w:abstractNumId w:val="2"/>
+    <w:abstractNumId w:val="3"/>
   </w:num>
   <w:num w:numId="3">
     <w:abstractNumId w:val="0"/>
+  </w:num>
+  <w:num w:numId="4">
+    <w:abstractNumId w:val="1"/>
   </w:num>
 </w:numbering>
 </file>
@@ -2121,7 +2507,7 @@
     <w:lsdException w:qFormat="1" w:unhideWhenUsed="0" w:uiPriority="0" w:semiHidden="0" w:name="Title"/>
     <w:lsdException w:unhideWhenUsed="0" w:uiPriority="0" w:semiHidden="0" w:name="Closing"/>
     <w:lsdException w:unhideWhenUsed="0" w:uiPriority="0" w:semiHidden="0" w:name="Signature"/>
-    <w:lsdException w:unhideWhenUsed="0" w:uiPriority="0" w:name="Default Paragraph Font"/>
+    <w:lsdException w:qFormat="1" w:unhideWhenUsed="0" w:uiPriority="0" w:name="Default Paragraph Font"/>
     <w:lsdException w:unhideWhenUsed="0" w:uiPriority="0" w:semiHidden="0" w:name="Body Text"/>
     <w:lsdException w:unhideWhenUsed="0" w:uiPriority="0" w:semiHidden="0" w:name="Body Text Indent"/>
     <w:lsdException w:unhideWhenUsed="0" w:uiPriority="0" w:semiHidden="0" w:name="List Continue"/>
@@ -2324,6 +2710,7 @@
   <w:style w:type="character" w:default="1" w:styleId="4">
     <w:name w:val="Default Paragraph Font"/>
     <w:semiHidden/>
+    <w:qFormat/>
     <w:uiPriority w:val="0"/>
   </w:style>
   <w:style w:type="table" w:default="1" w:styleId="2">

</xml_diff>

<commit_message>
I have improved the project code,corrected some errors and updated the project development doc.
</commit_message>
<xml_diff>
--- a/development.docx
+++ b/development.docx
@@ -4,6 +4,13 @@
   <w:body>
     <w:p>
       <w:pPr>
+        <w:pStyle w:val="2"/>
+        <w:numPr>
+          <w:numId w:val="0"/>
+        </w:numPr>
+        <w:bidi w:val="0"/>
+        <w:ind w:leftChars="0" w:firstLine="420" w:firstLineChars="0"/>
+        <w:jc w:val="center"/>
         <w:rPr>
           <w:rFonts w:hint="default"/>
           <w:lang w:val="en-US"/>
@@ -11,17 +18,41 @@
       </w:pPr>
       <w:r>
         <w:rPr>
+          <w:rFonts w:hint="eastAsia"/>
+          <w:lang w:val="en-US" w:eastAsia="zh-CN"/>
+        </w:rPr>
+        <w:t>P</w:t>
+      </w:r>
+      <w:r>
+        <w:rPr>
           <w:rFonts w:hint="default"/>
           <w:lang w:val="en-US"/>
         </w:rPr>
-        <w:t>This is my project development document.</w:t>
+        <w:t>roject development document.</w:t>
+      </w:r>
+    </w:p>
+    <w:p>
+      <w:pPr>
+        <w:pStyle w:val="2"/>
+        <w:bidi w:val="0"/>
+        <w:ind w:left="432" w:leftChars="0" w:hanging="432" w:firstLineChars="0"/>
+        <w:rPr>
+          <w:rFonts w:hint="default"/>
+          <w:lang w:val="en-US"/>
+        </w:rPr>
+      </w:pPr>
+      <w:r>
+        <w:rPr>
+          <w:rFonts w:hint="eastAsia"/>
+          <w:lang w:val="en-US" w:eastAsia="zh-CN"/>
+        </w:rPr>
+        <w:t>Project Goal</w:t>
       </w:r>
     </w:p>
     <w:p>
       <w:pPr>
         <w:numPr>
-          <w:ilvl w:val="0"/>
-          <w:numId w:val="1"/>
+          <w:numId w:val="0"/>
         </w:numPr>
         <w:rPr>
           <w:rFonts w:hint="default"/>
@@ -30,29 +61,63 @@
       </w:pPr>
       <w:r>
         <w:rPr>
+          <w:rFonts w:hint="eastAsia"/>
+          <w:lang w:val="en-US" w:eastAsia="zh-CN"/>
+        </w:rPr>
+        <w:t xml:space="preserve">I need to </w:t>
+      </w:r>
+      <w:r>
+        <w:rPr>
           <w:rFonts w:hint="default"/>
           <w:lang w:val="en-US"/>
         </w:rPr>
-        <w:t>Goal:creat a project relevent to the periodic table,in order to provide a convenient place for the user to do element searching</w:t>
-      </w:r>
-    </w:p>
-    <w:p>
-      <w:pPr>
-        <w:numPr>
-          <w:ilvl w:val="0"/>
-          <w:numId w:val="1"/>
-        </w:numPr>
+        <w:t>creat</w:t>
+      </w:r>
+      <w:r>
+        <w:rPr>
+          <w:rFonts w:hint="eastAsia"/>
+          <w:lang w:val="en-US" w:eastAsia="zh-CN"/>
+        </w:rPr>
+        <w:t>e</w:t>
+      </w:r>
+      <w:r>
         <w:rPr>
           <w:rFonts w:hint="default"/>
           <w:lang w:val="en-US"/>
         </w:rPr>
-      </w:pPr>
+        <w:t xml:space="preserve"> a project </w:t>
+      </w:r>
+      <w:r>
+        <w:rPr>
+          <w:rFonts w:hint="eastAsia"/>
+          <w:lang w:val="en-US" w:eastAsia="zh-CN"/>
+        </w:rPr>
+        <w:t>of</w:t>
+      </w:r>
       <w:r>
         <w:rPr>
           <w:rFonts w:hint="default"/>
           <w:lang w:val="en-US"/>
         </w:rPr>
-        <w:t>Planing:</w:t>
+        <w:t xml:space="preserve"> the periodic table,in order to provide a convenient place for the user to do element searching</w:t>
+      </w:r>
+    </w:p>
+    <w:p>
+      <w:pPr>
+        <w:pStyle w:val="2"/>
+        <w:bidi w:val="0"/>
+        <w:ind w:left="432" w:leftChars="0" w:hanging="432" w:firstLineChars="0"/>
+        <w:rPr>
+          <w:rFonts w:hint="default"/>
+          <w:lang w:val="en-US" w:eastAsia="zh-CN"/>
+        </w:rPr>
+      </w:pPr>
+      <w:r>
+        <w:rPr>
+          <w:rFonts w:hint="default"/>
+          <w:lang w:val="en-US" w:eastAsia="zh-CN"/>
+        </w:rPr>
+        <w:t>Planing</w:t>
       </w:r>
     </w:p>
     <w:p>
@@ -71,7 +136,7 @@
           <w:rFonts w:hint="default"/>
           <w:lang w:val="en-US"/>
         </w:rPr>
-        <w:t xml:space="preserve">    (1) How much time have I got?</w:t>
+        <w:t>(1) How much time have I got?</w:t>
       </w:r>
     </w:p>
     <w:p>
@@ -196,20 +261,18 @@
     </w:p>
     <w:p>
       <w:pPr>
-        <w:numPr>
-          <w:ilvl w:val="0"/>
-          <w:numId w:val="1"/>
-        </w:numPr>
-        <w:ind w:left="0" w:leftChars="0" w:firstLine="0" w:firstLineChars="0"/>
-        <w:rPr>
-          <w:rFonts w:hint="default"/>
-          <w:lang w:val="en-US"/>
-        </w:rPr>
-      </w:pPr>
-      <w:r>
-        <w:rPr>
-          <w:rFonts w:hint="default"/>
-          <w:lang w:val="en-US"/>
+        <w:pStyle w:val="2"/>
+        <w:bidi w:val="0"/>
+        <w:ind w:left="432" w:leftChars="0" w:hanging="432" w:firstLineChars="0"/>
+        <w:rPr>
+          <w:rFonts w:hint="default"/>
+          <w:lang w:val="en-US" w:eastAsia="zh-CN"/>
+        </w:rPr>
+      </w:pPr>
+      <w:r>
+        <w:rPr>
+          <w:rFonts w:hint="default"/>
+          <w:lang w:val="en-US" w:eastAsia="zh-CN"/>
         </w:rPr>
         <w:t>Requirements Analysis:</w:t>
       </w:r>
@@ -555,6 +618,1587 @@
     </w:p>
     <w:p>
       <w:pPr>
+        <w:pStyle w:val="2"/>
+        <w:bidi w:val="0"/>
+        <w:rPr>
+          <w:rFonts w:hint="default"/>
+          <w:lang w:val="en-US" w:eastAsia="zh-CN"/>
+        </w:rPr>
+      </w:pPr>
+      <w:r>
+        <w:rPr>
+          <w:rFonts w:hint="eastAsia"/>
+          <w:lang w:val="en-US" w:eastAsia="zh-CN"/>
+        </w:rPr>
+        <w:t xml:space="preserve">designing </w:t>
+      </w:r>
+    </w:p>
+    <w:p>
+      <w:pPr>
+        <w:pStyle w:val="3"/>
+        <w:bidi w:val="0"/>
+        <w:ind w:left="575" w:leftChars="0" w:hanging="575" w:firstLineChars="0"/>
+        <w:rPr>
+          <w:rFonts w:hint="default"/>
+          <w:lang w:val="en-US" w:eastAsia="zh-CN"/>
+        </w:rPr>
+      </w:pPr>
+      <w:r>
+        <w:rPr>
+          <w:rFonts w:hint="eastAsia"/>
+          <w:lang w:val="en-US" w:eastAsia="zh-CN"/>
+        </w:rPr>
+        <w:t>design scheme for project</w:t>
+      </w:r>
+    </w:p>
+    <w:tbl>
+      <w:tblPr>
+        <w:tblStyle w:val="12"/>
+        <w:tblW w:w="0" w:type="auto"/>
+        <w:tblInd w:w="0" w:type="dxa"/>
+        <w:tblBorders>
+          <w:top w:val="single" w:color="auto" w:sz="4" w:space="0"/>
+          <w:left w:val="single" w:color="auto" w:sz="4" w:space="0"/>
+          <w:bottom w:val="single" w:color="auto" w:sz="4" w:space="0"/>
+          <w:right w:val="single" w:color="auto" w:sz="4" w:space="0"/>
+          <w:insideH w:val="single" w:color="auto" w:sz="4" w:space="0"/>
+          <w:insideV w:val="single" w:color="auto" w:sz="4" w:space="0"/>
+        </w:tblBorders>
+        <w:tblLayout w:type="autofit"/>
+        <w:tblCellMar>
+          <w:top w:w="0" w:type="dxa"/>
+          <w:left w:w="108" w:type="dxa"/>
+          <w:bottom w:w="0" w:type="dxa"/>
+          <w:right w:w="108" w:type="dxa"/>
+        </w:tblCellMar>
+      </w:tblPr>
+      <w:tblGrid>
+        <w:gridCol w:w="1319"/>
+        <w:gridCol w:w="2722"/>
+        <w:gridCol w:w="2357"/>
+        <w:gridCol w:w="2124"/>
+      </w:tblGrid>
+      <w:tr>
+        <w:tblPrEx>
+          <w:tblBorders>
+            <w:top w:val="single" w:color="auto" w:sz="4" w:space="0"/>
+            <w:left w:val="single" w:color="auto" w:sz="4" w:space="0"/>
+            <w:bottom w:val="single" w:color="auto" w:sz="4" w:space="0"/>
+            <w:right w:val="single" w:color="auto" w:sz="4" w:space="0"/>
+            <w:insideH w:val="single" w:color="auto" w:sz="4" w:space="0"/>
+            <w:insideV w:val="single" w:color="auto" w:sz="4" w:space="0"/>
+          </w:tblBorders>
+          <w:tblCellMar>
+            <w:top w:w="0" w:type="dxa"/>
+            <w:left w:w="108" w:type="dxa"/>
+            <w:bottom w:w="0" w:type="dxa"/>
+            <w:right w:w="108" w:type="dxa"/>
+          </w:tblCellMar>
+        </w:tblPrEx>
+        <w:tc>
+          <w:tcPr>
+            <w:tcW w:w="1322" w:type="dxa"/>
+          </w:tcPr>
+          <w:p>
+            <w:pPr>
+              <w:rPr>
+                <w:rFonts w:hint="default" w:eastAsiaTheme="minorEastAsia"/>
+                <w:vertAlign w:val="baseline"/>
+                <w:lang w:val="en-US" w:eastAsia="zh-CN"/>
+              </w:rPr>
+            </w:pPr>
+            <w:r>
+              <w:rPr>
+                <w:rFonts w:hint="eastAsia"/>
+                <w:vertAlign w:val="baseline"/>
+                <w:lang w:val="en-US" w:eastAsia="zh-CN"/>
+              </w:rPr>
+              <w:t>Project</w:t>
+            </w:r>
+          </w:p>
+        </w:tc>
+        <w:tc>
+          <w:tcPr>
+            <w:tcW w:w="2727" w:type="dxa"/>
+          </w:tcPr>
+          <w:p>
+            <w:pPr>
+              <w:rPr>
+                <w:rFonts w:hint="default" w:eastAsiaTheme="minorEastAsia"/>
+                <w:vertAlign w:val="baseline"/>
+                <w:lang w:val="en-US" w:eastAsia="zh-CN"/>
+              </w:rPr>
+            </w:pPr>
+            <w:r>
+              <w:rPr>
+                <w:rFonts w:hint="eastAsia"/>
+                <w:vertAlign w:val="baseline"/>
+                <w:lang w:val="en-US" w:eastAsia="zh-CN"/>
+              </w:rPr>
+              <w:t>Module</w:t>
+            </w:r>
+          </w:p>
+        </w:tc>
+        <w:tc>
+          <w:tcPr>
+            <w:tcW w:w="2342" w:type="dxa"/>
+          </w:tcPr>
+          <w:p>
+            <w:pPr>
+              <w:rPr>
+                <w:rFonts w:hint="default" w:eastAsiaTheme="minorEastAsia"/>
+                <w:vertAlign w:val="baseline"/>
+                <w:lang w:val="en-US" w:eastAsia="zh-CN"/>
+              </w:rPr>
+            </w:pPr>
+            <w:r>
+              <w:rPr>
+                <w:rFonts w:hint="eastAsia"/>
+                <w:vertAlign w:val="baseline"/>
+                <w:lang w:val="en-US" w:eastAsia="zh-CN"/>
+              </w:rPr>
+              <w:t>Sub-module</w:t>
+            </w:r>
+          </w:p>
+        </w:tc>
+        <w:tc>
+          <w:tcPr>
+            <w:tcW w:w="2131" w:type="dxa"/>
+          </w:tcPr>
+          <w:p>
+            <w:pPr>
+              <w:rPr>
+                <w:rFonts w:hint="default" w:eastAsiaTheme="minorEastAsia"/>
+                <w:vertAlign w:val="baseline"/>
+                <w:lang w:val="en-US" w:eastAsia="zh-CN"/>
+              </w:rPr>
+            </w:pPr>
+            <w:r>
+              <w:rPr>
+                <w:rFonts w:hint="eastAsia"/>
+                <w:vertAlign w:val="baseline"/>
+                <w:lang w:val="en-US" w:eastAsia="zh-CN"/>
+              </w:rPr>
+              <w:t>comments</w:t>
+            </w:r>
+          </w:p>
+        </w:tc>
+      </w:tr>
+      <w:tr>
+        <w:tblPrEx>
+          <w:tblBorders>
+            <w:top w:val="single" w:color="auto" w:sz="4" w:space="0"/>
+            <w:left w:val="single" w:color="auto" w:sz="4" w:space="0"/>
+            <w:bottom w:val="single" w:color="auto" w:sz="4" w:space="0"/>
+            <w:right w:val="single" w:color="auto" w:sz="4" w:space="0"/>
+            <w:insideH w:val="single" w:color="auto" w:sz="4" w:space="0"/>
+            <w:insideV w:val="single" w:color="auto" w:sz="4" w:space="0"/>
+          </w:tblBorders>
+          <w:tblCellMar>
+            <w:top w:w="0" w:type="dxa"/>
+            <w:left w:w="108" w:type="dxa"/>
+            <w:bottom w:w="0" w:type="dxa"/>
+            <w:right w:w="108" w:type="dxa"/>
+          </w:tblCellMar>
+        </w:tblPrEx>
+        <w:trPr>
+          <w:trHeight w:val="359" w:hRule="atLeast"/>
+        </w:trPr>
+        <w:tc>
+          <w:tcPr>
+            <w:tcW w:w="1322" w:type="dxa"/>
+            <w:vMerge w:val="restart"/>
+          </w:tcPr>
+          <w:p>
+            <w:pPr>
+              <w:rPr>
+                <w:rFonts w:hint="eastAsia"/>
+                <w:vertAlign w:val="baseline"/>
+                <w:lang w:val="en-US" w:eastAsia="zh-CN"/>
+              </w:rPr>
+            </w:pPr>
+            <w:r>
+              <w:rPr>
+                <w:rFonts w:hint="eastAsia"/>
+                <w:vertAlign w:val="baseline"/>
+                <w:lang w:val="en-US" w:eastAsia="zh-CN"/>
+              </w:rPr>
+              <w:t>Function</w:t>
+            </w:r>
+          </w:p>
+          <w:p>
+            <w:pPr>
+              <w:rPr>
+                <w:rFonts w:hint="default"/>
+                <w:vertAlign w:val="baseline"/>
+                <w:lang w:val="en-US" w:eastAsia="zh-CN"/>
+              </w:rPr>
+            </w:pPr>
+            <w:r>
+              <w:rPr>
+                <w:rFonts w:hint="eastAsia"/>
+                <w:vertAlign w:val="baseline"/>
+                <w:lang w:val="en-US" w:eastAsia="zh-CN"/>
+              </w:rPr>
+              <w:t>Main()</w:t>
+            </w:r>
+          </w:p>
+          <w:p>
+            <w:pPr>
+              <w:rPr>
+                <w:rFonts w:hint="default"/>
+                <w:vertAlign w:val="baseline"/>
+                <w:lang w:val="en-US" w:eastAsia="zh-CN"/>
+              </w:rPr>
+            </w:pPr>
+          </w:p>
+        </w:tc>
+        <w:tc>
+          <w:tcPr>
+            <w:tcW w:w="2727" w:type="dxa"/>
+            <w:vMerge w:val="restart"/>
+          </w:tcPr>
+          <w:p>
+            <w:pPr>
+              <w:rPr>
+                <w:rFonts w:hint="eastAsia"/>
+                <w:vertAlign w:val="baseline"/>
+                <w:lang w:val="en-US" w:eastAsia="zh-CN"/>
+              </w:rPr>
+            </w:pPr>
+            <w:r>
+              <w:rPr>
+                <w:rFonts w:hint="eastAsia"/>
+                <w:vertAlign w:val="baseline"/>
+                <w:lang w:val="en-US" w:eastAsia="zh-CN"/>
+              </w:rPr>
+              <w:t xml:space="preserve">Module id   : Module_0: </w:t>
+            </w:r>
+          </w:p>
+          <w:p>
+            <w:pPr>
+              <w:rPr>
+                <w:rFonts w:hint="eastAsia"/>
+                <w:vertAlign w:val="baseline"/>
+                <w:lang w:val="en-US" w:eastAsia="zh-CN"/>
+              </w:rPr>
+            </w:pPr>
+            <w:r>
+              <w:rPr>
+                <w:rFonts w:hint="eastAsia"/>
+                <w:vertAlign w:val="baseline"/>
+                <w:lang w:val="en-US" w:eastAsia="zh-CN"/>
+              </w:rPr>
+              <w:t>Module name : loadElement</w:t>
+            </w:r>
+          </w:p>
+          <w:p>
+            <w:pPr>
+              <w:rPr>
+                <w:rFonts w:hint="eastAsia"/>
+                <w:vertAlign w:val="baseline"/>
+                <w:lang w:val="en-US" w:eastAsia="zh-CN"/>
+              </w:rPr>
+            </w:pPr>
+            <w:r>
+              <w:rPr>
+                <w:rFonts w:hint="eastAsia"/>
+                <w:vertAlign w:val="baseline"/>
+                <w:lang w:val="en-US" w:eastAsia="zh-CN"/>
+              </w:rPr>
+              <w:t xml:space="preserve">Description: </w:t>
+            </w:r>
+          </w:p>
+          <w:p>
+            <w:pPr>
+              <w:rPr>
+                <w:rFonts w:hint="default"/>
+                <w:vertAlign w:val="baseline"/>
+                <w:lang w:val="en-US" w:eastAsia="zh-CN"/>
+              </w:rPr>
+            </w:pPr>
+            <w:r>
+              <w:rPr>
+                <w:rFonts w:hint="eastAsia"/>
+                <w:vertAlign w:val="baseline"/>
+                <w:lang w:val="en-US" w:eastAsia="zh-CN"/>
+              </w:rPr>
+              <w:t>prepare datasets of  Periodic Table.</w:t>
+            </w:r>
+          </w:p>
+          <w:p>
+            <w:pPr>
+              <w:rPr>
+                <w:rFonts w:hint="eastAsia"/>
+                <w:vertAlign w:val="baseline"/>
+                <w:lang w:val="en-US" w:eastAsia="zh-CN"/>
+              </w:rPr>
+            </w:pPr>
+          </w:p>
+          <w:p>
+            <w:pPr>
+              <w:rPr>
+                <w:rFonts w:hint="default"/>
+                <w:vertAlign w:val="baseline"/>
+                <w:lang w:val="en-US" w:eastAsia="zh-CN"/>
+              </w:rPr>
+            </w:pPr>
+            <w:r>
+              <w:rPr>
+                <w:rFonts w:hint="eastAsia"/>
+                <w:vertAlign w:val="baseline"/>
+                <w:lang w:val="en-US" w:eastAsia="zh-CN"/>
+              </w:rPr>
+              <w:t>Function loadElement();</w:t>
+            </w:r>
+          </w:p>
+        </w:tc>
+        <w:tc>
+          <w:tcPr>
+            <w:tcW w:w="2342" w:type="dxa"/>
+          </w:tcPr>
+          <w:p>
+            <w:pPr>
+              <w:rPr>
+                <w:rFonts w:hint="default"/>
+                <w:vertAlign w:val="baseline"/>
+                <w:lang w:val="en-US" w:eastAsia="zh-CN"/>
+              </w:rPr>
+            </w:pPr>
+            <w:r>
+              <w:rPr>
+                <w:rFonts w:hint="eastAsia"/>
+                <w:vertAlign w:val="baseline"/>
+                <w:lang w:val="en-US" w:eastAsia="zh-CN"/>
+              </w:rPr>
+              <w:t>Module_0_1</w:t>
+            </w:r>
+          </w:p>
+          <w:p>
+            <w:pPr>
+              <w:rPr>
+                <w:rFonts w:hint="default"/>
+                <w:vertAlign w:val="baseline"/>
+                <w:lang w:val="en-US" w:eastAsia="zh-CN"/>
+              </w:rPr>
+            </w:pPr>
+            <w:r>
+              <w:rPr>
+                <w:rFonts w:hint="eastAsia"/>
+                <w:vertAlign w:val="baseline"/>
+                <w:lang w:val="en-US" w:eastAsia="zh-CN"/>
+              </w:rPr>
+              <w:t>loadRawData();</w:t>
+            </w:r>
+          </w:p>
+        </w:tc>
+        <w:tc>
+          <w:tcPr>
+            <w:tcW w:w="2131" w:type="dxa"/>
+          </w:tcPr>
+          <w:p>
+            <w:pPr>
+              <w:rPr>
+                <w:rFonts w:hint="default"/>
+                <w:vertAlign w:val="baseline"/>
+                <w:lang w:val="en-US" w:eastAsia="zh-CN"/>
+              </w:rPr>
+            </w:pPr>
+            <w:r>
+              <w:rPr>
+                <w:rFonts w:hint="eastAsia"/>
+                <w:vertAlign w:val="baseline"/>
+                <w:lang w:val="en-US" w:eastAsia="zh-CN"/>
+              </w:rPr>
+              <w:t>加载原始数据；</w:t>
+            </w:r>
+          </w:p>
+        </w:tc>
+      </w:tr>
+      <w:tr>
+        <w:tblPrEx>
+          <w:tblBorders>
+            <w:top w:val="single" w:color="auto" w:sz="4" w:space="0"/>
+            <w:left w:val="single" w:color="auto" w:sz="4" w:space="0"/>
+            <w:bottom w:val="single" w:color="auto" w:sz="4" w:space="0"/>
+            <w:right w:val="single" w:color="auto" w:sz="4" w:space="0"/>
+            <w:insideH w:val="single" w:color="auto" w:sz="4" w:space="0"/>
+            <w:insideV w:val="single" w:color="auto" w:sz="4" w:space="0"/>
+          </w:tblBorders>
+          <w:tblCellMar>
+            <w:top w:w="0" w:type="dxa"/>
+            <w:left w:w="108" w:type="dxa"/>
+            <w:bottom w:w="0" w:type="dxa"/>
+            <w:right w:w="108" w:type="dxa"/>
+          </w:tblCellMar>
+        </w:tblPrEx>
+        <w:trPr>
+          <w:trHeight w:val="587" w:hRule="atLeast"/>
+        </w:trPr>
+        <w:tc>
+          <w:tcPr>
+            <w:tcW w:w="1322" w:type="dxa"/>
+            <w:vMerge w:val="continue"/>
+          </w:tcPr>
+          <w:p>
+            <w:pPr>
+              <w:rPr>
+                <w:rFonts w:hint="eastAsia"/>
+                <w:vertAlign w:val="baseline"/>
+                <w:lang w:val="en-US" w:eastAsia="zh-CN"/>
+              </w:rPr>
+            </w:pPr>
+          </w:p>
+        </w:tc>
+        <w:tc>
+          <w:tcPr>
+            <w:tcW w:w="2727" w:type="dxa"/>
+            <w:vMerge w:val="continue"/>
+          </w:tcPr>
+          <w:p>
+            <w:pPr>
+              <w:rPr>
+                <w:rFonts w:hint="eastAsia"/>
+                <w:vertAlign w:val="baseline"/>
+                <w:lang w:val="en-US" w:eastAsia="zh-CN"/>
+              </w:rPr>
+            </w:pPr>
+          </w:p>
+        </w:tc>
+        <w:tc>
+          <w:tcPr>
+            <w:tcW w:w="2342" w:type="dxa"/>
+          </w:tcPr>
+          <w:p>
+            <w:pPr>
+              <w:rPr>
+                <w:rFonts w:hint="default"/>
+                <w:vertAlign w:val="baseline"/>
+                <w:lang w:val="en-US" w:eastAsia="zh-CN"/>
+              </w:rPr>
+            </w:pPr>
+            <w:r>
+              <w:rPr>
+                <w:rFonts w:hint="eastAsia"/>
+                <w:vertAlign w:val="baseline"/>
+                <w:lang w:val="en-US" w:eastAsia="zh-CN"/>
+              </w:rPr>
+              <w:t>Module_0_2</w:t>
+            </w:r>
+          </w:p>
+          <w:p>
+            <w:pPr>
+              <w:rPr>
+                <w:rFonts w:hint="eastAsia"/>
+                <w:vertAlign w:val="baseline"/>
+                <w:lang w:val="en-US" w:eastAsia="zh-CN"/>
+              </w:rPr>
+            </w:pPr>
+            <w:r>
+              <w:rPr>
+                <w:rFonts w:hint="eastAsia"/>
+                <w:vertAlign w:val="baseline"/>
+                <w:lang w:val="en-US" w:eastAsia="zh-CN"/>
+              </w:rPr>
+              <w:t>preprocessData();</w:t>
+            </w:r>
+          </w:p>
+        </w:tc>
+        <w:tc>
+          <w:tcPr>
+            <w:tcW w:w="2131" w:type="dxa"/>
+          </w:tcPr>
+          <w:p>
+            <w:pPr>
+              <w:rPr>
+                <w:rFonts w:hint="default"/>
+                <w:vertAlign w:val="baseline"/>
+                <w:lang w:val="en-US" w:eastAsia="zh-CN"/>
+              </w:rPr>
+            </w:pPr>
+            <w:r>
+              <w:rPr>
+                <w:rFonts w:hint="eastAsia"/>
+                <w:vertAlign w:val="baseline"/>
+                <w:lang w:val="en-US" w:eastAsia="zh-CN"/>
+              </w:rPr>
+              <w:t>预处理数据；</w:t>
+            </w:r>
+          </w:p>
+        </w:tc>
+      </w:tr>
+      <w:tr>
+        <w:tblPrEx>
+          <w:tblBorders>
+            <w:top w:val="single" w:color="auto" w:sz="4" w:space="0"/>
+            <w:left w:val="single" w:color="auto" w:sz="4" w:space="0"/>
+            <w:bottom w:val="single" w:color="auto" w:sz="4" w:space="0"/>
+            <w:right w:val="single" w:color="auto" w:sz="4" w:space="0"/>
+            <w:insideH w:val="single" w:color="auto" w:sz="4" w:space="0"/>
+            <w:insideV w:val="single" w:color="auto" w:sz="4" w:space="0"/>
+          </w:tblBorders>
+          <w:tblCellMar>
+            <w:top w:w="0" w:type="dxa"/>
+            <w:left w:w="108" w:type="dxa"/>
+            <w:bottom w:w="0" w:type="dxa"/>
+            <w:right w:w="108" w:type="dxa"/>
+          </w:tblCellMar>
+        </w:tblPrEx>
+        <w:tc>
+          <w:tcPr>
+            <w:tcW w:w="1322" w:type="dxa"/>
+            <w:vMerge w:val="continue"/>
+          </w:tcPr>
+          <w:p>
+            <w:pPr>
+              <w:rPr>
+                <w:rFonts w:hint="default"/>
+                <w:vertAlign w:val="baseline"/>
+                <w:lang w:val="en-US" w:eastAsia="zh-CN"/>
+              </w:rPr>
+            </w:pPr>
+          </w:p>
+        </w:tc>
+        <w:tc>
+          <w:tcPr>
+            <w:tcW w:w="2727" w:type="dxa"/>
+            <w:vMerge w:val="restart"/>
+          </w:tcPr>
+          <w:p>
+            <w:pPr>
+              <w:rPr>
+                <w:rFonts w:hint="eastAsia"/>
+                <w:vertAlign w:val="baseline"/>
+                <w:lang w:val="en-US" w:eastAsia="zh-CN"/>
+              </w:rPr>
+            </w:pPr>
+            <w:r>
+              <w:rPr>
+                <w:rFonts w:hint="eastAsia"/>
+                <w:vertAlign w:val="baseline"/>
+                <w:lang w:val="en-US" w:eastAsia="zh-CN"/>
+              </w:rPr>
+              <w:t xml:space="preserve">Module ID: Module_1 </w:t>
+            </w:r>
+          </w:p>
+          <w:p>
+            <w:pPr>
+              <w:rPr>
+                <w:rFonts w:hint="eastAsia"/>
+                <w:vertAlign w:val="baseline"/>
+                <w:lang w:val="en-US" w:eastAsia="zh-CN"/>
+              </w:rPr>
+            </w:pPr>
+            <w:r>
+              <w:rPr>
+                <w:rFonts w:hint="eastAsia"/>
+                <w:vertAlign w:val="baseline"/>
+                <w:lang w:val="en-US" w:eastAsia="zh-CN"/>
+              </w:rPr>
+              <w:t>Module Name :</w:t>
+            </w:r>
+          </w:p>
+          <w:p>
+            <w:pPr>
+              <w:ind w:firstLine="420" w:firstLineChars="200"/>
+              <w:rPr>
+                <w:rFonts w:hint="default"/>
+                <w:vertAlign w:val="baseline"/>
+                <w:lang w:val="en-US" w:eastAsia="zh-CN"/>
+              </w:rPr>
+            </w:pPr>
+            <w:r>
+              <w:rPr>
+                <w:rFonts w:hint="eastAsia"/>
+                <w:vertAlign w:val="baseline"/>
+                <w:lang w:val="en-US" w:eastAsia="zh-CN"/>
+              </w:rPr>
+              <w:t>Query Elements</w:t>
+            </w:r>
+          </w:p>
+          <w:p>
+            <w:pPr>
+              <w:rPr>
+                <w:rFonts w:hint="eastAsia"/>
+                <w:vertAlign w:val="baseline"/>
+                <w:lang w:val="en-US" w:eastAsia="zh-CN"/>
+              </w:rPr>
+            </w:pPr>
+            <w:r>
+              <w:rPr>
+                <w:rFonts w:hint="eastAsia"/>
+                <w:vertAlign w:val="baseline"/>
+                <w:lang w:val="en-US" w:eastAsia="zh-CN"/>
+              </w:rPr>
+              <w:t>Description:</w:t>
+            </w:r>
+          </w:p>
+          <w:p>
+            <w:pPr>
+              <w:rPr>
+                <w:rFonts w:hint="default"/>
+                <w:vertAlign w:val="baseline"/>
+                <w:lang w:val="en-US" w:eastAsia="zh-CN"/>
+              </w:rPr>
+            </w:pPr>
+          </w:p>
+          <w:p>
+            <w:pPr>
+              <w:rPr>
+                <w:rFonts w:hint="eastAsia"/>
+                <w:vertAlign w:val="baseline"/>
+                <w:lang w:val="en-US" w:eastAsia="zh-CN"/>
+              </w:rPr>
+            </w:pPr>
+            <w:r>
+              <w:rPr>
+                <w:rFonts w:hint="eastAsia"/>
+                <w:vertAlign w:val="baseline"/>
+                <w:lang w:val="en-US" w:eastAsia="zh-CN"/>
+              </w:rPr>
+              <w:t>Module　Function：</w:t>
+            </w:r>
+          </w:p>
+          <w:p>
+            <w:pPr>
+              <w:rPr>
+                <w:rFonts w:hint="default"/>
+                <w:vertAlign w:val="baseline"/>
+                <w:lang w:val="en-US" w:eastAsia="zh-CN"/>
+              </w:rPr>
+            </w:pPr>
+            <w:r>
+              <w:rPr>
+                <w:rFonts w:hint="eastAsia"/>
+                <w:vertAlign w:val="baseline"/>
+                <w:lang w:val="en-US" w:eastAsia="zh-CN"/>
+              </w:rPr>
+              <w:t xml:space="preserve">  queryElements()</w:t>
+            </w:r>
+          </w:p>
+        </w:tc>
+        <w:tc>
+          <w:tcPr>
+            <w:tcW w:w="2342" w:type="dxa"/>
+          </w:tcPr>
+          <w:p>
+            <w:pPr>
+              <w:rPr>
+                <w:rFonts w:hint="default" w:eastAsiaTheme="minorEastAsia"/>
+                <w:vertAlign w:val="baseline"/>
+                <w:lang w:val="en-US" w:eastAsia="zh-CN"/>
+              </w:rPr>
+            </w:pPr>
+            <w:r>
+              <w:rPr>
+                <w:rFonts w:hint="eastAsia"/>
+                <w:vertAlign w:val="baseline"/>
+                <w:lang w:val="en-US" w:eastAsia="zh-CN"/>
+              </w:rPr>
+              <w:t>Module 1.1</w:t>
+            </w:r>
+          </w:p>
+          <w:p>
+            <w:pPr>
+              <w:rPr>
+                <w:rFonts w:hint="default" w:eastAsiaTheme="minorEastAsia"/>
+                <w:vertAlign w:val="baseline"/>
+                <w:lang w:val="en-US" w:eastAsia="zh-CN"/>
+              </w:rPr>
+            </w:pPr>
+            <w:r>
+              <w:rPr>
+                <w:rFonts w:hint="eastAsia"/>
+                <w:vertAlign w:val="baseline"/>
+                <w:lang w:val="en-US" w:eastAsia="zh-CN"/>
+              </w:rPr>
+              <w:t>queryByNumber();</w:t>
+            </w:r>
+          </w:p>
+        </w:tc>
+        <w:tc>
+          <w:tcPr>
+            <w:tcW w:w="2131" w:type="dxa"/>
+          </w:tcPr>
+          <w:p>
+            <w:pPr>
+              <w:rPr>
+                <w:rFonts w:hint="default" w:eastAsiaTheme="minorEastAsia"/>
+                <w:vertAlign w:val="baseline"/>
+                <w:lang w:val="en-US" w:eastAsia="zh-CN"/>
+              </w:rPr>
+            </w:pPr>
+            <w:r>
+              <w:rPr>
+                <w:rFonts w:hint="eastAsia"/>
+                <w:vertAlign w:val="baseline"/>
+                <w:lang w:val="en-US" w:eastAsia="zh-CN"/>
+              </w:rPr>
+              <w:t>根据用户输入的number查询元素；</w:t>
+            </w:r>
+          </w:p>
+        </w:tc>
+      </w:tr>
+      <w:tr>
+        <w:tblPrEx>
+          <w:tblBorders>
+            <w:top w:val="single" w:color="auto" w:sz="4" w:space="0"/>
+            <w:left w:val="single" w:color="auto" w:sz="4" w:space="0"/>
+            <w:bottom w:val="single" w:color="auto" w:sz="4" w:space="0"/>
+            <w:right w:val="single" w:color="auto" w:sz="4" w:space="0"/>
+            <w:insideH w:val="single" w:color="auto" w:sz="4" w:space="0"/>
+            <w:insideV w:val="single" w:color="auto" w:sz="4" w:space="0"/>
+          </w:tblBorders>
+          <w:tblCellMar>
+            <w:top w:w="0" w:type="dxa"/>
+            <w:left w:w="108" w:type="dxa"/>
+            <w:bottom w:w="0" w:type="dxa"/>
+            <w:right w:w="108" w:type="dxa"/>
+          </w:tblCellMar>
+        </w:tblPrEx>
+        <w:tc>
+          <w:tcPr>
+            <w:tcW w:w="1322" w:type="dxa"/>
+            <w:vMerge w:val="continue"/>
+          </w:tcPr>
+          <w:p>
+            <w:pPr>
+              <w:rPr>
+                <w:vertAlign w:val="baseline"/>
+              </w:rPr>
+            </w:pPr>
+          </w:p>
+        </w:tc>
+        <w:tc>
+          <w:tcPr>
+            <w:tcW w:w="2727" w:type="dxa"/>
+            <w:vMerge w:val="continue"/>
+          </w:tcPr>
+          <w:p>
+            <w:pPr>
+              <w:rPr>
+                <w:rFonts w:hint="eastAsia"/>
+                <w:vertAlign w:val="baseline"/>
+                <w:lang w:val="en-US" w:eastAsia="zh-CN"/>
+              </w:rPr>
+            </w:pPr>
+          </w:p>
+        </w:tc>
+        <w:tc>
+          <w:tcPr>
+            <w:tcW w:w="2342" w:type="dxa"/>
+          </w:tcPr>
+          <w:p>
+            <w:pPr>
+              <w:rPr>
+                <w:rFonts w:hint="default" w:eastAsiaTheme="minorEastAsia"/>
+                <w:vertAlign w:val="baseline"/>
+                <w:lang w:val="en-US" w:eastAsia="zh-CN"/>
+              </w:rPr>
+            </w:pPr>
+            <w:r>
+              <w:rPr>
+                <w:rFonts w:hint="eastAsia"/>
+                <w:vertAlign w:val="baseline"/>
+                <w:lang w:val="en-US" w:eastAsia="zh-CN"/>
+              </w:rPr>
+              <w:t>Module 1.2</w:t>
+            </w:r>
+          </w:p>
+          <w:p>
+            <w:pPr>
+              <w:rPr>
+                <w:rFonts w:hint="default"/>
+                <w:vertAlign w:val="baseline"/>
+                <w:lang w:val="en-US" w:eastAsia="zh-CN"/>
+              </w:rPr>
+            </w:pPr>
+            <w:r>
+              <w:rPr>
+                <w:rFonts w:hint="eastAsia"/>
+                <w:vertAlign w:val="baseline"/>
+                <w:lang w:val="en-US" w:eastAsia="zh-CN"/>
+              </w:rPr>
+              <w:t>queryByName();</w:t>
+            </w:r>
+          </w:p>
+        </w:tc>
+        <w:tc>
+          <w:tcPr>
+            <w:tcW w:w="2131" w:type="dxa"/>
+          </w:tcPr>
+          <w:p>
+            <w:pPr>
+              <w:rPr>
+                <w:vertAlign w:val="baseline"/>
+              </w:rPr>
+            </w:pPr>
+          </w:p>
+        </w:tc>
+      </w:tr>
+      <w:tr>
+        <w:tblPrEx>
+          <w:tblBorders>
+            <w:top w:val="single" w:color="auto" w:sz="4" w:space="0"/>
+            <w:left w:val="single" w:color="auto" w:sz="4" w:space="0"/>
+            <w:bottom w:val="single" w:color="auto" w:sz="4" w:space="0"/>
+            <w:right w:val="single" w:color="auto" w:sz="4" w:space="0"/>
+            <w:insideH w:val="single" w:color="auto" w:sz="4" w:space="0"/>
+            <w:insideV w:val="single" w:color="auto" w:sz="4" w:space="0"/>
+          </w:tblBorders>
+          <w:tblCellMar>
+            <w:top w:w="0" w:type="dxa"/>
+            <w:left w:w="108" w:type="dxa"/>
+            <w:bottom w:w="0" w:type="dxa"/>
+            <w:right w:w="108" w:type="dxa"/>
+          </w:tblCellMar>
+        </w:tblPrEx>
+        <w:tc>
+          <w:tcPr>
+            <w:tcW w:w="1322" w:type="dxa"/>
+            <w:vMerge w:val="continue"/>
+          </w:tcPr>
+          <w:p>
+            <w:pPr>
+              <w:rPr>
+                <w:vertAlign w:val="baseline"/>
+              </w:rPr>
+            </w:pPr>
+          </w:p>
+        </w:tc>
+        <w:tc>
+          <w:tcPr>
+            <w:tcW w:w="2727" w:type="dxa"/>
+            <w:vMerge w:val="continue"/>
+          </w:tcPr>
+          <w:p>
+            <w:pPr>
+              <w:rPr>
+                <w:vertAlign w:val="baseline"/>
+              </w:rPr>
+            </w:pPr>
+          </w:p>
+        </w:tc>
+        <w:tc>
+          <w:tcPr>
+            <w:tcW w:w="2342" w:type="dxa"/>
+          </w:tcPr>
+          <w:p>
+            <w:pPr>
+              <w:rPr>
+                <w:rFonts w:hint="default" w:eastAsiaTheme="minorEastAsia"/>
+                <w:vertAlign w:val="baseline"/>
+                <w:lang w:val="en-US" w:eastAsia="zh-CN"/>
+              </w:rPr>
+            </w:pPr>
+            <w:r>
+              <w:rPr>
+                <w:rFonts w:hint="eastAsia"/>
+                <w:vertAlign w:val="baseline"/>
+                <w:lang w:val="en-US" w:eastAsia="zh-CN"/>
+              </w:rPr>
+              <w:t>Module 1.3</w:t>
+            </w:r>
+          </w:p>
+          <w:p>
+            <w:pPr>
+              <w:rPr>
+                <w:vertAlign w:val="baseline"/>
+              </w:rPr>
+            </w:pPr>
+            <w:r>
+              <w:rPr>
+                <w:rFonts w:hint="eastAsia"/>
+                <w:vertAlign w:val="baseline"/>
+                <w:lang w:val="en-US" w:eastAsia="zh-CN"/>
+              </w:rPr>
+              <w:t>queryBySambol()</w:t>
+            </w:r>
+          </w:p>
+        </w:tc>
+        <w:tc>
+          <w:tcPr>
+            <w:tcW w:w="2131" w:type="dxa"/>
+          </w:tcPr>
+          <w:p>
+            <w:pPr>
+              <w:rPr>
+                <w:vertAlign w:val="baseline"/>
+              </w:rPr>
+            </w:pPr>
+          </w:p>
+        </w:tc>
+      </w:tr>
+      <w:tr>
+        <w:tblPrEx>
+          <w:tblBorders>
+            <w:top w:val="single" w:color="auto" w:sz="4" w:space="0"/>
+            <w:left w:val="single" w:color="auto" w:sz="4" w:space="0"/>
+            <w:bottom w:val="single" w:color="auto" w:sz="4" w:space="0"/>
+            <w:right w:val="single" w:color="auto" w:sz="4" w:space="0"/>
+            <w:insideH w:val="single" w:color="auto" w:sz="4" w:space="0"/>
+            <w:insideV w:val="single" w:color="auto" w:sz="4" w:space="0"/>
+          </w:tblBorders>
+          <w:tblCellMar>
+            <w:top w:w="0" w:type="dxa"/>
+            <w:left w:w="108" w:type="dxa"/>
+            <w:bottom w:w="0" w:type="dxa"/>
+            <w:right w:w="108" w:type="dxa"/>
+          </w:tblCellMar>
+        </w:tblPrEx>
+        <w:tc>
+          <w:tcPr>
+            <w:tcW w:w="1322" w:type="dxa"/>
+            <w:vMerge w:val="continue"/>
+          </w:tcPr>
+          <w:p>
+            <w:pPr>
+              <w:rPr>
+                <w:rFonts w:hint="default" w:eastAsiaTheme="minorEastAsia"/>
+                <w:vertAlign w:val="baseline"/>
+                <w:lang w:val="en-US" w:eastAsia="zh-CN"/>
+              </w:rPr>
+            </w:pPr>
+          </w:p>
+        </w:tc>
+        <w:tc>
+          <w:tcPr>
+            <w:tcW w:w="2727" w:type="dxa"/>
+            <w:vMerge w:val="continue"/>
+          </w:tcPr>
+          <w:p>
+            <w:pPr>
+              <w:rPr>
+                <w:vertAlign w:val="baseline"/>
+              </w:rPr>
+            </w:pPr>
+          </w:p>
+        </w:tc>
+        <w:tc>
+          <w:tcPr>
+            <w:tcW w:w="2342" w:type="dxa"/>
+          </w:tcPr>
+          <w:p>
+            <w:pPr>
+              <w:rPr>
+                <w:rFonts w:hint="default" w:eastAsiaTheme="minorEastAsia"/>
+                <w:vertAlign w:val="baseline"/>
+                <w:lang w:val="en-US" w:eastAsia="zh-CN"/>
+              </w:rPr>
+            </w:pPr>
+            <w:r>
+              <w:rPr>
+                <w:rFonts w:hint="eastAsia"/>
+                <w:vertAlign w:val="baseline"/>
+                <w:lang w:val="en-US" w:eastAsia="zh-CN"/>
+              </w:rPr>
+              <w:t>Module 1.4</w:t>
+            </w:r>
+          </w:p>
+          <w:p>
+            <w:pPr>
+              <w:rPr>
+                <w:rFonts w:hint="default" w:eastAsiaTheme="minorEastAsia"/>
+                <w:vertAlign w:val="baseline"/>
+                <w:lang w:val="en-US" w:eastAsia="zh-CN"/>
+              </w:rPr>
+            </w:pPr>
+            <w:r>
+              <w:rPr>
+                <w:rFonts w:hint="eastAsia"/>
+                <w:vertAlign w:val="baseline"/>
+                <w:lang w:val="en-US" w:eastAsia="zh-CN"/>
+              </w:rPr>
+              <w:t>queryByAtomicMass()</w:t>
+            </w:r>
+          </w:p>
+        </w:tc>
+        <w:tc>
+          <w:tcPr>
+            <w:tcW w:w="2131" w:type="dxa"/>
+          </w:tcPr>
+          <w:p>
+            <w:pPr>
+              <w:rPr>
+                <w:vertAlign w:val="baseline"/>
+              </w:rPr>
+            </w:pPr>
+          </w:p>
+        </w:tc>
+      </w:tr>
+      <w:tr>
+        <w:tblPrEx>
+          <w:tblBorders>
+            <w:top w:val="single" w:color="auto" w:sz="4" w:space="0"/>
+            <w:left w:val="single" w:color="auto" w:sz="4" w:space="0"/>
+            <w:bottom w:val="single" w:color="auto" w:sz="4" w:space="0"/>
+            <w:right w:val="single" w:color="auto" w:sz="4" w:space="0"/>
+            <w:insideH w:val="single" w:color="auto" w:sz="4" w:space="0"/>
+            <w:insideV w:val="single" w:color="auto" w:sz="4" w:space="0"/>
+          </w:tblBorders>
+          <w:tblCellMar>
+            <w:top w:w="0" w:type="dxa"/>
+            <w:left w:w="108" w:type="dxa"/>
+            <w:bottom w:w="0" w:type="dxa"/>
+            <w:right w:w="108" w:type="dxa"/>
+          </w:tblCellMar>
+        </w:tblPrEx>
+        <w:tc>
+          <w:tcPr>
+            <w:tcW w:w="1322" w:type="dxa"/>
+            <w:vMerge w:val="continue"/>
+          </w:tcPr>
+          <w:p>
+            <w:pPr>
+              <w:rPr>
+                <w:vertAlign w:val="baseline"/>
+              </w:rPr>
+            </w:pPr>
+          </w:p>
+        </w:tc>
+        <w:tc>
+          <w:tcPr>
+            <w:tcW w:w="2727" w:type="dxa"/>
+            <w:vMerge w:val="continue"/>
+          </w:tcPr>
+          <w:p>
+            <w:pPr>
+              <w:rPr>
+                <w:vertAlign w:val="baseline"/>
+              </w:rPr>
+            </w:pPr>
+          </w:p>
+        </w:tc>
+        <w:tc>
+          <w:tcPr>
+            <w:tcW w:w="2342" w:type="dxa"/>
+          </w:tcPr>
+          <w:p>
+            <w:pPr>
+              <w:rPr>
+                <w:rFonts w:hint="default" w:eastAsiaTheme="minorEastAsia"/>
+                <w:vertAlign w:val="baseline"/>
+                <w:lang w:val="en-US" w:eastAsia="zh-CN"/>
+              </w:rPr>
+            </w:pPr>
+            <w:r>
+              <w:rPr>
+                <w:rFonts w:hint="eastAsia"/>
+                <w:vertAlign w:val="baseline"/>
+                <w:lang w:val="en-US" w:eastAsia="zh-CN"/>
+              </w:rPr>
+              <w:t>Module 1.5</w:t>
+            </w:r>
+          </w:p>
+          <w:p>
+            <w:pPr>
+              <w:rPr>
+                <w:rFonts w:hint="default"/>
+                <w:vertAlign w:val="baseline"/>
+                <w:lang w:val="en-US"/>
+              </w:rPr>
+            </w:pPr>
+            <w:r>
+              <w:rPr>
+                <w:rFonts w:hint="eastAsia"/>
+                <w:vertAlign w:val="baseline"/>
+                <w:lang w:val="en-US" w:eastAsia="zh-CN"/>
+              </w:rPr>
+              <w:t>queryByPeriod()</w:t>
+            </w:r>
+          </w:p>
+        </w:tc>
+        <w:tc>
+          <w:tcPr>
+            <w:tcW w:w="2131" w:type="dxa"/>
+          </w:tcPr>
+          <w:p>
+            <w:pPr>
+              <w:rPr>
+                <w:vertAlign w:val="baseline"/>
+              </w:rPr>
+            </w:pPr>
+          </w:p>
+        </w:tc>
+      </w:tr>
+      <w:tr>
+        <w:tblPrEx>
+          <w:tblBorders>
+            <w:top w:val="single" w:color="auto" w:sz="4" w:space="0"/>
+            <w:left w:val="single" w:color="auto" w:sz="4" w:space="0"/>
+            <w:bottom w:val="single" w:color="auto" w:sz="4" w:space="0"/>
+            <w:right w:val="single" w:color="auto" w:sz="4" w:space="0"/>
+            <w:insideH w:val="single" w:color="auto" w:sz="4" w:space="0"/>
+            <w:insideV w:val="single" w:color="auto" w:sz="4" w:space="0"/>
+          </w:tblBorders>
+          <w:tblCellMar>
+            <w:top w:w="0" w:type="dxa"/>
+            <w:left w:w="108" w:type="dxa"/>
+            <w:bottom w:w="0" w:type="dxa"/>
+            <w:right w:w="108" w:type="dxa"/>
+          </w:tblCellMar>
+        </w:tblPrEx>
+        <w:tc>
+          <w:tcPr>
+            <w:tcW w:w="1322" w:type="dxa"/>
+            <w:vMerge w:val="continue"/>
+          </w:tcPr>
+          <w:p>
+            <w:pPr>
+              <w:rPr>
+                <w:vertAlign w:val="baseline"/>
+              </w:rPr>
+            </w:pPr>
+          </w:p>
+        </w:tc>
+        <w:tc>
+          <w:tcPr>
+            <w:tcW w:w="2727" w:type="dxa"/>
+            <w:vMerge w:val="restart"/>
+          </w:tcPr>
+          <w:p>
+            <w:pPr>
+              <w:rPr>
+                <w:rFonts w:hint="eastAsia"/>
+                <w:vertAlign w:val="baseline"/>
+                <w:lang w:val="en-US" w:eastAsia="zh-CN"/>
+              </w:rPr>
+            </w:pPr>
+            <w:r>
+              <w:rPr>
+                <w:rFonts w:hint="eastAsia"/>
+                <w:vertAlign w:val="baseline"/>
+                <w:lang w:val="en-US" w:eastAsia="zh-CN"/>
+              </w:rPr>
+              <w:t>Module Id: Module-2:</w:t>
+            </w:r>
+          </w:p>
+          <w:p>
+            <w:pPr>
+              <w:rPr>
+                <w:rFonts w:hint="eastAsia"/>
+                <w:vertAlign w:val="baseline"/>
+                <w:lang w:val="en-US" w:eastAsia="zh-CN"/>
+              </w:rPr>
+            </w:pPr>
+            <w:r>
+              <w:rPr>
+                <w:rFonts w:hint="eastAsia"/>
+                <w:vertAlign w:val="baseline"/>
+                <w:lang w:val="en-US" w:eastAsia="zh-CN"/>
+              </w:rPr>
+              <w:t>Module Name:</w:t>
+            </w:r>
+          </w:p>
+          <w:p>
+            <w:pPr>
+              <w:ind w:firstLine="420" w:firstLineChars="200"/>
+              <w:rPr>
+                <w:rFonts w:hint="default"/>
+                <w:vertAlign w:val="baseline"/>
+                <w:lang w:val="en-US" w:eastAsia="zh-CN"/>
+              </w:rPr>
+            </w:pPr>
+            <w:r>
+              <w:rPr>
+                <w:rFonts w:hint="eastAsia"/>
+                <w:vertAlign w:val="baseline"/>
+                <w:lang w:val="en-US" w:eastAsia="zh-CN"/>
+              </w:rPr>
+              <w:t xml:space="preserve"> Gaming Elements</w:t>
+            </w:r>
+          </w:p>
+          <w:p>
+            <w:pPr>
+              <w:rPr>
+                <w:rFonts w:hint="eastAsia"/>
+                <w:vertAlign w:val="baseline"/>
+                <w:lang w:val="en-US" w:eastAsia="zh-CN"/>
+              </w:rPr>
+            </w:pPr>
+            <w:r>
+              <w:rPr>
+                <w:rFonts w:hint="eastAsia"/>
+                <w:vertAlign w:val="baseline"/>
+                <w:lang w:val="en-US" w:eastAsia="zh-CN"/>
+              </w:rPr>
+              <w:t>Module　Function:</w:t>
+            </w:r>
+          </w:p>
+          <w:p>
+            <w:pPr>
+              <w:ind w:firstLine="210" w:firstLineChars="100"/>
+              <w:rPr>
+                <w:rFonts w:hint="default"/>
+                <w:vertAlign w:val="baseline"/>
+                <w:lang w:val="en-US" w:eastAsia="zh-CN"/>
+              </w:rPr>
+            </w:pPr>
+            <w:r>
+              <w:rPr>
+                <w:rFonts w:hint="eastAsia"/>
+                <w:vertAlign w:val="baseline"/>
+                <w:lang w:val="en-US" w:eastAsia="zh-CN"/>
+              </w:rPr>
+              <w:t>gamingElements()</w:t>
+            </w:r>
+          </w:p>
+        </w:tc>
+        <w:tc>
+          <w:tcPr>
+            <w:tcW w:w="2342" w:type="dxa"/>
+          </w:tcPr>
+          <w:p>
+            <w:pPr>
+              <w:rPr>
+                <w:rFonts w:hint="default"/>
+                <w:vertAlign w:val="baseline"/>
+                <w:lang w:val="en-US" w:eastAsia="zh-CN"/>
+              </w:rPr>
+            </w:pPr>
+            <w:r>
+              <w:rPr>
+                <w:rFonts w:hint="eastAsia"/>
+                <w:vertAlign w:val="baseline"/>
+                <w:lang w:val="en-US" w:eastAsia="zh-CN"/>
+              </w:rPr>
+              <w:t>Module 2.1</w:t>
+            </w:r>
+          </w:p>
+          <w:p>
+            <w:pPr>
+              <w:rPr>
+                <w:rFonts w:hint="default" w:eastAsiaTheme="minorEastAsia"/>
+                <w:vertAlign w:val="baseline"/>
+                <w:lang w:val="en-US" w:eastAsia="zh-CN"/>
+              </w:rPr>
+            </w:pPr>
+            <w:r>
+              <w:rPr>
+                <w:rFonts w:hint="eastAsia"/>
+                <w:vertAlign w:val="baseline"/>
+                <w:lang w:val="en-US" w:eastAsia="zh-CN"/>
+              </w:rPr>
+              <w:t>guessAutomicMass()</w:t>
+            </w:r>
+          </w:p>
+        </w:tc>
+        <w:tc>
+          <w:tcPr>
+            <w:tcW w:w="2131" w:type="dxa"/>
+          </w:tcPr>
+          <w:p>
+            <w:pPr>
+              <w:rPr>
+                <w:vertAlign w:val="baseline"/>
+              </w:rPr>
+            </w:pPr>
+          </w:p>
+        </w:tc>
+      </w:tr>
+      <w:tr>
+        <w:tblPrEx>
+          <w:tblBorders>
+            <w:top w:val="single" w:color="auto" w:sz="4" w:space="0"/>
+            <w:left w:val="single" w:color="auto" w:sz="4" w:space="0"/>
+            <w:bottom w:val="single" w:color="auto" w:sz="4" w:space="0"/>
+            <w:right w:val="single" w:color="auto" w:sz="4" w:space="0"/>
+            <w:insideH w:val="single" w:color="auto" w:sz="4" w:space="0"/>
+            <w:insideV w:val="single" w:color="auto" w:sz="4" w:space="0"/>
+          </w:tblBorders>
+          <w:tblCellMar>
+            <w:top w:w="0" w:type="dxa"/>
+            <w:left w:w="108" w:type="dxa"/>
+            <w:bottom w:w="0" w:type="dxa"/>
+            <w:right w:w="108" w:type="dxa"/>
+          </w:tblCellMar>
+        </w:tblPrEx>
+        <w:tc>
+          <w:tcPr>
+            <w:tcW w:w="1322" w:type="dxa"/>
+            <w:vMerge w:val="continue"/>
+          </w:tcPr>
+          <w:p>
+            <w:pPr>
+              <w:rPr>
+                <w:vertAlign w:val="baseline"/>
+              </w:rPr>
+            </w:pPr>
+          </w:p>
+        </w:tc>
+        <w:tc>
+          <w:tcPr>
+            <w:tcW w:w="2727" w:type="dxa"/>
+            <w:vMerge w:val="continue"/>
+          </w:tcPr>
+          <w:p>
+            <w:pPr>
+              <w:rPr>
+                <w:rFonts w:hint="eastAsia"/>
+                <w:vertAlign w:val="baseline"/>
+                <w:lang w:val="en-US" w:eastAsia="zh-CN"/>
+              </w:rPr>
+            </w:pPr>
+          </w:p>
+        </w:tc>
+        <w:tc>
+          <w:tcPr>
+            <w:tcW w:w="2342" w:type="dxa"/>
+          </w:tcPr>
+          <w:p>
+            <w:pPr>
+              <w:rPr>
+                <w:rFonts w:hint="default"/>
+                <w:vertAlign w:val="baseline"/>
+                <w:lang w:val="en-US" w:eastAsia="zh-CN"/>
+              </w:rPr>
+            </w:pPr>
+            <w:r>
+              <w:rPr>
+                <w:rFonts w:hint="eastAsia"/>
+                <w:vertAlign w:val="baseline"/>
+                <w:lang w:val="en-US" w:eastAsia="zh-CN"/>
+              </w:rPr>
+              <w:t>Module 2.2</w:t>
+            </w:r>
+          </w:p>
+          <w:p>
+            <w:pPr>
+              <w:rPr>
+                <w:rFonts w:hint="eastAsia"/>
+                <w:vertAlign w:val="baseline"/>
+                <w:lang w:val="en-US" w:eastAsia="zh-CN"/>
+              </w:rPr>
+            </w:pPr>
+            <w:r>
+              <w:rPr>
+                <w:rFonts w:hint="eastAsia"/>
+                <w:vertAlign w:val="baseline"/>
+                <w:lang w:val="en-US" w:eastAsia="zh-CN"/>
+              </w:rPr>
+              <w:t>guessElementNumber()</w:t>
+            </w:r>
+          </w:p>
+        </w:tc>
+        <w:tc>
+          <w:tcPr>
+            <w:tcW w:w="2131" w:type="dxa"/>
+          </w:tcPr>
+          <w:p>
+            <w:pPr>
+              <w:rPr>
+                <w:rFonts w:hint="eastAsia"/>
+                <w:vertAlign w:val="baseline"/>
+                <w:lang w:val="en-US" w:eastAsia="zh-CN"/>
+              </w:rPr>
+            </w:pPr>
+            <w:r>
+              <w:rPr>
+                <w:rFonts w:hint="eastAsia"/>
+                <w:vertAlign w:val="baseline"/>
+                <w:lang w:val="en-US" w:eastAsia="zh-CN"/>
+              </w:rPr>
+              <w:t>1.用户先输入一个合法的元素名称，并系统查询到该元素；</w:t>
+            </w:r>
+          </w:p>
+          <w:p>
+            <w:pPr>
+              <w:rPr>
+                <w:rFonts w:hint="eastAsia"/>
+                <w:vertAlign w:val="baseline"/>
+                <w:lang w:val="en-US" w:eastAsia="zh-CN"/>
+              </w:rPr>
+            </w:pPr>
+            <w:r>
+              <w:rPr>
+                <w:rFonts w:hint="eastAsia"/>
+                <w:vertAlign w:val="baseline"/>
+                <w:lang w:val="en-US" w:eastAsia="zh-CN"/>
+              </w:rPr>
+              <w:t>3.提示用户猜其原子序数，并输入；</w:t>
+            </w:r>
+          </w:p>
+          <w:p>
+            <w:pPr>
+              <w:rPr>
+                <w:rFonts w:hint="eastAsia"/>
+                <w:vertAlign w:val="baseline"/>
+                <w:lang w:val="en-US" w:eastAsia="zh-CN"/>
+              </w:rPr>
+            </w:pPr>
+            <w:r>
+              <w:rPr>
+                <w:rFonts w:hint="eastAsia"/>
+                <w:vertAlign w:val="baseline"/>
+                <w:lang w:val="en-US" w:eastAsia="zh-CN"/>
+              </w:rPr>
+              <w:t>4.据用户输入原子序数，判断与目标原子序数大小，给出不同提示，引导其输入到正确。</w:t>
+            </w:r>
+          </w:p>
+          <w:p>
+            <w:pPr>
+              <w:rPr>
+                <w:rFonts w:hint="default"/>
+                <w:vertAlign w:val="baseline"/>
+                <w:lang w:val="en-US" w:eastAsia="zh-CN"/>
+              </w:rPr>
+            </w:pPr>
+            <w:r>
+              <w:rPr>
+                <w:rFonts w:hint="eastAsia"/>
+                <w:vertAlign w:val="baseline"/>
+                <w:lang w:val="en-US" w:eastAsia="zh-CN"/>
+              </w:rPr>
+              <w:t>5. 猜中后展示该元素的完整信息；</w:t>
+            </w:r>
+          </w:p>
+        </w:tc>
+      </w:tr>
+      <w:tr>
+        <w:tblPrEx>
+          <w:tblBorders>
+            <w:top w:val="single" w:color="auto" w:sz="4" w:space="0"/>
+            <w:left w:val="single" w:color="auto" w:sz="4" w:space="0"/>
+            <w:bottom w:val="single" w:color="auto" w:sz="4" w:space="0"/>
+            <w:right w:val="single" w:color="auto" w:sz="4" w:space="0"/>
+            <w:insideH w:val="single" w:color="auto" w:sz="4" w:space="0"/>
+            <w:insideV w:val="single" w:color="auto" w:sz="4" w:space="0"/>
+          </w:tblBorders>
+          <w:tblCellMar>
+            <w:top w:w="0" w:type="dxa"/>
+            <w:left w:w="108" w:type="dxa"/>
+            <w:bottom w:w="0" w:type="dxa"/>
+            <w:right w:w="108" w:type="dxa"/>
+          </w:tblCellMar>
+        </w:tblPrEx>
+        <w:tc>
+          <w:tcPr>
+            <w:tcW w:w="1322" w:type="dxa"/>
+            <w:vMerge w:val="continue"/>
+          </w:tcPr>
+          <w:p>
+            <w:pPr>
+              <w:rPr>
+                <w:vertAlign w:val="baseline"/>
+              </w:rPr>
+            </w:pPr>
+          </w:p>
+        </w:tc>
+        <w:tc>
+          <w:tcPr>
+            <w:tcW w:w="2727" w:type="dxa"/>
+          </w:tcPr>
+          <w:p>
+            <w:pPr>
+              <w:rPr>
+                <w:rFonts w:hint="eastAsia"/>
+                <w:vertAlign w:val="baseline"/>
+                <w:lang w:val="en-US" w:eastAsia="zh-CN"/>
+              </w:rPr>
+            </w:pPr>
+            <w:r>
+              <w:rPr>
+                <w:rFonts w:hint="eastAsia"/>
+                <w:vertAlign w:val="baseline"/>
+                <w:lang w:val="en-US" w:eastAsia="zh-CN"/>
+              </w:rPr>
+              <w:t xml:space="preserve">Module ID: Module_3: </w:t>
+            </w:r>
+          </w:p>
+          <w:p>
+            <w:pPr>
+              <w:rPr>
+                <w:rFonts w:hint="eastAsia"/>
+                <w:vertAlign w:val="baseline"/>
+                <w:lang w:val="en-US" w:eastAsia="zh-CN"/>
+              </w:rPr>
+            </w:pPr>
+            <w:r>
+              <w:rPr>
+                <w:rFonts w:hint="eastAsia"/>
+                <w:vertAlign w:val="baseline"/>
+                <w:lang w:val="en-US" w:eastAsia="zh-CN"/>
+              </w:rPr>
+              <w:t>display elements information and visualize them.</w:t>
+            </w:r>
+          </w:p>
+          <w:p>
+            <w:pPr>
+              <w:rPr>
+                <w:rFonts w:hint="default"/>
+                <w:vertAlign w:val="baseline"/>
+                <w:lang w:val="en-US" w:eastAsia="zh-CN"/>
+              </w:rPr>
+            </w:pPr>
+            <w:r>
+              <w:rPr>
+                <w:rFonts w:hint="eastAsia"/>
+                <w:vertAlign w:val="baseline"/>
+                <w:lang w:val="en-US" w:eastAsia="zh-CN"/>
+              </w:rPr>
+              <w:t>Function  DisplayResult()</w:t>
+            </w:r>
+          </w:p>
+        </w:tc>
+        <w:tc>
+          <w:tcPr>
+            <w:tcW w:w="2342" w:type="dxa"/>
+          </w:tcPr>
+          <w:p>
+            <w:pPr>
+              <w:rPr>
+                <w:rFonts w:hint="eastAsia"/>
+                <w:vertAlign w:val="baseline"/>
+                <w:lang w:val="en-US" w:eastAsia="zh-CN"/>
+              </w:rPr>
+            </w:pPr>
+            <w:r>
+              <w:rPr>
+                <w:rFonts w:hint="eastAsia"/>
+                <w:vertAlign w:val="baseline"/>
+                <w:lang w:val="en-US" w:eastAsia="zh-CN"/>
+              </w:rPr>
+              <w:t>DisplaySingleElement()</w:t>
+            </w:r>
+          </w:p>
+          <w:p>
+            <w:pPr>
+              <w:rPr>
+                <w:rFonts w:hint="default"/>
+                <w:vertAlign w:val="baseline"/>
+                <w:lang w:val="en-US" w:eastAsia="zh-CN"/>
+              </w:rPr>
+            </w:pPr>
+            <w:r>
+              <w:rPr>
+                <w:rFonts w:hint="eastAsia"/>
+                <w:vertAlign w:val="baseline"/>
+                <w:lang w:val="en-US" w:eastAsia="zh-CN"/>
+              </w:rPr>
+              <w:t>DisplayMultipleElemnts()</w:t>
+            </w:r>
+          </w:p>
+        </w:tc>
+        <w:tc>
+          <w:tcPr>
+            <w:tcW w:w="2131" w:type="dxa"/>
+          </w:tcPr>
+          <w:p>
+            <w:pPr>
+              <w:rPr>
+                <w:vertAlign w:val="baseline"/>
+              </w:rPr>
+            </w:pPr>
+          </w:p>
+        </w:tc>
+      </w:tr>
+    </w:tbl>
+    <w:p>
+      <w:pPr>
+        <w:widowControl w:val="0"/>
+        <w:numPr>
+          <w:numId w:val="0"/>
+        </w:numPr>
         <w:tabs>
           <w:tab w:val="left" w:pos="5714"/>
         </w:tabs>
@@ -565,13 +2209,6 @@
           <w:lang w:val="en-US" w:eastAsia="zh-CN"/>
         </w:rPr>
       </w:pPr>
-      <w:r>
-        <w:rPr>
-          <w:rFonts w:hint="default"/>
-          <w:lang w:val="en-US" w:eastAsia="zh-CN"/>
-        </w:rPr>
-        <w:t>4.Design</w:t>
-      </w:r>
     </w:p>
     <w:p>
       <w:pPr>
@@ -805,19 +2442,6 @@
         </w:rPr>
         <w:t>Function main();</w:t>
       </w:r>
-    </w:p>
-    <w:p>
-      <w:pPr>
-        <w:tabs>
-          <w:tab w:val="left" w:pos="5714"/>
-        </w:tabs>
-        <w:bidi w:val="0"/>
-        <w:jc w:val="left"/>
-        <w:rPr>
-          <w:rFonts w:hint="default"/>
-          <w:lang w:val="en-US" w:eastAsia="zh-CN"/>
-        </w:rPr>
-      </w:pPr>
     </w:p>
     <w:p>
       <w:pPr>
@@ -903,6 +2527,96 @@
     </w:p>
     <w:p>
       <w:pPr>
+        <w:pStyle w:val="3"/>
+        <w:bidi w:val="0"/>
+        <w:ind w:left="575" w:leftChars="0" w:hanging="575" w:firstLineChars="0"/>
+        <w:rPr>
+          <w:rFonts w:hint="default"/>
+          <w:b/>
+          <w:lang w:val="en-US" w:eastAsia="zh-CN"/>
+        </w:rPr>
+      </w:pPr>
+      <w:r>
+        <w:rPr>
+          <w:rFonts w:hint="default"/>
+          <w:b/>
+          <w:lang w:val="en-US" w:eastAsia="zh-CN"/>
+        </w:rPr>
+        <w:t>Project repo</w:t>
+      </w:r>
+      <w:r>
+        <w:rPr>
+          <w:rFonts w:hint="eastAsia"/>
+          <w:b/>
+          <w:lang w:val="en-US" w:eastAsia="zh-CN"/>
+        </w:rPr>
+        <w:t>sitory</w:t>
+      </w:r>
+    </w:p>
+    <w:p>
+      <w:pPr>
+        <w:rPr>
+          <w:rFonts w:hint="default"/>
+          <w:lang w:val="en-US" w:eastAsia="zh-CN"/>
+        </w:rPr>
+      </w:pPr>
+    </w:p>
+    <w:p>
+      <w:pPr>
+        <w:rPr>
+          <w:rFonts w:hint="default"/>
+          <w:lang w:val="en-US" w:eastAsia="zh-CN"/>
+        </w:rPr>
+      </w:pPr>
+      <w:r>
+        <w:rPr>
+          <w:rFonts w:hint="default"/>
+          <w:lang w:val="en-US" w:eastAsia="zh-CN"/>
+        </w:rPr>
+        <w:t>https://github.com/XinyuanLiuSam/matlab_final</w:t>
+      </w:r>
+    </w:p>
+    <w:p>
+      <w:pPr>
+        <w:tabs>
+          <w:tab w:val="left" w:pos="5714"/>
+        </w:tabs>
+        <w:bidi w:val="0"/>
+        <w:ind w:firstLine="105" w:firstLineChars="50"/>
+        <w:jc w:val="left"/>
+        <w:rPr>
+          <w:rFonts w:hint="default"/>
+          <w:lang w:val="en-US" w:eastAsia="zh-CN"/>
+        </w:rPr>
+      </w:pPr>
+    </w:p>
+    <w:p>
+      <w:pPr>
+        <w:pStyle w:val="2"/>
+        <w:bidi w:val="0"/>
+        <w:ind w:left="432" w:leftChars="0" w:hanging="432" w:firstLineChars="0"/>
+        <w:rPr>
+          <w:rFonts w:hint="default"/>
+          <w:lang w:val="en-US" w:eastAsia="zh-CN"/>
+        </w:rPr>
+      </w:pPr>
+      <w:r>
+        <w:rPr>
+          <w:rFonts w:hint="eastAsia"/>
+          <w:lang w:val="en-US" w:eastAsia="zh-CN"/>
+        </w:rPr>
+        <w:t xml:space="preserve">Programming and </w:t>
+      </w:r>
+      <w:r>
+        <w:rPr>
+          <w:rFonts w:hint="default"/>
+          <w:lang w:val="en-US" w:eastAsia="zh-CN"/>
+        </w:rPr>
+        <w:t>Implement</w:t>
+      </w:r>
+    </w:p>
+    <w:p>
+      <w:pPr>
         <w:tabs>
           <w:tab w:val="left" w:pos="5714"/>
         </w:tabs>
@@ -918,7 +2632,7 @@
           <w:rFonts w:hint="default"/>
           <w:lang w:val="en-US" w:eastAsia="zh-CN"/>
         </w:rPr>
-        <w:t>5.Implement</w:t>
+        <w:t>(1)coding functions</w:t>
       </w:r>
     </w:p>
     <w:p>
@@ -938,7 +2652,7 @@
           <w:rFonts w:hint="default"/>
           <w:lang w:val="en-US" w:eastAsia="zh-CN"/>
         </w:rPr>
-        <w:t>(1)coding functions</w:t>
+        <w:t>(2)coding to test functions</w:t>
       </w:r>
     </w:p>
     <w:p>
@@ -953,13 +2667,6 @@
           <w:lang w:val="en-US" w:eastAsia="zh-CN"/>
         </w:rPr>
       </w:pPr>
-      <w:r>
-        <w:rPr>
-          <w:rFonts w:hint="default"/>
-          <w:lang w:val="en-US" w:eastAsia="zh-CN"/>
-        </w:rPr>
-        <w:t>(2)coding to test functions</w:t>
-      </w:r>
     </w:p>
     <w:p>
       <w:pPr>
@@ -975,10 +2682,28 @@
       </w:pPr>
       <w:r>
         <w:rPr>
-          <w:rFonts w:hint="default"/>
-          <w:lang w:val="en-US" w:eastAsia="zh-CN"/>
-        </w:rPr>
-        <w:t>6.Testing:</w:t>
+          <w:rFonts w:hint="eastAsia"/>
+          <w:lang w:val="en-US" w:eastAsia="zh-CN"/>
+        </w:rPr>
+        <w:t xml:space="preserve">编码开发实现各个具体的function 和 对应的测试Driver </w:t>
+      </w:r>
+    </w:p>
+    <w:p>
+      <w:pPr>
+        <w:pStyle w:val="2"/>
+        <w:bidi w:val="0"/>
+        <w:ind w:left="432" w:leftChars="0" w:hanging="432" w:firstLineChars="0"/>
+        <w:rPr>
+          <w:rFonts w:hint="default"/>
+          <w:lang w:val="en-US" w:eastAsia="zh-CN"/>
+        </w:rPr>
+      </w:pPr>
+      <w:r>
+        <w:rPr>
+          <w:rFonts w:hint="default"/>
+          <w:lang w:val="en-US" w:eastAsia="zh-CN"/>
+        </w:rPr>
+        <w:t>Testing:</w:t>
       </w:r>
     </w:p>
     <w:p>
@@ -1023,8 +2748,11 @@
     </w:p>
     <w:p>
       <w:pPr>
-        <w:rPr>
-          <w:rFonts w:hint="default"/>
+        <w:pStyle w:val="2"/>
+        <w:bidi w:val="0"/>
+        <w:ind w:left="432" w:leftChars="0" w:hanging="432" w:firstLineChars="0"/>
+        <w:rPr>
+          <w:rFonts w:hint="eastAsia"/>
           <w:lang w:val="en-US" w:eastAsia="zh-CN"/>
         </w:rPr>
       </w:pPr>
@@ -1035,10 +2763,25 @@
         </w:rPr>
         <w:br w:type="page"/>
       </w:r>
+      <w:r>
+        <w:rPr>
+          <w:rFonts w:hint="eastAsia"/>
+          <w:lang w:val="en-US" w:eastAsia="zh-CN"/>
+        </w:rPr>
+        <w:t>Development logs</w:t>
+      </w:r>
+    </w:p>
+    <w:p>
+      <w:pPr>
+        <w:rPr>
+          <w:rFonts w:hint="default"/>
+          <w:lang w:val="en-US" w:eastAsia="zh-CN"/>
+        </w:rPr>
+      </w:pPr>
     </w:p>
     <w:tbl>
       <w:tblPr>
-        <w:tblStyle w:val="3"/>
+        <w:tblStyle w:val="12"/>
         <w:tblW w:w="0" w:type="auto"/>
         <w:tblInd w:w="0" w:type="dxa"/>
         <w:tblBorders>
@@ -1074,10 +2817,16 @@
             <w:insideH w:val="single" w:color="auto" w:sz="4" w:space="0"/>
             <w:insideV w:val="single" w:color="auto" w:sz="4" w:space="0"/>
           </w:tblBorders>
+          <w:tblCellMar>
+            <w:top w:w="0" w:type="dxa"/>
+            <w:left w:w="108" w:type="dxa"/>
+            <w:bottom w:w="0" w:type="dxa"/>
+            <w:right w:w="108" w:type="dxa"/>
+          </w:tblCellMar>
         </w:tblPrEx>
         <w:tc>
           <w:tcPr>
-            <w:tcW w:w="1704" w:type="dxa"/>
+            <w:tcW w:w="253" w:type="dxa"/>
           </w:tcPr>
           <w:p>
             <w:pPr>
@@ -1096,7 +2845,7 @@
         </w:tc>
         <w:tc>
           <w:tcPr>
-            <w:tcW w:w="1704" w:type="dxa"/>
+            <w:tcW w:w="1240" w:type="dxa"/>
           </w:tcPr>
           <w:p>
             <w:pPr>
@@ -1123,7 +2872,7 @@
         </w:tc>
         <w:tc>
           <w:tcPr>
-            <w:tcW w:w="1704" w:type="dxa"/>
+            <w:tcW w:w="6521" w:type="dxa"/>
           </w:tcPr>
           <w:p>
             <w:pPr>
@@ -1150,7 +2899,7 @@
         </w:tc>
         <w:tc>
           <w:tcPr>
-            <w:tcW w:w="1705" w:type="dxa"/>
+            <w:tcW w:w="254" w:type="dxa"/>
           </w:tcPr>
           <w:p>
             <w:pPr>
@@ -1169,7 +2918,7 @@
         </w:tc>
         <w:tc>
           <w:tcPr>
-            <w:tcW w:w="1705" w:type="dxa"/>
+            <w:tcW w:w="254" w:type="dxa"/>
           </w:tcPr>
           <w:p>
             <w:pPr>
@@ -1206,7 +2955,7 @@
         </w:tblPrEx>
         <w:tc>
           <w:tcPr>
-            <w:tcW w:w="1704" w:type="dxa"/>
+            <w:tcW w:w="253" w:type="dxa"/>
           </w:tcPr>
           <w:p>
             <w:pPr>
@@ -1225,7 +2974,7 @@
         </w:tc>
         <w:tc>
           <w:tcPr>
-            <w:tcW w:w="1704" w:type="dxa"/>
+            <w:tcW w:w="1240" w:type="dxa"/>
           </w:tcPr>
           <w:p>
             <w:pPr>
@@ -1244,7 +2993,7 @@
         </w:tc>
         <w:tc>
           <w:tcPr>
-            <w:tcW w:w="1704" w:type="dxa"/>
+            <w:tcW w:w="6521" w:type="dxa"/>
           </w:tcPr>
           <w:p>
             <w:pPr>
@@ -1263,7 +3012,7 @@
         </w:tc>
         <w:tc>
           <w:tcPr>
-            <w:tcW w:w="1705" w:type="dxa"/>
+            <w:tcW w:w="254" w:type="dxa"/>
           </w:tcPr>
           <w:p>
             <w:pPr>
@@ -1282,7 +3031,7 @@
         </w:tc>
         <w:tc>
           <w:tcPr>
-            <w:tcW w:w="1705" w:type="dxa"/>
+            <w:tcW w:w="254" w:type="dxa"/>
           </w:tcPr>
           <w:p>
             <w:pPr>
@@ -1319,7 +3068,7 @@
         </w:tblPrEx>
         <w:tc>
           <w:tcPr>
-            <w:tcW w:w="1704" w:type="dxa"/>
+            <w:tcW w:w="253" w:type="dxa"/>
           </w:tcPr>
           <w:p>
             <w:pPr>
@@ -1338,7 +3087,7 @@
         </w:tc>
         <w:tc>
           <w:tcPr>
-            <w:tcW w:w="1704" w:type="dxa"/>
+            <w:tcW w:w="1240" w:type="dxa"/>
           </w:tcPr>
           <w:p>
             <w:pPr>
@@ -1357,7 +3106,7 @@
         </w:tc>
         <w:tc>
           <w:tcPr>
-            <w:tcW w:w="1704" w:type="dxa"/>
+            <w:tcW w:w="6521" w:type="dxa"/>
           </w:tcPr>
           <w:p>
             <w:pPr>
@@ -1376,7 +3125,7 @@
         </w:tc>
         <w:tc>
           <w:tcPr>
-            <w:tcW w:w="1705" w:type="dxa"/>
+            <w:tcW w:w="254" w:type="dxa"/>
           </w:tcPr>
           <w:p>
             <w:pPr>
@@ -1395,7 +3144,7 @@
         </w:tc>
         <w:tc>
           <w:tcPr>
-            <w:tcW w:w="1705" w:type="dxa"/>
+            <w:tcW w:w="254" w:type="dxa"/>
           </w:tcPr>
           <w:p>
             <w:pPr>
@@ -1432,7 +3181,7 @@
         </w:tblPrEx>
         <w:tc>
           <w:tcPr>
-            <w:tcW w:w="1704" w:type="dxa"/>
+            <w:tcW w:w="253" w:type="dxa"/>
           </w:tcPr>
           <w:p>
             <w:pPr>
@@ -1451,7 +3200,7 @@
         </w:tc>
         <w:tc>
           <w:tcPr>
-            <w:tcW w:w="1704" w:type="dxa"/>
+            <w:tcW w:w="1240" w:type="dxa"/>
           </w:tcPr>
           <w:p>
             <w:pPr>
@@ -1478,7 +3227,7 @@
         </w:tc>
         <w:tc>
           <w:tcPr>
-            <w:tcW w:w="1704" w:type="dxa"/>
+            <w:tcW w:w="6521" w:type="dxa"/>
           </w:tcPr>
           <w:p>
             <w:pPr>
@@ -1505,7 +3254,7 @@
         </w:tc>
         <w:tc>
           <w:tcPr>
-            <w:tcW w:w="1705" w:type="dxa"/>
+            <w:tcW w:w="254" w:type="dxa"/>
           </w:tcPr>
           <w:p>
             <w:pPr>
@@ -1524,7 +3273,7 @@
         </w:tc>
         <w:tc>
           <w:tcPr>
-            <w:tcW w:w="1705" w:type="dxa"/>
+            <w:tcW w:w="254" w:type="dxa"/>
           </w:tcPr>
           <w:p>
             <w:pPr>
@@ -1561,7 +3310,7 @@
         </w:tblPrEx>
         <w:tc>
           <w:tcPr>
-            <w:tcW w:w="1704" w:type="dxa"/>
+            <w:tcW w:w="253" w:type="dxa"/>
           </w:tcPr>
           <w:p>
             <w:pPr>
@@ -1580,7 +3329,7 @@
         </w:tc>
         <w:tc>
           <w:tcPr>
-            <w:tcW w:w="1704" w:type="dxa"/>
+            <w:tcW w:w="1240" w:type="dxa"/>
           </w:tcPr>
           <w:p>
             <w:pPr>
@@ -1607,7 +3356,7 @@
         </w:tc>
         <w:tc>
           <w:tcPr>
-            <w:tcW w:w="1704" w:type="dxa"/>
+            <w:tcW w:w="6521" w:type="dxa"/>
           </w:tcPr>
           <w:p>
             <w:pPr>
@@ -1634,7 +3383,7 @@
         </w:tc>
         <w:tc>
           <w:tcPr>
-            <w:tcW w:w="1705" w:type="dxa"/>
+            <w:tcW w:w="254" w:type="dxa"/>
           </w:tcPr>
           <w:p>
             <w:pPr>
@@ -1653,7 +3402,7 @@
         </w:tc>
         <w:tc>
           <w:tcPr>
-            <w:tcW w:w="1705" w:type="dxa"/>
+            <w:tcW w:w="254" w:type="dxa"/>
           </w:tcPr>
           <w:p>
             <w:pPr>
@@ -1690,7 +3439,7 @@
         </w:tblPrEx>
         <w:tc>
           <w:tcPr>
-            <w:tcW w:w="1704" w:type="dxa"/>
+            <w:tcW w:w="253" w:type="dxa"/>
           </w:tcPr>
           <w:p>
             <w:pPr>
@@ -1709,7 +3458,7 @@
         </w:tc>
         <w:tc>
           <w:tcPr>
-            <w:tcW w:w="1704" w:type="dxa"/>
+            <w:tcW w:w="1240" w:type="dxa"/>
           </w:tcPr>
           <w:p>
             <w:pPr>
@@ -1750,7 +3499,7 @@
         </w:tc>
         <w:tc>
           <w:tcPr>
-            <w:tcW w:w="1704" w:type="dxa"/>
+            <w:tcW w:w="6521" w:type="dxa"/>
           </w:tcPr>
           <w:p>
             <w:pPr>
@@ -1791,7 +3540,7 @@
         </w:tc>
         <w:tc>
           <w:tcPr>
-            <w:tcW w:w="1705" w:type="dxa"/>
+            <w:tcW w:w="254" w:type="dxa"/>
           </w:tcPr>
           <w:p>
             <w:pPr>
@@ -1810,7 +3559,7 @@
         </w:tc>
         <w:tc>
           <w:tcPr>
-            <w:tcW w:w="1705" w:type="dxa"/>
+            <w:tcW w:w="254" w:type="dxa"/>
           </w:tcPr>
           <w:p>
             <w:pPr>
@@ -1927,7 +3676,7 @@
         </w:tblPrEx>
         <w:tc>
           <w:tcPr>
-            <w:tcW w:w="1704" w:type="dxa"/>
+            <w:tcW w:w="253" w:type="dxa"/>
           </w:tcPr>
           <w:p>
             <w:pPr>
@@ -1946,7 +3695,7 @@
         </w:tc>
         <w:tc>
           <w:tcPr>
-            <w:tcW w:w="1704" w:type="dxa"/>
+            <w:tcW w:w="1240" w:type="dxa"/>
           </w:tcPr>
           <w:p>
             <w:pPr>
@@ -1973,7 +3722,7 @@
         </w:tc>
         <w:tc>
           <w:tcPr>
-            <w:tcW w:w="1704" w:type="dxa"/>
+            <w:tcW w:w="6521" w:type="dxa"/>
           </w:tcPr>
           <w:p>
             <w:pPr>
@@ -2005,7 +3754,7 @@
         </w:tc>
         <w:tc>
           <w:tcPr>
-            <w:tcW w:w="1705" w:type="dxa"/>
+            <w:tcW w:w="254" w:type="dxa"/>
           </w:tcPr>
           <w:p>
             <w:pPr>
@@ -2024,7 +3773,7 @@
         </w:tc>
         <w:tc>
           <w:tcPr>
-            <w:tcW w:w="1705" w:type="dxa"/>
+            <w:tcW w:w="254" w:type="dxa"/>
           </w:tcPr>
           <w:p>
             <w:pPr>
@@ -2061,7 +3810,7 @@
         </w:tblPrEx>
         <w:tc>
           <w:tcPr>
-            <w:tcW w:w="1704" w:type="dxa"/>
+            <w:tcW w:w="253" w:type="dxa"/>
           </w:tcPr>
           <w:p>
             <w:pPr>
@@ -2080,7 +3829,7 @@
         </w:tc>
         <w:tc>
           <w:tcPr>
-            <w:tcW w:w="1704" w:type="dxa"/>
+            <w:tcW w:w="1240" w:type="dxa"/>
           </w:tcPr>
           <w:p>
             <w:pPr>
@@ -2107,7 +3856,7 @@
         </w:tc>
         <w:tc>
           <w:tcPr>
-            <w:tcW w:w="1704" w:type="dxa"/>
+            <w:tcW w:w="6521" w:type="dxa"/>
           </w:tcPr>
           <w:p>
             <w:pPr>
@@ -2157,7 +3906,7 @@
         </w:tc>
         <w:tc>
           <w:tcPr>
-            <w:tcW w:w="1705" w:type="dxa"/>
+            <w:tcW w:w="254" w:type="dxa"/>
           </w:tcPr>
           <w:p>
             <w:pPr>
@@ -2176,7 +3925,7 @@
         </w:tc>
         <w:tc>
           <w:tcPr>
-            <w:tcW w:w="1705" w:type="dxa"/>
+            <w:tcW w:w="254" w:type="dxa"/>
           </w:tcPr>
           <w:p>
             <w:pPr>
@@ -2255,7 +4004,7 @@
         </w:tblPrEx>
         <w:tc>
           <w:tcPr>
-            <w:tcW w:w="1704" w:type="dxa"/>
+            <w:tcW w:w="253" w:type="dxa"/>
           </w:tcPr>
           <w:p>
             <w:pPr>
@@ -2274,7 +4023,7 @@
         </w:tc>
         <w:tc>
           <w:tcPr>
-            <w:tcW w:w="1704" w:type="dxa"/>
+            <w:tcW w:w="1240" w:type="dxa"/>
           </w:tcPr>
           <w:p>
             <w:pPr>
@@ -2301,7 +4050,7 @@
         </w:tc>
         <w:tc>
           <w:tcPr>
-            <w:tcW w:w="1704" w:type="dxa"/>
+            <w:tcW w:w="6521" w:type="dxa"/>
           </w:tcPr>
           <w:p>
             <w:pPr>
@@ -2343,7 +4092,7 @@
         </w:tc>
         <w:tc>
           <w:tcPr>
-            <w:tcW w:w="1705" w:type="dxa"/>
+            <w:tcW w:w="254" w:type="dxa"/>
           </w:tcPr>
           <w:p>
             <w:pPr>
@@ -2362,7 +4111,7 @@
         </w:tc>
         <w:tc>
           <w:tcPr>
-            <w:tcW w:w="1705" w:type="dxa"/>
+            <w:tcW w:w="254" w:type="dxa"/>
           </w:tcPr>
           <w:p>
             <w:pPr>
@@ -2399,7 +4148,7 @@
         </w:tblPrEx>
         <w:tc>
           <w:tcPr>
-            <w:tcW w:w="1704" w:type="dxa"/>
+            <w:tcW w:w="253" w:type="dxa"/>
           </w:tcPr>
           <w:p>
             <w:pPr>
@@ -2418,7 +4167,7 @@
         </w:tc>
         <w:tc>
           <w:tcPr>
-            <w:tcW w:w="1704" w:type="dxa"/>
+            <w:tcW w:w="1240" w:type="dxa"/>
           </w:tcPr>
           <w:p>
             <w:pPr>
@@ -2445,7 +4194,7 @@
         </w:tc>
         <w:tc>
           <w:tcPr>
-            <w:tcW w:w="1704" w:type="dxa"/>
+            <w:tcW w:w="6521" w:type="dxa"/>
           </w:tcPr>
           <w:p>
             <w:pPr>
@@ -2475,13 +4224,11 @@
               </w:rPr>
               <w:t>I have finished up with the games module and linked it with the main function.</w:t>
             </w:r>
-            <w:bookmarkStart w:id="0" w:name="_GoBack"/>
-            <w:bookmarkEnd w:id="0"/>
-          </w:p>
-        </w:tc>
-        <w:tc>
-          <w:tcPr>
-            <w:tcW w:w="1705" w:type="dxa"/>
+          </w:p>
+        </w:tc>
+        <w:tc>
+          <w:tcPr>
+            <w:tcW w:w="254" w:type="dxa"/>
           </w:tcPr>
           <w:p>
             <w:pPr>
@@ -2500,7 +4247,7 @@
         </w:tc>
         <w:tc>
           <w:tcPr>
-            <w:tcW w:w="1705" w:type="dxa"/>
+            <w:tcW w:w="254" w:type="dxa"/>
           </w:tcPr>
           <w:p>
             <w:pPr>
@@ -2518,6 +4265,144 @@
           </w:p>
         </w:tc>
       </w:tr>
+      <w:tr>
+        <w:tblPrEx>
+          <w:tblBorders>
+            <w:top w:val="single" w:color="auto" w:sz="4" w:space="0"/>
+            <w:left w:val="single" w:color="auto" w:sz="4" w:space="0"/>
+            <w:bottom w:val="single" w:color="auto" w:sz="4" w:space="0"/>
+            <w:right w:val="single" w:color="auto" w:sz="4" w:space="0"/>
+            <w:insideH w:val="single" w:color="auto" w:sz="4" w:space="0"/>
+            <w:insideV w:val="single" w:color="auto" w:sz="4" w:space="0"/>
+          </w:tblBorders>
+          <w:tblCellMar>
+            <w:top w:w="0" w:type="dxa"/>
+            <w:left w:w="108" w:type="dxa"/>
+            <w:bottom w:w="0" w:type="dxa"/>
+            <w:right w:w="108" w:type="dxa"/>
+          </w:tblCellMar>
+        </w:tblPrEx>
+        <w:tc>
+          <w:tcPr>
+            <w:tcW w:w="253" w:type="dxa"/>
+          </w:tcPr>
+          <w:p>
+            <w:pPr>
+              <w:tabs>
+                <w:tab w:val="left" w:pos="5714"/>
+              </w:tabs>
+              <w:bidi w:val="0"/>
+              <w:jc w:val="left"/>
+              <w:rPr>
+                <w:rFonts w:hint="default"/>
+                <w:vertAlign w:val="baseline"/>
+                <w:lang w:val="en-US" w:eastAsia="zh-CN"/>
+              </w:rPr>
+            </w:pPr>
+          </w:p>
+        </w:tc>
+        <w:tc>
+          <w:tcPr>
+            <w:tcW w:w="1240" w:type="dxa"/>
+          </w:tcPr>
+          <w:p>
+            <w:pPr>
+              <w:tabs>
+                <w:tab w:val="left" w:pos="5714"/>
+              </w:tabs>
+              <w:bidi w:val="0"/>
+              <w:jc w:val="left"/>
+              <w:rPr>
+                <w:rFonts w:hint="default"/>
+                <w:vertAlign w:val="baseline"/>
+                <w:lang w:val="en-US" w:eastAsia="zh-CN"/>
+              </w:rPr>
+            </w:pPr>
+            <w:r>
+              <w:rPr>
+                <w:rFonts w:hint="eastAsia"/>
+                <w:vertAlign w:val="baseline"/>
+                <w:lang w:val="en-US" w:eastAsia="zh-CN"/>
+              </w:rPr>
+              <w:t>2025/4/27</w:t>
+            </w:r>
+          </w:p>
+        </w:tc>
+        <w:tc>
+          <w:tcPr>
+            <w:tcW w:w="6521" w:type="dxa"/>
+          </w:tcPr>
+          <w:p>
+            <w:pPr>
+              <w:numPr>
+                <w:ilvl w:val="0"/>
+                <w:numId w:val="0"/>
+              </w:numPr>
+              <w:tabs>
+                <w:tab w:val="left" w:pos="1274"/>
+                <w:tab w:val="left" w:pos="5714"/>
+                <w:tab w:val="right" w:pos="6425"/>
+              </w:tabs>
+              <w:bidi w:val="0"/>
+              <w:ind w:leftChars="0"/>
+              <w:jc w:val="left"/>
+              <w:rPr>
+                <w:rFonts w:hint="default"/>
+                <w:vertAlign w:val="baseline"/>
+                <w:lang w:val="en-US" w:eastAsia="zh-CN"/>
+              </w:rPr>
+            </w:pPr>
+            <w:bookmarkStart w:id="0" w:name="_GoBack"/>
+            <w:r>
+              <w:rPr>
+                <w:rFonts w:hint="eastAsia"/>
+                <w:vertAlign w:val="baseline"/>
+                <w:lang w:val="en-US" w:eastAsia="zh-CN"/>
+              </w:rPr>
+              <w:t>I have improved the project code,corrected some errors and updated the project development doc.</w:t>
+            </w:r>
+            <w:bookmarkEnd w:id="0"/>
+          </w:p>
+        </w:tc>
+        <w:tc>
+          <w:tcPr>
+            <w:tcW w:w="254" w:type="dxa"/>
+          </w:tcPr>
+          <w:p>
+            <w:pPr>
+              <w:tabs>
+                <w:tab w:val="left" w:pos="5714"/>
+              </w:tabs>
+              <w:bidi w:val="0"/>
+              <w:jc w:val="left"/>
+              <w:rPr>
+                <w:rFonts w:hint="default"/>
+                <w:vertAlign w:val="baseline"/>
+                <w:lang w:val="en-US" w:eastAsia="zh-CN"/>
+              </w:rPr>
+            </w:pPr>
+          </w:p>
+        </w:tc>
+        <w:tc>
+          <w:tcPr>
+            <w:tcW w:w="254" w:type="dxa"/>
+          </w:tcPr>
+          <w:p>
+            <w:pPr>
+              <w:tabs>
+                <w:tab w:val="left" w:pos="5714"/>
+              </w:tabs>
+              <w:bidi w:val="0"/>
+              <w:jc w:val="left"/>
+              <w:rPr>
+                <w:rFonts w:hint="eastAsia"/>
+                <w:vertAlign w:val="baseline"/>
+                <w:lang w:val="en-US" w:eastAsia="zh-CN"/>
+              </w:rPr>
+            </w:pPr>
+          </w:p>
+        </w:tc>
+      </w:tr>
     </w:tbl>
     <w:p>
       <w:pPr>
@@ -2531,13 +4416,794 @@
           <w:lang w:val="en-US" w:eastAsia="zh-CN"/>
         </w:rPr>
       </w:pPr>
-      <w:r>
-        <w:rPr>
-          <w:rFonts w:hint="default"/>
-          <w:lang w:val="en-US" w:eastAsia="zh-CN"/>
-        </w:rPr>
-        <w:tab/>
-      </w:r>
+    </w:p>
+    <w:p>
+      <w:pPr>
+        <w:tabs>
+          <w:tab w:val="left" w:pos="5714"/>
+        </w:tabs>
+        <w:bidi w:val="0"/>
+        <w:jc w:val="left"/>
+        <w:rPr>
+          <w:rFonts w:hint="default"/>
+          <w:lang w:val="en-US" w:eastAsia="zh-CN"/>
+        </w:rPr>
+      </w:pPr>
+    </w:p>
+    <w:p>
+      <w:pPr>
+        <w:pStyle w:val="2"/>
+        <w:bidi w:val="0"/>
+        <w:ind w:left="432" w:leftChars="0" w:hanging="432" w:firstLineChars="0"/>
+        <w:rPr>
+          <w:rFonts w:hint="default"/>
+          <w:lang w:val="en-US" w:eastAsia="zh-CN"/>
+        </w:rPr>
+      </w:pPr>
+      <w:r>
+        <w:rPr>
+          <w:rFonts w:hint="eastAsia"/>
+          <w:lang w:val="en-US" w:eastAsia="zh-CN"/>
+        </w:rPr>
+        <w:t>Reference</w:t>
+      </w:r>
+    </w:p>
+    <w:p>
+      <w:pPr>
+        <w:pStyle w:val="3"/>
+        <w:bidi w:val="0"/>
+        <w:ind w:left="575" w:leftChars="0" w:hanging="575" w:firstLineChars="0"/>
+        <w:rPr>
+          <w:rFonts w:hint="default"/>
+          <w:b/>
+          <w:lang w:val="en-US" w:eastAsia="zh-CN"/>
+        </w:rPr>
+      </w:pPr>
+      <w:r>
+        <w:rPr>
+          <w:rFonts w:hint="default"/>
+          <w:b/>
+          <w:lang w:val="en-US" w:eastAsia="zh-CN"/>
+        </w:rPr>
+        <w:t>Project Reference</w:t>
+      </w:r>
+    </w:p>
+    <w:p>
+      <w:pPr>
+        <w:rPr>
+          <w:rFonts w:hint="default"/>
+          <w:lang w:val="en-US" w:eastAsia="zh-CN"/>
+        </w:rPr>
+      </w:pPr>
+      <w:r>
+        <w:rPr>
+          <w:rFonts w:hint="default"/>
+          <w:lang w:val="en-US" w:eastAsia="zh-CN"/>
+        </w:rPr>
+        <w:t>1.Matlab课程视频与习题；</w:t>
+      </w:r>
+    </w:p>
+    <w:p>
+      <w:pPr>
+        <w:rPr>
+          <w:rFonts w:hint="default"/>
+          <w:lang w:val="en-US" w:eastAsia="zh-CN"/>
+        </w:rPr>
+      </w:pPr>
+      <w:r>
+        <w:rPr>
+          <w:rFonts w:hint="default"/>
+          <w:lang w:val="en-US" w:eastAsia="zh-CN"/>
+        </w:rPr>
+        <w:t>2.课程教材；</w:t>
+      </w:r>
+    </w:p>
+    <w:p>
+      <w:pPr>
+        <w:pStyle w:val="3"/>
+        <w:bidi w:val="0"/>
+        <w:ind w:left="575" w:leftChars="0" w:hanging="575" w:firstLineChars="0"/>
+        <w:rPr>
+          <w:rFonts w:hint="default"/>
+          <w:b/>
+          <w:lang w:val="en-US" w:eastAsia="zh-CN"/>
+        </w:rPr>
+      </w:pPr>
+      <w:r>
+        <w:rPr>
+          <w:rFonts w:hint="default"/>
+          <w:b/>
+          <w:lang w:val="en-US" w:eastAsia="zh-CN"/>
+        </w:rPr>
+        <w:t>Git及服务平台和工具，</w:t>
+      </w:r>
+    </w:p>
+    <w:p>
+      <w:pPr>
+        <w:rPr>
+          <w:rFonts w:hint="default"/>
+          <w:lang w:val="en-US" w:eastAsia="zh-CN"/>
+        </w:rPr>
+      </w:pPr>
+    </w:p>
+    <w:p>
+      <w:pPr>
+        <w:rPr>
+          <w:rFonts w:hint="default"/>
+          <w:lang w:val="en-US" w:eastAsia="zh-CN"/>
+        </w:rPr>
+      </w:pPr>
+      <w:r>
+        <w:rPr>
+          <w:rFonts w:hint="default"/>
+          <w:lang w:val="en-US" w:eastAsia="zh-CN"/>
+        </w:rPr>
+        <w:t>如 github , tortoiseGit</w:t>
+      </w:r>
+    </w:p>
+    <w:p>
+      <w:pPr>
+        <w:rPr>
+          <w:rFonts w:hint="default"/>
+          <w:lang w:val="en-US" w:eastAsia="zh-CN"/>
+        </w:rPr>
+      </w:pPr>
+      <w:r>
+        <w:rPr>
+          <w:rFonts w:hint="default"/>
+          <w:lang w:val="en-US" w:eastAsia="zh-CN"/>
+        </w:rPr>
+        <w:t>github.com</w:t>
+      </w:r>
+    </w:p>
+    <w:p>
+      <w:pPr>
+        <w:rPr>
+          <w:rFonts w:hint="default"/>
+          <w:lang w:val="en-US" w:eastAsia="zh-CN"/>
+        </w:rPr>
+      </w:pPr>
+    </w:p>
+    <w:p>
+      <w:pPr>
+        <w:rPr>
+          <w:rFonts w:hint="default"/>
+          <w:lang w:val="en-US" w:eastAsia="zh-CN"/>
+        </w:rPr>
+      </w:pPr>
+      <w:r>
+        <w:rPr>
+          <w:rFonts w:hint="default"/>
+          <w:lang w:val="en-US" w:eastAsia="zh-CN"/>
+        </w:rPr>
+        <w:t>https://tortoisegit.org/</w:t>
+      </w:r>
+    </w:p>
+    <w:p>
+      <w:pPr>
+        <w:rPr>
+          <w:rFonts w:hint="default"/>
+          <w:lang w:val="en-US" w:eastAsia="zh-CN"/>
+        </w:rPr>
+      </w:pPr>
+      <w:r>
+        <w:rPr>
+          <w:rFonts w:hint="default"/>
+          <w:lang w:val="en-US" w:eastAsia="zh-CN"/>
+        </w:rPr>
+        <w:t>(1)TortoiseGit Tutorial – How To Use TortoiseGit For Version Control</w:t>
+      </w:r>
+    </w:p>
+    <w:p>
+      <w:pPr>
+        <w:rPr>
+          <w:rFonts w:hint="default"/>
+          <w:b/>
+          <w:lang w:val="en-US" w:eastAsia="zh-CN"/>
+        </w:rPr>
+      </w:pPr>
+      <w:r>
+        <w:rPr>
+          <w:rFonts w:hint="default"/>
+          <w:lang w:val="en-US" w:eastAsia="zh-CN"/>
+        </w:rPr>
+        <w:t>https://www.softwaretestinghelp.com/tortoisegit-tutorial/</w:t>
+      </w:r>
+    </w:p>
+    <w:p>
+      <w:pPr>
+        <w:pStyle w:val="3"/>
+        <w:bidi w:val="0"/>
+        <w:ind w:left="575" w:leftChars="0" w:hanging="575" w:firstLineChars="0"/>
+        <w:rPr>
+          <w:rFonts w:hint="default"/>
+          <w:b/>
+          <w:lang w:val="en-US" w:eastAsia="zh-CN"/>
+        </w:rPr>
+      </w:pPr>
+      <w:r>
+        <w:rPr>
+          <w:rFonts w:hint="default"/>
+          <w:b/>
+          <w:lang w:val="en-US" w:eastAsia="zh-CN"/>
+        </w:rPr>
+        <w:t>互联网上搜索到的元素周期表的相关资源与数据；</w:t>
+      </w:r>
+    </w:p>
+    <w:p>
+      <w:pPr>
+        <w:rPr>
+          <w:rFonts w:hint="default"/>
+          <w:lang w:val="en-US" w:eastAsia="zh-CN"/>
+        </w:rPr>
+      </w:pPr>
+      <w:r>
+        <w:rPr>
+          <w:rFonts w:hint="default"/>
+          <w:lang w:val="en-US" w:eastAsia="zh-CN"/>
+        </w:rPr>
+        <w:t>https://en.wikipedia.org/wiki/List_of_chemical_elements</w:t>
+      </w:r>
+    </w:p>
+    <w:p>
+      <w:pPr>
+        <w:rPr>
+          <w:rFonts w:hint="default"/>
+          <w:lang w:val="en-US" w:eastAsia="zh-CN"/>
+        </w:rPr>
+      </w:pPr>
+      <w:r>
+        <w:rPr>
+          <w:rFonts w:hint="default"/>
+          <w:lang w:val="en-US" w:eastAsia="zh-CN"/>
+        </w:rPr>
+        <w:t>https://github.com/Bowserinator/Periodic-Table-JSON/blob/master/PeriodicTableCSV.csv</w:t>
+      </w:r>
+    </w:p>
+    <w:p>
+      <w:pPr>
+        <w:rPr>
+          <w:rFonts w:hint="default"/>
+          <w:lang w:val="en-US" w:eastAsia="zh-CN"/>
+        </w:rPr>
+      </w:pPr>
+      <w:r>
+        <w:rPr>
+          <w:rFonts w:hint="default"/>
+          <w:lang w:val="en-US" w:eastAsia="zh-CN"/>
+        </w:rPr>
+        <w:t>https://pubchem.ncbi.nlm.nih.gov/periodic-table/</w:t>
+      </w:r>
+    </w:p>
+    <w:p>
+      <w:pPr>
+        <w:rPr>
+          <w:rFonts w:hint="default"/>
+          <w:lang w:val="en-US" w:eastAsia="zh-CN"/>
+        </w:rPr>
+      </w:pPr>
+    </w:p>
+    <w:p>
+      <w:pPr>
+        <w:rPr>
+          <w:rFonts w:hint="default"/>
+          <w:lang w:val="en-US" w:eastAsia="zh-CN"/>
+        </w:rPr>
+      </w:pPr>
+    </w:p>
+    <w:p>
+      <w:pPr>
+        <w:rPr>
+          <w:rFonts w:hint="default"/>
+          <w:lang w:val="en-US" w:eastAsia="zh-CN"/>
+        </w:rPr>
+      </w:pPr>
+    </w:p>
+    <w:p>
+      <w:pPr>
+        <w:pStyle w:val="3"/>
+        <w:bidi w:val="0"/>
+        <w:ind w:left="575" w:leftChars="0" w:hanging="575" w:firstLineChars="0"/>
+        <w:rPr>
+          <w:rFonts w:hint="default"/>
+          <w:b/>
+          <w:lang w:val="en-US" w:eastAsia="zh-CN"/>
+        </w:rPr>
+      </w:pPr>
+      <w:r>
+        <w:rPr>
+          <w:rFonts w:hint="default"/>
+          <w:b/>
+          <w:lang w:val="en-US" w:eastAsia="zh-CN"/>
+        </w:rPr>
+        <w:t>Matlab 官方网站上的学习资料；</w:t>
+      </w:r>
+    </w:p>
+    <w:p>
+      <w:pPr>
+        <w:rPr>
+          <w:rFonts w:hint="default"/>
+          <w:lang w:val="en-US" w:eastAsia="zh-CN"/>
+        </w:rPr>
+      </w:pPr>
+      <w:r>
+        <w:rPr>
+          <w:rFonts w:hint="default"/>
+          <w:lang w:val="en-US" w:eastAsia="zh-CN"/>
+        </w:rPr>
+        <w:t>(1)Getting Started with MATLAB</w:t>
+      </w:r>
+    </w:p>
+    <w:p>
+      <w:pPr>
+        <w:rPr>
+          <w:rFonts w:hint="default"/>
+          <w:lang w:val="en-US" w:eastAsia="zh-CN"/>
+        </w:rPr>
+      </w:pPr>
+      <w:r>
+        <w:rPr>
+          <w:rFonts w:hint="default"/>
+          <w:lang w:val="en-US" w:eastAsia="zh-CN"/>
+        </w:rPr>
+        <w:t>https://ww2.mathworks.cn/en/products/matlab/getting-started.html</w:t>
+      </w:r>
+    </w:p>
+    <w:p>
+      <w:pPr>
+        <w:rPr>
+          <w:rFonts w:hint="default"/>
+          <w:lang w:val="en-US" w:eastAsia="zh-CN"/>
+        </w:rPr>
+      </w:pPr>
+    </w:p>
+    <w:p>
+      <w:pPr>
+        <w:rPr>
+          <w:rFonts w:hint="default"/>
+          <w:lang w:val="en-US" w:eastAsia="zh-CN"/>
+        </w:rPr>
+      </w:pPr>
+    </w:p>
+    <w:p>
+      <w:pPr>
+        <w:pStyle w:val="3"/>
+        <w:bidi w:val="0"/>
+        <w:ind w:left="575" w:leftChars="0" w:hanging="575" w:firstLineChars="0"/>
+        <w:rPr>
+          <w:rFonts w:hint="default"/>
+          <w:b/>
+          <w:lang w:val="en-US" w:eastAsia="zh-CN"/>
+        </w:rPr>
+      </w:pPr>
+      <w:r>
+        <w:rPr>
+          <w:rFonts w:hint="default"/>
+          <w:b/>
+          <w:lang w:val="en-US" w:eastAsia="zh-CN"/>
+        </w:rPr>
+        <w:t>youtube的相关教程；</w:t>
+      </w:r>
+    </w:p>
+    <w:p>
+      <w:pPr>
+        <w:rPr>
+          <w:rFonts w:hint="default"/>
+          <w:lang w:val="en-US" w:eastAsia="zh-CN"/>
+        </w:rPr>
+      </w:pPr>
+      <w:r>
+        <w:rPr>
+          <w:rFonts w:hint="default"/>
+          <w:lang w:val="en-US" w:eastAsia="zh-CN"/>
+        </w:rPr>
+        <w:t>(1)MATLAB tutorial: IF/SWITCH/FOR/WHILE/FUNCTION</w:t>
+      </w:r>
+    </w:p>
+    <w:p>
+      <w:pPr>
+        <w:rPr>
+          <w:rFonts w:hint="default"/>
+          <w:lang w:val="en-US" w:eastAsia="zh-CN"/>
+        </w:rPr>
+      </w:pPr>
+      <w:r>
+        <w:rPr>
+          <w:rFonts w:hint="default"/>
+          <w:lang w:val="en-US" w:eastAsia="zh-CN"/>
+        </w:rPr>
+        <w:t xml:space="preserve"> https://www.youtube.com/watch?v=q5bjnC5CbjU</w:t>
+      </w:r>
+    </w:p>
+    <w:p>
+      <w:pPr>
+        <w:rPr>
+          <w:rFonts w:hint="default"/>
+          <w:lang w:val="en-US" w:eastAsia="zh-CN"/>
+        </w:rPr>
+      </w:pPr>
+      <w:r>
+        <w:rPr>
+          <w:rFonts w:hint="default"/>
+          <w:lang w:val="en-US" w:eastAsia="zh-CN"/>
+        </w:rPr>
+        <w:t>(2)Learn TortoiseGit Tool for Git Operations</w:t>
+      </w:r>
+    </w:p>
+    <w:p>
+      <w:pPr>
+        <w:rPr>
+          <w:rFonts w:hint="default"/>
+          <w:lang w:val="en-US" w:eastAsia="zh-CN"/>
+        </w:rPr>
+      </w:pPr>
+      <w:r>
+        <w:rPr>
+          <w:rFonts w:hint="default"/>
+          <w:lang w:val="en-US" w:eastAsia="zh-CN"/>
+        </w:rPr>
+        <w:t>①TortoiseGit Tutorial 1: How git works</w:t>
+      </w:r>
+    </w:p>
+    <w:p>
+      <w:pPr>
+        <w:rPr>
+          <w:rFonts w:hint="default"/>
+          <w:lang w:val="en-US" w:eastAsia="zh-CN"/>
+        </w:rPr>
+      </w:pPr>
+      <w:r>
+        <w:rPr>
+          <w:rFonts w:hint="default"/>
+          <w:lang w:val="en-US" w:eastAsia="zh-CN"/>
+        </w:rPr>
+        <w:t>https://www.youtube.com/watch?v=N1KNw1tr47k&amp;list=PLMJfvBwcOl66_1UJV8ywUoL7mZFPIMJKx&amp;index=1</w:t>
+      </w:r>
+    </w:p>
+    <w:p>
+      <w:pPr>
+        <w:rPr>
+          <w:rFonts w:hint="default"/>
+          <w:lang w:val="en-US" w:eastAsia="zh-CN"/>
+        </w:rPr>
+      </w:pPr>
+      <w:r>
+        <w:rPr>
+          <w:rFonts w:hint="default"/>
+          <w:lang w:val="en-US" w:eastAsia="zh-CN"/>
+        </w:rPr>
+        <w:t>②TortoiseGit Tutorial 2: How to clone Git Repository</w:t>
+      </w:r>
+    </w:p>
+    <w:p>
+      <w:pPr>
+        <w:rPr>
+          <w:rFonts w:hint="default"/>
+          <w:lang w:val="en-US" w:eastAsia="zh-CN"/>
+        </w:rPr>
+      </w:pPr>
+      <w:r>
+        <w:rPr>
+          <w:rFonts w:hint="default"/>
+          <w:lang w:val="en-US" w:eastAsia="zh-CN"/>
+        </w:rPr>
+        <w:t>https://www.youtube.com/watch?v=51A3K8up51E&amp;list=PLMJfvBwcOl66_1UJV8ywUoL7mZFPIMJKx&amp;index=2</w:t>
+      </w:r>
+    </w:p>
+    <w:p>
+      <w:pPr>
+        <w:rPr>
+          <w:rFonts w:hint="default"/>
+          <w:lang w:val="en-US" w:eastAsia="zh-CN"/>
+        </w:rPr>
+      </w:pPr>
+      <w:r>
+        <w:rPr>
+          <w:rFonts w:hint="default"/>
+          <w:lang w:val="en-US" w:eastAsia="zh-CN"/>
+        </w:rPr>
+        <w:t>③TortoiseGit Tutorial 3: git add (staging) , commit and push</w:t>
+      </w:r>
+    </w:p>
+    <w:p>
+      <w:pPr>
+        <w:rPr>
+          <w:rFonts w:hint="default"/>
+          <w:lang w:val="en-US" w:eastAsia="zh-CN"/>
+        </w:rPr>
+      </w:pPr>
+      <w:r>
+        <w:rPr>
+          <w:rFonts w:hint="default"/>
+          <w:lang w:val="en-US" w:eastAsia="zh-CN"/>
+        </w:rPr>
+        <w:t>https://www.youtube.com/watch?v=ntx5n_KTk1Y&amp;list=PLMJfvBwcOl66_1UJV8ywUoL7mZFPIMJKx&amp;index=3</w:t>
+      </w:r>
+    </w:p>
+    <w:p>
+      <w:pPr>
+        <w:rPr>
+          <w:rFonts w:hint="default"/>
+          <w:lang w:val="en-US" w:eastAsia="zh-CN"/>
+        </w:rPr>
+      </w:pPr>
+    </w:p>
+    <w:p>
+      <w:pPr>
+        <w:pStyle w:val="2"/>
+        <w:bidi w:val="0"/>
+        <w:ind w:left="432" w:leftChars="0" w:hanging="432" w:firstLineChars="0"/>
+        <w:rPr>
+          <w:rFonts w:hint="eastAsia"/>
+          <w:lang w:val="en-US" w:eastAsia="zh-CN"/>
+        </w:rPr>
+      </w:pPr>
+      <w:r>
+        <w:rPr>
+          <w:rFonts w:hint="eastAsia"/>
+          <w:lang w:val="en-US" w:eastAsia="zh-CN"/>
+        </w:rPr>
+        <w:t>Self assessment</w:t>
+      </w:r>
+    </w:p>
+    <w:p>
+      <w:pPr>
+        <w:bidi w:val="0"/>
+        <w:rPr>
+          <w:rFonts w:hint="eastAsia"/>
+          <w:lang w:val="en-US" w:eastAsia="zh-CN"/>
+        </w:rPr>
+      </w:pPr>
+      <w:r>
+        <w:rPr>
+          <w:rFonts w:hint="eastAsia"/>
+          <w:lang w:val="en-US" w:eastAsia="zh-CN"/>
+        </w:rPr>
+        <w:br w:type="textWrapping"/>
+      </w:r>
+      <w:r>
+        <w:rPr>
+          <w:rFonts w:hint="eastAsia"/>
+          <w:lang w:val="en-US" w:eastAsia="zh-CN"/>
+        </w:rPr>
+        <w:t>MATLAB programming concepts including:</w:t>
+      </w:r>
+    </w:p>
+    <w:p>
+      <w:pPr>
+        <w:bidi w:val="0"/>
+        <w:rPr>
+          <w:rFonts w:hint="eastAsia"/>
+          <w:lang w:val="en-US" w:eastAsia="zh-CN"/>
+        </w:rPr>
+      </w:pPr>
+    </w:p>
+    <w:p>
+      <w:pPr>
+        <w:numPr>
+          <w:ilvl w:val="0"/>
+          <w:numId w:val="5"/>
+        </w:numPr>
+        <w:bidi w:val="0"/>
+        <w:ind w:left="425" w:leftChars="0" w:hanging="425" w:firstLineChars="0"/>
+        <w:rPr>
+          <w:rFonts w:hint="eastAsia"/>
+          <w:lang w:val="en-US" w:eastAsia="zh-CN"/>
+        </w:rPr>
+      </w:pPr>
+      <w:r>
+        <w:rPr>
+          <w:rFonts w:hint="eastAsia"/>
+          <w:lang w:val="en-US" w:eastAsia="zh-CN"/>
+        </w:rPr>
+        <w:t xml:space="preserve">Loops </w:t>
+      </w:r>
+    </w:p>
+    <w:p>
+      <w:pPr>
+        <w:bidi w:val="0"/>
+        <w:rPr>
+          <w:rFonts w:hint="default"/>
+          <w:lang w:val="en-US" w:eastAsia="zh-CN"/>
+        </w:rPr>
+      </w:pPr>
+      <w:r>
+        <w:rPr>
+          <w:rFonts w:hint="eastAsia"/>
+          <w:lang w:val="en-US" w:eastAsia="zh-CN"/>
+        </w:rPr>
+        <w:t>I have used loops in various functions throughout my project. Such as in function main, queryElements and gamingElements , i used while loop with switch as the coordinator for sub module choice.</w:t>
+      </w:r>
+    </w:p>
+    <w:p>
+      <w:pPr>
+        <w:numPr>
+          <w:ilvl w:val="0"/>
+          <w:numId w:val="5"/>
+        </w:numPr>
+        <w:bidi w:val="0"/>
+        <w:ind w:left="425" w:leftChars="0" w:hanging="425" w:firstLineChars="0"/>
+        <w:rPr>
+          <w:rFonts w:hint="eastAsia"/>
+          <w:lang w:val="en-US" w:eastAsia="zh-CN"/>
+        </w:rPr>
+      </w:pPr>
+      <w:r>
+        <w:rPr>
+          <w:rFonts w:hint="eastAsia"/>
+          <w:lang w:val="en-US" w:eastAsia="zh-CN"/>
+        </w:rPr>
+        <w:t>Vectors</w:t>
+      </w:r>
+    </w:p>
+    <w:p>
+      <w:pPr>
+        <w:numPr>
+          <w:numId w:val="0"/>
+        </w:numPr>
+        <w:bidi w:val="0"/>
+        <w:ind w:leftChars="0" w:firstLine="420" w:firstLineChars="0"/>
+        <w:rPr>
+          <w:rFonts w:hint="default"/>
+          <w:lang w:val="en-US" w:eastAsia="zh-CN"/>
+        </w:rPr>
+      </w:pPr>
+      <w:r>
+        <w:rPr>
+          <w:rFonts w:hint="eastAsia"/>
+          <w:lang w:val="en-US" w:eastAsia="zh-CN"/>
+        </w:rPr>
+        <w:t>I used vector in my queryByPeriod function in order to store the ultimate result in the foundResult vector.</w:t>
+      </w:r>
+    </w:p>
+    <w:p>
+      <w:pPr>
+        <w:bidi w:val="0"/>
+        <w:rPr>
+          <w:rFonts w:hint="eastAsia"/>
+          <w:lang w:val="en-US" w:eastAsia="zh-CN"/>
+        </w:rPr>
+      </w:pPr>
+    </w:p>
+    <w:p>
+      <w:pPr>
+        <w:numPr>
+          <w:ilvl w:val="0"/>
+          <w:numId w:val="5"/>
+        </w:numPr>
+        <w:bidi w:val="0"/>
+        <w:ind w:left="425" w:leftChars="0" w:hanging="425" w:firstLineChars="0"/>
+        <w:rPr>
+          <w:rFonts w:hint="eastAsia"/>
+          <w:lang w:val="en-US" w:eastAsia="zh-CN"/>
+        </w:rPr>
+      </w:pPr>
+      <w:r>
+        <w:rPr>
+          <w:rFonts w:hint="eastAsia"/>
+          <w:lang w:val="en-US" w:eastAsia="zh-CN"/>
+        </w:rPr>
+        <w:t>Matrices</w:t>
+      </w:r>
+    </w:p>
+    <w:p>
+      <w:pPr>
+        <w:numPr>
+          <w:numId w:val="0"/>
+        </w:numPr>
+        <w:bidi w:val="0"/>
+        <w:ind w:leftChars="0"/>
+        <w:rPr>
+          <w:rFonts w:hint="default"/>
+          <w:lang w:val="en-US" w:eastAsia="zh-CN"/>
+        </w:rPr>
+      </w:pPr>
+      <w:r>
+        <w:rPr>
+          <w:rFonts w:hint="eastAsia"/>
+          <w:lang w:val="en-US" w:eastAsia="zh-CN"/>
+        </w:rPr>
+        <w:t>I used a string elementMatrix[maxPeriod,maxGroup] in loadElements function to store all the element symbols and display this matrix in command window.</w:t>
+      </w:r>
+    </w:p>
+    <w:p>
+      <w:pPr>
+        <w:numPr>
+          <w:ilvl w:val="0"/>
+          <w:numId w:val="5"/>
+        </w:numPr>
+        <w:bidi w:val="0"/>
+        <w:ind w:left="425" w:leftChars="0" w:hanging="425" w:firstLineChars="0"/>
+        <w:rPr>
+          <w:rFonts w:hint="eastAsia"/>
+          <w:lang w:val="en-US" w:eastAsia="zh-CN"/>
+        </w:rPr>
+      </w:pPr>
+      <w:r>
+        <w:rPr>
+          <w:rFonts w:hint="eastAsia"/>
+          <w:lang w:val="en-US" w:eastAsia="zh-CN"/>
+        </w:rPr>
+        <w:t>Conditional execution</w:t>
+      </w:r>
+    </w:p>
+    <w:p>
+      <w:pPr>
+        <w:numPr>
+          <w:numId w:val="0"/>
+        </w:numPr>
+        <w:bidi w:val="0"/>
+        <w:ind w:leftChars="0" w:firstLine="420" w:firstLineChars="0"/>
+        <w:rPr>
+          <w:rFonts w:hint="default"/>
+          <w:lang w:val="en-US" w:eastAsia="zh-CN"/>
+        </w:rPr>
+      </w:pPr>
+      <w:r>
+        <w:rPr>
+          <w:rFonts w:hint="eastAsia"/>
+          <w:lang w:val="en-US" w:eastAsia="zh-CN"/>
+        </w:rPr>
+        <w:t xml:space="preserve">I have used massive amount of conditional executions in different functions(queryByAtomicNumber,queryByPeriod). For example(if,else and switch). </w:t>
+      </w:r>
+    </w:p>
+    <w:p>
+      <w:pPr>
+        <w:numPr>
+          <w:numId w:val="0"/>
+        </w:numPr>
+        <w:bidi w:val="0"/>
+        <w:ind w:leftChars="0" w:firstLine="420" w:firstLineChars="0"/>
+        <w:rPr>
+          <w:rFonts w:hint="eastAsia"/>
+          <w:lang w:val="en-US" w:eastAsia="zh-CN"/>
+        </w:rPr>
+      </w:pPr>
+    </w:p>
+    <w:p>
+      <w:pPr>
+        <w:numPr>
+          <w:ilvl w:val="0"/>
+          <w:numId w:val="5"/>
+        </w:numPr>
+        <w:bidi w:val="0"/>
+        <w:ind w:left="425" w:leftChars="0" w:hanging="425" w:firstLineChars="0"/>
+        <w:rPr>
+          <w:rFonts w:hint="default"/>
+          <w:lang w:val="en-US" w:eastAsia="zh-CN"/>
+        </w:rPr>
+      </w:pPr>
+      <w:r>
+        <w:rPr>
+          <w:rFonts w:hint="eastAsia"/>
+          <w:lang w:val="en-US" w:eastAsia="zh-CN"/>
+        </w:rPr>
+        <w:t>Function</w:t>
+      </w:r>
+    </w:p>
+    <w:p>
+      <w:pPr>
+        <w:bidi w:val="0"/>
+        <w:rPr>
+          <w:rFonts w:hint="default"/>
+          <w:lang w:val="en-US" w:eastAsia="zh-CN"/>
+        </w:rPr>
+      </w:pPr>
+      <w:r>
+        <w:rPr>
+          <w:rFonts w:hint="eastAsia"/>
+          <w:lang w:val="en-US" w:eastAsia="zh-CN"/>
+        </w:rPr>
+        <w:t>I have built a series of functions with each functioning distinctly.(such as the queryByNumber function,the queryByName function and the gamingPeriod function.etc.)</w:t>
+      </w:r>
+    </w:p>
+    <w:p>
+      <w:pPr>
+        <w:rPr>
+          <w:rFonts w:hint="default"/>
+          <w:lang w:val="en-US" w:eastAsia="zh-CN"/>
+        </w:rPr>
+      </w:pPr>
     </w:p>
     <w:sectPr>
       <w:pgSz w:w="11906" w:h="16838"/>
@@ -2705,22 +5371,6 @@
     </w:lvl>
   </w:abstractNum>
   <w:abstractNum w:abstractNumId="2">
-    <w:nsid w:val="E952FC89"/>
-    <w:multiLevelType w:val="singleLevel"/>
-    <w:tmpl w:val="E952FC89"/>
-    <w:lvl w:ilvl="0" w:tentative="0">
-      <w:start w:val="1"/>
-      <w:numFmt w:val="decimal"/>
-      <w:lvlText w:val="%1."/>
-      <w:lvlJc w:val="left"/>
-      <w:pPr>
-        <w:tabs>
-          <w:tab w:val="left" w:pos="312"/>
-        </w:tabs>
-      </w:pPr>
-    </w:lvl>
-  </w:abstractNum>
-  <w:abstractNum w:abstractNumId="3">
     <w:nsid w:val="F3CC7582"/>
     <w:multiLevelType w:val="singleLevel"/>
     <w:tmpl w:val="F3CC7582"/>
@@ -2732,17 +5382,159 @@
       <w:lvlJc w:val="left"/>
     </w:lvl>
   </w:abstractNum>
+  <w:abstractNum w:abstractNumId="3">
+    <w:nsid w:val="1D1338F5"/>
+    <w:multiLevelType w:val="multilevel"/>
+    <w:tmpl w:val="1D1338F5"/>
+    <w:lvl w:ilvl="0" w:tentative="0">
+      <w:start w:val="1"/>
+      <w:numFmt w:val="decimal"/>
+      <w:pStyle w:val="2"/>
+      <w:lvlText w:val="%1."/>
+      <w:lvlJc w:val="left"/>
+      <w:pPr>
+        <w:ind w:left="432" w:hanging="432"/>
+      </w:pPr>
+      <w:rPr>
+        <w:rFonts w:hint="default"/>
+      </w:rPr>
+    </w:lvl>
+    <w:lvl w:ilvl="1" w:tentative="0">
+      <w:start w:val="1"/>
+      <w:numFmt w:val="decimal"/>
+      <w:pStyle w:val="3"/>
+      <w:lvlText w:val="%1.%2."/>
+      <w:lvlJc w:val="left"/>
+      <w:pPr>
+        <w:ind w:left="575" w:hanging="575"/>
+      </w:pPr>
+      <w:rPr>
+        <w:rFonts w:hint="default"/>
+      </w:rPr>
+    </w:lvl>
+    <w:lvl w:ilvl="2" w:tentative="0">
+      <w:start w:val="1"/>
+      <w:numFmt w:val="decimal"/>
+      <w:pStyle w:val="4"/>
+      <w:lvlText w:val="%1.%2.%3."/>
+      <w:lvlJc w:val="left"/>
+      <w:pPr>
+        <w:ind w:left="720" w:hanging="720"/>
+      </w:pPr>
+      <w:rPr>
+        <w:rFonts w:hint="default"/>
+      </w:rPr>
+    </w:lvl>
+    <w:lvl w:ilvl="3" w:tentative="0">
+      <w:start w:val="1"/>
+      <w:numFmt w:val="decimal"/>
+      <w:pStyle w:val="5"/>
+      <w:lvlText w:val="%1.%2.%3.%4."/>
+      <w:lvlJc w:val="left"/>
+      <w:pPr>
+        <w:ind w:left="864" w:hanging="864"/>
+      </w:pPr>
+      <w:rPr>
+        <w:rFonts w:hint="default"/>
+      </w:rPr>
+    </w:lvl>
+    <w:lvl w:ilvl="4" w:tentative="0">
+      <w:start w:val="1"/>
+      <w:numFmt w:val="decimal"/>
+      <w:pStyle w:val="6"/>
+      <w:lvlText w:val="%1.%2.%3.%4.%5."/>
+      <w:lvlJc w:val="left"/>
+      <w:pPr>
+        <w:ind w:left="1008" w:hanging="1008"/>
+      </w:pPr>
+      <w:rPr>
+        <w:rFonts w:hint="default"/>
+      </w:rPr>
+    </w:lvl>
+    <w:lvl w:ilvl="5" w:tentative="0">
+      <w:start w:val="1"/>
+      <w:numFmt w:val="decimal"/>
+      <w:pStyle w:val="7"/>
+      <w:lvlText w:val="%1.%2.%3.%4.%5.%6."/>
+      <w:lvlJc w:val="left"/>
+      <w:pPr>
+        <w:ind w:left="1151" w:hanging="1151"/>
+      </w:pPr>
+      <w:rPr>
+        <w:rFonts w:hint="default"/>
+      </w:rPr>
+    </w:lvl>
+    <w:lvl w:ilvl="6" w:tentative="0">
+      <w:start w:val="1"/>
+      <w:numFmt w:val="decimal"/>
+      <w:pStyle w:val="8"/>
+      <w:lvlText w:val="%1.%2.%3.%4.%5.%6.%7."/>
+      <w:lvlJc w:val="left"/>
+      <w:pPr>
+        <w:ind w:left="1296" w:hanging="1296"/>
+      </w:pPr>
+      <w:rPr>
+        <w:rFonts w:hint="default"/>
+      </w:rPr>
+    </w:lvl>
+    <w:lvl w:ilvl="7" w:tentative="0">
+      <w:start w:val="1"/>
+      <w:numFmt w:val="decimal"/>
+      <w:pStyle w:val="9"/>
+      <w:lvlText w:val="%1.%2.%3.%4.%5.%6.%7.%8."/>
+      <w:lvlJc w:val="left"/>
+      <w:pPr>
+        <w:ind w:left="1440" w:hanging="1440"/>
+      </w:pPr>
+      <w:rPr>
+        <w:rFonts w:hint="default"/>
+      </w:rPr>
+    </w:lvl>
+    <w:lvl w:ilvl="8" w:tentative="0">
+      <w:start w:val="1"/>
+      <w:numFmt w:val="decimal"/>
+      <w:pStyle w:val="10"/>
+      <w:lvlText w:val="%1.%2.%3.%4.%5.%6.%7.%8.%9."/>
+      <w:lvlJc w:val="left"/>
+      <w:pPr>
+        <w:ind w:left="1583" w:hanging="1583"/>
+      </w:pPr>
+      <w:rPr>
+        <w:rFonts w:hint="default"/>
+      </w:rPr>
+    </w:lvl>
+  </w:abstractNum>
+  <w:abstractNum w:abstractNumId="4">
+    <w:nsid w:val="52A8F631"/>
+    <w:multiLevelType w:val="singleLevel"/>
+    <w:tmpl w:val="52A8F631"/>
+    <w:lvl w:ilvl="0" w:tentative="0">
+      <w:start w:val="1"/>
+      <w:numFmt w:val="decimal"/>
+      <w:lvlText w:val="%1."/>
+      <w:lvlJc w:val="left"/>
+      <w:pPr>
+        <w:ind w:left="425" w:hanging="425"/>
+      </w:pPr>
+      <w:rPr>
+        <w:rFonts w:hint="default"/>
+      </w:rPr>
+    </w:lvl>
+  </w:abstractNum>
   <w:num w:numId="1">
-    <w:abstractNumId w:val="2"/>
+    <w:abstractNumId w:val="3"/>
   </w:num>
   <w:num w:numId="2">
-    <w:abstractNumId w:val="3"/>
+    <w:abstractNumId w:val="2"/>
   </w:num>
   <w:num w:numId="3">
     <w:abstractNumId w:val="0"/>
   </w:num>
   <w:num w:numId="4">
     <w:abstractNumId w:val="1"/>
+  </w:num>
+  <w:num w:numId="5">
+    <w:abstractNumId w:val="4"/>
   </w:num>
 </w:numbering>
 </file>
@@ -2760,7 +5552,7 @@
   <w:latentStyles w:count="260" w:defQFormat="0" w:defUnhideWhenUsed="1" w:defSemiHidden="1" w:defUIPriority="99" w:defLockedState="0">
     <w:lsdException w:qFormat="1" w:unhideWhenUsed="0" w:uiPriority="0" w:semiHidden="0" w:name="Normal"/>
     <w:lsdException w:qFormat="1" w:unhideWhenUsed="0" w:uiPriority="0" w:semiHidden="0" w:name="heading 1"/>
-    <w:lsdException w:qFormat="1" w:uiPriority="0" w:name="heading 2"/>
+    <w:lsdException w:qFormat="1" w:uiPriority="0" w:semiHidden="0" w:name="heading 2"/>
     <w:lsdException w:qFormat="1" w:uiPriority="0" w:name="heading 3"/>
     <w:lsdException w:qFormat="1" w:uiPriority="0" w:name="heading 4"/>
     <w:lsdException w:qFormat="1" w:uiPriority="0" w:name="heading 5"/>
@@ -3023,13 +5815,230 @@
       <w:lang w:val="en-US" w:eastAsia="zh-CN" w:bidi="ar-SA"/>
     </w:rPr>
   </w:style>
-  <w:style w:type="character" w:default="1" w:styleId="4">
+  <w:style w:type="paragraph" w:styleId="2">
+    <w:name w:val="heading 1"/>
+    <w:basedOn w:val="1"/>
+    <w:next w:val="1"/>
+    <w:qFormat/>
+    <w:uiPriority w:val="0"/>
+    <w:pPr>
+      <w:keepNext/>
+      <w:keepLines/>
+      <w:numPr>
+        <w:ilvl w:val="0"/>
+        <w:numId w:val="1"/>
+      </w:numPr>
+      <w:spacing w:before="340" w:beforeLines="0" w:beforeAutospacing="0" w:after="330" w:afterLines="0" w:afterAutospacing="0" w:line="576" w:lineRule="auto"/>
+      <w:ind w:left="432" w:hanging="432"/>
+      <w:outlineLvl w:val="0"/>
+    </w:pPr>
+    <w:rPr>
+      <w:b/>
+      <w:kern w:val="44"/>
+      <w:sz w:val="44"/>
+    </w:rPr>
+  </w:style>
+  <w:style w:type="paragraph" w:styleId="3">
+    <w:name w:val="heading 2"/>
+    <w:basedOn w:val="1"/>
+    <w:next w:val="1"/>
+    <w:unhideWhenUsed/>
+    <w:qFormat/>
+    <w:uiPriority w:val="0"/>
+    <w:pPr>
+      <w:keepNext/>
+      <w:keepLines/>
+      <w:numPr>
+        <w:ilvl w:val="1"/>
+        <w:numId w:val="1"/>
+      </w:numPr>
+      <w:spacing w:before="260" w:beforeLines="0" w:beforeAutospacing="0" w:after="260" w:afterLines="0" w:afterAutospacing="0" w:line="413" w:lineRule="auto"/>
+      <w:ind w:left="575" w:hanging="575"/>
+      <w:outlineLvl w:val="1"/>
+    </w:pPr>
+    <w:rPr>
+      <w:rFonts w:ascii="Arial" w:hAnsi="Arial" w:eastAsia="SimHei"/>
+      <w:b/>
+      <w:sz w:val="32"/>
+    </w:rPr>
+  </w:style>
+  <w:style w:type="paragraph" w:styleId="4">
+    <w:name w:val="heading 3"/>
+    <w:basedOn w:val="1"/>
+    <w:next w:val="1"/>
+    <w:semiHidden/>
+    <w:unhideWhenUsed/>
+    <w:qFormat/>
+    <w:uiPriority w:val="0"/>
+    <w:pPr>
+      <w:keepNext/>
+      <w:keepLines/>
+      <w:numPr>
+        <w:ilvl w:val="2"/>
+        <w:numId w:val="1"/>
+      </w:numPr>
+      <w:spacing w:before="260" w:beforeLines="0" w:beforeAutospacing="0" w:after="260" w:afterLines="0" w:afterAutospacing="0" w:line="413" w:lineRule="auto"/>
+      <w:ind w:left="720" w:hanging="720"/>
+      <w:outlineLvl w:val="2"/>
+    </w:pPr>
+    <w:rPr>
+      <w:b/>
+      <w:sz w:val="32"/>
+    </w:rPr>
+  </w:style>
+  <w:style w:type="paragraph" w:styleId="5">
+    <w:name w:val="heading 4"/>
+    <w:basedOn w:val="1"/>
+    <w:next w:val="1"/>
+    <w:semiHidden/>
+    <w:unhideWhenUsed/>
+    <w:qFormat/>
+    <w:uiPriority w:val="0"/>
+    <w:pPr>
+      <w:keepNext/>
+      <w:keepLines/>
+      <w:numPr>
+        <w:ilvl w:val="3"/>
+        <w:numId w:val="1"/>
+      </w:numPr>
+      <w:spacing w:before="280" w:beforeLines="0" w:beforeAutospacing="0" w:after="290" w:afterLines="0" w:afterAutospacing="0" w:line="372" w:lineRule="auto"/>
+      <w:ind w:left="864" w:hanging="864"/>
+      <w:outlineLvl w:val="3"/>
+    </w:pPr>
+    <w:rPr>
+      <w:rFonts w:ascii="Arial" w:hAnsi="Arial" w:eastAsia="SimHei"/>
+      <w:b/>
+      <w:sz w:val="28"/>
+    </w:rPr>
+  </w:style>
+  <w:style w:type="paragraph" w:styleId="6">
+    <w:name w:val="heading 5"/>
+    <w:basedOn w:val="1"/>
+    <w:next w:val="1"/>
+    <w:semiHidden/>
+    <w:unhideWhenUsed/>
+    <w:qFormat/>
+    <w:uiPriority w:val="0"/>
+    <w:pPr>
+      <w:keepNext/>
+      <w:keepLines/>
+      <w:numPr>
+        <w:ilvl w:val="4"/>
+        <w:numId w:val="1"/>
+      </w:numPr>
+      <w:spacing w:before="280" w:beforeLines="0" w:beforeAutospacing="0" w:after="290" w:afterLines="0" w:afterAutospacing="0" w:line="372" w:lineRule="auto"/>
+      <w:ind w:left="1008" w:hanging="1008"/>
+      <w:outlineLvl w:val="4"/>
+    </w:pPr>
+    <w:rPr>
+      <w:b/>
+      <w:sz w:val="28"/>
+    </w:rPr>
+  </w:style>
+  <w:style w:type="paragraph" w:styleId="7">
+    <w:name w:val="heading 6"/>
+    <w:basedOn w:val="1"/>
+    <w:next w:val="1"/>
+    <w:semiHidden/>
+    <w:unhideWhenUsed/>
+    <w:qFormat/>
+    <w:uiPriority w:val="0"/>
+    <w:pPr>
+      <w:keepNext/>
+      <w:keepLines/>
+      <w:numPr>
+        <w:ilvl w:val="5"/>
+        <w:numId w:val="1"/>
+      </w:numPr>
+      <w:spacing w:before="240" w:beforeLines="0" w:beforeAutospacing="0" w:after="64" w:afterLines="0" w:afterAutospacing="0" w:line="317" w:lineRule="auto"/>
+      <w:ind w:left="1151" w:hanging="1151"/>
+      <w:outlineLvl w:val="5"/>
+    </w:pPr>
+    <w:rPr>
+      <w:rFonts w:ascii="Arial" w:hAnsi="Arial" w:eastAsia="SimHei"/>
+      <w:b/>
+      <w:sz w:val="24"/>
+    </w:rPr>
+  </w:style>
+  <w:style w:type="paragraph" w:styleId="8">
+    <w:name w:val="heading 7"/>
+    <w:basedOn w:val="1"/>
+    <w:next w:val="1"/>
+    <w:semiHidden/>
+    <w:unhideWhenUsed/>
+    <w:qFormat/>
+    <w:uiPriority w:val="0"/>
+    <w:pPr>
+      <w:keepNext/>
+      <w:keepLines/>
+      <w:numPr>
+        <w:ilvl w:val="6"/>
+        <w:numId w:val="1"/>
+      </w:numPr>
+      <w:spacing w:before="240" w:beforeLines="0" w:beforeAutospacing="0" w:after="64" w:afterLines="0" w:afterAutospacing="0" w:line="317" w:lineRule="auto"/>
+      <w:ind w:left="1296" w:hanging="1296"/>
+      <w:outlineLvl w:val="6"/>
+    </w:pPr>
+    <w:rPr>
+      <w:b/>
+      <w:sz w:val="24"/>
+    </w:rPr>
+  </w:style>
+  <w:style w:type="paragraph" w:styleId="9">
+    <w:name w:val="heading 8"/>
+    <w:basedOn w:val="1"/>
+    <w:next w:val="1"/>
+    <w:semiHidden/>
+    <w:unhideWhenUsed/>
+    <w:qFormat/>
+    <w:uiPriority w:val="0"/>
+    <w:pPr>
+      <w:keepNext/>
+      <w:keepLines/>
+      <w:numPr>
+        <w:ilvl w:val="7"/>
+        <w:numId w:val="1"/>
+      </w:numPr>
+      <w:spacing w:before="240" w:beforeLines="0" w:beforeAutospacing="0" w:after="64" w:afterLines="0" w:afterAutospacing="0" w:line="317" w:lineRule="auto"/>
+      <w:ind w:left="1440" w:hanging="1440"/>
+      <w:outlineLvl w:val="7"/>
+    </w:pPr>
+    <w:rPr>
+      <w:rFonts w:ascii="Arial" w:hAnsi="Arial" w:eastAsia="SimHei"/>
+      <w:sz w:val="24"/>
+    </w:rPr>
+  </w:style>
+  <w:style w:type="paragraph" w:styleId="10">
+    <w:name w:val="heading 9"/>
+    <w:basedOn w:val="1"/>
+    <w:next w:val="1"/>
+    <w:semiHidden/>
+    <w:unhideWhenUsed/>
+    <w:qFormat/>
+    <w:uiPriority w:val="0"/>
+    <w:pPr>
+      <w:keepNext/>
+      <w:keepLines/>
+      <w:numPr>
+        <w:ilvl w:val="8"/>
+        <w:numId w:val="1"/>
+      </w:numPr>
+      <w:spacing w:before="240" w:beforeLines="0" w:beforeAutospacing="0" w:after="64" w:afterLines="0" w:afterAutospacing="0" w:line="317" w:lineRule="auto"/>
+      <w:ind w:left="1583" w:hanging="1583"/>
+      <w:outlineLvl w:val="8"/>
+    </w:pPr>
+    <w:rPr>
+      <w:rFonts w:ascii="Arial" w:hAnsi="Arial" w:eastAsia="SimHei"/>
+      <w:sz w:val="21"/>
+    </w:rPr>
+  </w:style>
+  <w:style w:type="character" w:default="1" w:styleId="13">
     <w:name w:val="Default Paragraph Font"/>
     <w:semiHidden/>
     <w:qFormat/>
     <w:uiPriority w:val="0"/>
   </w:style>
-  <w:style w:type="table" w:default="1" w:styleId="2">
+  <w:style w:type="table" w:default="1" w:styleId="11">
     <w:name w:val="Normal Table"/>
     <w:semiHidden/>
     <w:qFormat/>
@@ -3043,9 +6052,9 @@
       </w:tblCellMar>
     </w:tblPr>
   </w:style>
-  <w:style w:type="table" w:styleId="3">
+  <w:style w:type="table" w:styleId="12">
     <w:name w:val="Table Grid"/>
-    <w:basedOn w:val="2"/>
+    <w:basedOn w:val="11"/>
     <w:qFormat/>
     <w:uiPriority w:val="0"/>
     <w:pPr>

</xml_diff>